<commit_message>
Update AdvMemTest to 0.1.7.562 (Free binaries + manuals + README)
- binaries/advmemtest-free.efi → 0.1.7.562（1,586,624 B）
- iso/ → AdvMemTest-boot-0.1.7.562+20260920_222322.iso（7,424,000 B，本版瘦身 61%）
- AdvMemTest-0.1.7.562+20260920_222322.zip（6,094,410 B）
- docs/manual/ → 免费版手册/快速上手（md+docx）与手册引用的全部截图（562 档）
- AdvMemTest/README.md 与套件根 README（中英）同步：免费版 13 条用户可见（15 条可执行）
- 变更记录新增 2026-09-20 · AdvMemTest-v0.1.7.562；401 条目保留
- 旧 401 的 ISO/zip 替换（历史见 git 与旧 Release）

Co-Authored-By: Claude Code <noreply@anthropic.com>
</commit_message>
<xml_diff>
--- a/AdvMemTest/docs/manual/advmemtest-quick-guide.docx
+++ b/AdvMemTest/docs/manual/advmemtest-quick-guide.docx
@@ -18,7 +18,7 @@
         <w:rPr>
           <w:rFonts w:ascii="Arial" w:eastAsia="微软雅黑"/>
         </w:rPr>
-        <w:t xml:space="preserve">版本 0.1.7+401（Free / Pro 双 SKU）· 适用环境：X64 UEFI Shell</w:t>
+        <w:t xml:space="preserve">版本 0.1.7+562（Free / Pro 双 SKU）· 适用环境：X64 UEFI Shell</w:t>
       </w:r>
     </w:p>
     <w:p>
@@ -131,7 +131,7 @@
         <w:rPr>
           <w:rFonts w:ascii="Arial" w:eastAsia="微软雅黑"/>
         </w:rPr>
-        <w:t xml:space="preserve">11 条用户可见经典测试条目（另有 2 条引擎自检参考条不对外展示）、个人免费使用；</w:t>
+        <w:t xml:space="preserve">13 条用户可见经典测试条目（另有 2 条引擎自检参考条不对外展示）、个人免费使用；</w:t>
       </w:r>
       <w:r>
         <w:rPr>
@@ -145,7 +145,7 @@
         <w:rPr>
           <w:rFonts w:ascii="Arial" w:eastAsia="微软雅黑"/>
         </w:rPr>
-        <w:t xml:space="preserve">31 条全量条目，再加颗粒级错误定位、SPD 深度信息、带宽基准、禁用缓存、顺序轮巡/轮流多核模式、512 核多核扩展与坏块清单导出，商业用途需授权。两版均无外部依赖——单个 efi 文件拷进 Shell 即可运行，全简体中文界面，鼠标与键盘双路操作，面向服务器、工作站的装机验收、故障排查与返修质检。</w:t>
+        <w:t xml:space="preserve">33 条全量条目，再加颗粒级错误定位、SPD 深度信息（含内存温度与 ECC 明细）、带宽曲线、禁用缓存、顺序轮巡/轮流多核模式、512 核多核扩展与坏块清单导出，商业用途需授权。两版均无外部依赖——单个 efi 文件拷进 Shell 即可运行，全简体中文界面，鼠标与键盘双路操作，面向服务器、工作站的装机验收、故障排查与返修质检。</w:t>
       </w:r>
     </w:p>
     <w:p>
@@ -222,39 +222,7 @@
         <w:rPr>
           <w:rFonts w:ascii="Arial" w:eastAsia="微软雅黑"/>
         </w:rPr>
-        <w:t xml:space="preserve"> 主流工具报错只给一个地址，advmemtest 把错误地址换算成 Socket/Channel/DIMM/Rank/Device 五级坐标——直接指出"哪根内存条上的哪个颗粒坏了"。错误发生时错误日志区滚动、DIMM 带对应颗粒泛红光晕、徽章转 FAIL，三通道同时呈现。免费版错误只到地址（定位信息源头不产生）。</w:t>
-      </w:r>
-    </w:p>
-    <w:p>
-      <w:r>
-        <w:rPr>
-          <w:rFonts w:ascii="Arial" w:eastAsia="微软雅黑"/>
-          <w:b/>
-          <w:bCs/>
-        </w:rPr>
-        <w:t xml:space="preserve">自我重定位。</w:t>
-      </w:r>
-      <w:r>
-        <w:rPr>
-          <w:rFonts w:ascii="Arial" w:eastAsia="微软雅黑"/>
-        </w:rPr>
-        <w:t xml:space="preserve"> 运行中的程序会把自己占用的内存排除在测试之外，这是所有内存测试软件的天然盲区。advmemtest 启动后先把自身镜像整体搬移到新地址、释放原区域，把自己"占过的地方"也纳入测试，对内存的覆盖不留死角。</w:t>
-      </w:r>
-    </w:p>
-    <w:p>
-      <w:r>
-        <w:rPr>
-          <w:rFonts w:ascii="Arial" w:eastAsia="微软雅黑"/>
-          <w:b/>
-          <w:bCs/>
-        </w:rPr>
-        <w:t xml:space="preserve">多核真实并发。</w:t>
-      </w:r>
-      <w:r>
-        <w:rPr>
-          <w:rFonts w:ascii="Arial" w:eastAsia="微软雅黑"/>
-        </w:rPr>
-        <w:t xml:space="preserve"> 单线程之外提供三条多核模式：多线程（内存按核切段、并行压测，4 核实测吞吐约 2.5 倍）、顺序轮巡（每核全量轮流跑一遍）、轮流（pattern 与核心对轮转）。Memtest86 只有轮巡，advmemtest 是真实的切分并发。多核机器上起测默认即全核并行（免费版上限 16 核，专业版按系统核数实探、上限 512 核）。</w:t>
+        <w:t xml:space="preserve"> 主流工具报错只给一个地址，advmemtest 把错误地址换算成 Socket/Channel/DIMM/Rank/Device 五级坐标——直接指出"哪根内存条上的哪个颗粒坏了"。下图是错误注入演示：错误日志区滚动、DIMM 带对应颗粒泛红光晕、徽章转 FAIL，三通道同时呈现。免费版错误只到地址（定位信息源头不产生）。</w:t>
       </w:r>
     </w:p>
     <w:p>
@@ -266,7 +234,7 @@
           <wp:inline distT="0" distB="0" distL="0" distR="0">
             <wp:extent cx="5943600" cy="3714750"/>
             <wp:effectExtent t="0" r="0" b="0" l="0"/>
-            <wp:docPr id="1" name="多线程运行：状态栏&quot;N 核并行&quot;" descr="多线程运行：状态栏&quot;N 核并行&quot;" title="多线程运行：状态栏&quot;N 核并行&quot;"/>
+            <wp:docPr id="1" name="错误注入演示：红标 + FAIL + 错误日志同框" descr="错误注入演示：红标 + FAIL + 错误日志同框" title="错误注入演示：红标 + FAIL + 错误日志同框"/>
             <wp:cNvGraphicFramePr>
               <a:graphicFrameLocks xmlns:a="http://schemas.openxmlformats.org/drawingml/2006/main" noChangeAspect="1"/>
             </wp:cNvGraphicFramePr>
@@ -315,7 +283,7 @@
           <w:sz w:val="18"/>
           <w:szCs w:val="18"/>
         </w:rPr>
-        <w:t xml:space="preserve">多线程运行：状态栏"N 核并行"</w:t>
+        <w:t xml:space="preserve">错误注入演示：红标 + FAIL + 错误日志同框</w:t>
       </w:r>
     </w:p>
     <w:p>
@@ -325,13 +293,13 @@
           <w:b/>
           <w:bCs/>
         </w:rPr>
-        <w:t xml:space="preserve">厂商专用测试集（Pro 版）。</w:t>
-      </w:r>
-      <w:r>
-        <w:rPr>
-          <w:rFonts w:ascii="Arial" w:eastAsia="微软雅黑"/>
-        </w:rPr>
-        <w:t xml:space="preserve"> 内置海力士（SKHYNIX）、三星（SAMSUNG）、美光（MICRON）三家原厂算法。软件读取 SPD 厂商信息后自动把默认测试集与内存品牌对齐——同品牌内存自动跑同品牌的原厂算法。</w:t>
+        <w:t xml:space="preserve">自我重定位。</w:t>
+      </w:r>
+      <w:r>
+        <w:rPr>
+          <w:rFonts w:ascii="Arial" w:eastAsia="微软雅黑"/>
+        </w:rPr>
+        <w:t xml:space="preserve"> 运行中的程序会把自己占用的内存排除在测试之外，这是所有内存测试软件的天然盲区。advmemtest 启动后先把自身镜像整体搬移到新地址、释放原区域，把自己"占过的地方"也纳入测试，对内存的覆盖不留死角。</w:t>
       </w:r>
     </w:p>
     <w:p>
@@ -341,49 +309,13 @@
           <w:b/>
           <w:bCs/>
         </w:rPr>
-        <w:t xml:space="preserve">HTML 报告落盘 + 坏块清单（Pro）。</w:t>
-      </w:r>
-      <w:r>
-        <w:rPr>
-          <w:rFonts w:ascii="Arial" w:eastAsia="微软雅黑"/>
-        </w:rPr>
-        <w:t xml:space="preserve"> 停止测试、跑满指定轮数或退出时，自动把整场测试写成 </w:t>
-      </w:r>
-      <w:r>
-        <w:rPr>
-          <w:rFonts w:ascii="Arial" w:eastAsia="微软雅黑"/>
-        </w:rPr>
-        <w:t xml:space="preserve">fs0:\advmemtest_report.html</w:t>
-      </w:r>
-      <w:r>
-        <w:rPr>
-          <w:rFonts w:ascii="Arial" w:eastAsia="微软雅黑"/>
-        </w:rPr>
-        <w:t xml:space="preserve">：汇总统计、错误明细（Pro 含颗粒定位，Free 仅地址）、DIMM 布局可视化一页呈现，浏览器直接打开，适合存档和随返修件流转。Pro 版同时导出 </w:t>
-      </w:r>
-      <w:r>
-        <w:rPr>
-          <w:rFonts w:ascii="Arial" w:eastAsia="微软雅黑"/>
-        </w:rPr>
-        <w:t xml:space="preserve">badram.txt</w:t>
-      </w:r>
-      <w:r>
-        <w:rPr>
-          <w:rFonts w:ascii="Arial" w:eastAsia="微软雅黑"/>
-        </w:rPr>
-        <w:t xml:space="preserve">（Linux BadRAM 格式）与 </w:t>
-      </w:r>
-      <w:r>
-        <w:rPr>
-          <w:rFonts w:ascii="Arial" w:eastAsia="微软雅黑"/>
-        </w:rPr>
-        <w:t xml:space="preserve">badmemorylist.txt</w:t>
-      </w:r>
-      <w:r>
-        <w:rPr>
-          <w:rFonts w:ascii="Arial" w:eastAsia="微软雅黑"/>
-        </w:rPr>
-        <w:t xml:space="preserve">（Windows bcdedit 命令）两份坏块清单。</w:t>
+        <w:t xml:space="preserve">多核真实并发。</w:t>
+      </w:r>
+      <w:r>
+        <w:rPr>
+          <w:rFonts w:ascii="Arial" w:eastAsia="微软雅黑"/>
+        </w:rPr>
+        <w:t xml:space="preserve"> 单线程之外提供三条多核模式：多线程（内存按核切段、并行压测，4 核实测吞吐约 2.5 倍）、顺序轮巡（每核全量轮流跑一遍）、轮流（pattern 与核心对轮转）。Memtest86 只有轮巡，advmemtest 是真实的切分并发。多核机器上起测默认即全核并行（免费版上限 16 核，专业版按系统核数实探、上限 512 核）。</w:t>
       </w:r>
     </w:p>
     <w:p>
@@ -395,7 +327,7 @@
           <wp:inline distT="0" distB="0" distL="0" distR="0">
             <wp:extent cx="5943600" cy="3714750"/>
             <wp:effectExtent t="0" r="0" b="0" l="0"/>
-            <wp:docPr id="1" name="HTML 报告（错误版）：错误明细 + DIMM 红标" descr="HTML 报告（错误版）：错误明细 + DIMM 红标" title="HTML 报告（错误版）：错误明细 + DIMM 红标"/>
+            <wp:docPr id="1" name="多线程运行：状态栏&quot;N 核并行&quot;" descr="多线程运行：状态栏&quot;N 核并行&quot;" title="多线程运行：状态栏&quot;N 核并行&quot;"/>
             <wp:cNvGraphicFramePr>
               <a:graphicFrameLocks xmlns:a="http://schemas.openxmlformats.org/drawingml/2006/main" noChangeAspect="1"/>
             </wp:cNvGraphicFramePr>
@@ -444,6 +376,163 @@
           <w:sz w:val="18"/>
           <w:szCs w:val="18"/>
         </w:rPr>
+        <w:t xml:space="preserve">多线程运行：状态栏"N 核并行"</w:t>
+      </w:r>
+    </w:p>
+    <w:p>
+      <w:r>
+        <w:rPr>
+          <w:rFonts w:ascii="Arial" w:eastAsia="微软雅黑"/>
+          <w:b/>
+          <w:bCs/>
+        </w:rPr>
+        <w:t xml:space="preserve">厂商专用测试集（Pro 版）。</w:t>
+      </w:r>
+      <w:r>
+        <w:rPr>
+          <w:rFonts w:ascii="Arial" w:eastAsia="微软雅黑"/>
+        </w:rPr>
+        <w:t xml:space="preserve"> 内置海力士（SKHYNIX）、三星（SAMSUNG）、美光（MICRON）三家原厂算法。软件读取 SPD 厂商信息后按白名单放行——</w:t>
+      </w:r>
+      <w:r>
+        <w:rPr>
+          <w:rFonts w:ascii="Arial" w:eastAsia="微软雅黑"/>
+          <w:b/>
+          <w:bCs/>
+        </w:rPr>
+        <w:t xml:space="preserve">union 语义</w:t>
+      </w:r>
+      <w:r>
+        <w:rPr>
+          <w:rFonts w:ascii="Arial" w:eastAsia="微软雅黑"/>
+        </w:rPr>
+        <w:t xml:space="preserve">：只要认得出内存厂商（任一槽命中白名单），</w:t>
+      </w:r>
+      <w:r>
+        <w:rPr>
+          <w:rFonts w:ascii="Arial" w:eastAsia="微软雅黑"/>
+          <w:b/>
+          <w:bCs/>
+        </w:rPr>
+        <w:t xml:space="preserve">这三条原厂算法就一并进默认集</w:t>
+      </w:r>
+      <w:r>
+        <w:rPr>
+          <w:rFonts w:ascii="Arial" w:eastAsia="微软雅黑"/>
+        </w:rPr>
+        <w:t xml:space="preserve">（不是"逐条对上哪一家"）；读不到厂商信息时三条全不选、仅手动勾选才跑。</w:t>
+      </w:r>
+    </w:p>
+    <w:p>
+      <w:r>
+        <w:rPr>
+          <w:rFonts w:ascii="Arial" w:eastAsia="微软雅黑"/>
+          <w:b/>
+          <w:bCs/>
+        </w:rPr>
+        <w:t xml:space="preserve">HTML 报告落盘 + 坏块清单（Pro）。</w:t>
+      </w:r>
+      <w:r>
+        <w:rPr>
+          <w:rFonts w:ascii="Arial" w:eastAsia="微软雅黑"/>
+        </w:rPr>
+        <w:t xml:space="preserve"> 停止测试、跑满指定轮数或退出时，自动把整场测试写成 </w:t>
+      </w:r>
+      <w:r>
+        <w:rPr>
+          <w:rFonts w:ascii="Arial" w:eastAsia="微软雅黑"/>
+        </w:rPr>
+        <w:t xml:space="preserve">fs0:\advmemtest_report.html</w:t>
+      </w:r>
+      <w:r>
+        <w:rPr>
+          <w:rFonts w:ascii="Arial" w:eastAsia="微软雅黑"/>
+        </w:rPr>
+        <w:t xml:space="preserve">：汇总统计、错误明细（Pro 含颗粒定位，Free 仅地址）、DIMM 布局可视化一页呈现，浏览器直接打开，适合存档和随返修件流转。Pro 版同时导出 </w:t>
+      </w:r>
+      <w:r>
+        <w:rPr>
+          <w:rFonts w:ascii="Arial" w:eastAsia="微软雅黑"/>
+        </w:rPr>
+        <w:t xml:space="preserve">badram.txt</w:t>
+      </w:r>
+      <w:r>
+        <w:rPr>
+          <w:rFonts w:ascii="Arial" w:eastAsia="微软雅黑"/>
+        </w:rPr>
+        <w:t xml:space="preserve">（Linux BadRAM 格式）与 </w:t>
+      </w:r>
+      <w:r>
+        <w:rPr>
+          <w:rFonts w:ascii="Arial" w:eastAsia="微软雅黑"/>
+        </w:rPr>
+        <w:t xml:space="preserve">badmemorylist.txt</w:t>
+      </w:r>
+      <w:r>
+        <w:rPr>
+          <w:rFonts w:ascii="Arial" w:eastAsia="微软雅黑"/>
+        </w:rPr>
+        <w:t xml:space="preserve">（Windows bcdedit 命令）两份坏块清单。</w:t>
+      </w:r>
+    </w:p>
+    <w:p>
+      <w:pPr>
+        <w:jc w:val="center"/>
+      </w:pPr>
+      <w:r>
+        <w:drawing>
+          <wp:inline distT="0" distB="0" distL="0" distR="0">
+            <wp:extent cx="5943600" cy="3714750"/>
+            <wp:effectExtent t="0" r="0" b="0" l="0"/>
+            <wp:docPr id="1" name="HTML 报告（错误版）：错误明细 + DIMM 红标" descr="HTML 报告（错误版）：错误明细 + DIMM 红标" title="HTML 报告（错误版）：错误明细 + DIMM 红标"/>
+            <wp:cNvGraphicFramePr>
+              <a:graphicFrameLocks xmlns:a="http://schemas.openxmlformats.org/drawingml/2006/main" noChangeAspect="1"/>
+            </wp:cNvGraphicFramePr>
+            <a:graphic xmlns:a="http://schemas.openxmlformats.org/drawingml/2006/main">
+              <a:graphicData uri="http://schemas.openxmlformats.org/drawingml/2006/picture">
+                <pic:pic xmlns:pic="http://schemas.openxmlformats.org/drawingml/2006/picture">
+                  <pic:nvPicPr>
+                    <pic:cNvPr id="0" name="" descr=""/>
+                    <pic:cNvPicPr>
+                      <a:picLocks noChangeAspect="1" noChangeArrowheads="1"/>
+                    </pic:cNvPicPr>
+                  </pic:nvPicPr>
+                  <pic:blipFill>
+                    <a:blip r:embed="rId10" cstate="none"/>
+                    <a:srcRect/>
+                    <a:stretch>
+                      <a:fillRect/>
+                    </a:stretch>
+                  </pic:blipFill>
+                  <pic:spPr bwMode="auto">
+                    <a:xfrm>
+                      <a:off x="0" y="0"/>
+                      <a:ext cx="5943600" cy="3714750"/>
+                    </a:xfrm>
+                    <a:prstGeom prst="rect">
+                      <a:avLst/>
+                    </a:prstGeom>
+                  </pic:spPr>
+                </pic:pic>
+              </a:graphicData>
+            </a:graphic>
+          </wp:inline>
+        </w:drawing>
+      </w:r>
+    </w:p>
+    <w:p>
+      <w:pPr>
+        <w:jc w:val="center"/>
+      </w:pPr>
+      <w:r>
+        <w:rPr>
+          <w:rFonts w:ascii="Arial" w:eastAsia="微软雅黑"/>
+          <w:i/>
+          <w:iCs/>
+          <w:color w:val="666666"/>
+          <w:sz w:val="18"/>
+          <w:szCs w:val="18"/>
+        </w:rPr>
         <w:t xml:space="preserve">HTML 报告（错误版）：错误明细 + DIMM 红标</w:t>
       </w:r>
     </w:p>
@@ -680,128 +769,6 @@
                   <wp:extent cx="1714500" cy="1066800"/>
                   <wp:effectExtent t="0" r="0" b="0" l="0"/>
                   <wp:docPr id="1" name="s18-dimms-groups" descr="s18-dimms-groups" title="s18-dimms-groups"/>
-                  <wp:cNvGraphicFramePr>
-                    <a:graphicFrameLocks xmlns:a="http://schemas.openxmlformats.org/drawingml/2006/main" noChangeAspect="1"/>
-                  </wp:cNvGraphicFramePr>
-                  <a:graphic xmlns:a="http://schemas.openxmlformats.org/drawingml/2006/main">
-                    <a:graphicData uri="http://schemas.openxmlformats.org/drawingml/2006/picture">
-                      <pic:pic xmlns:pic="http://schemas.openxmlformats.org/drawingml/2006/picture">
-                        <pic:nvPicPr>
-                          <pic:cNvPr id="0" name="" descr=""/>
-                          <pic:cNvPicPr>
-                            <a:picLocks noChangeAspect="1" noChangeArrowheads="1"/>
-                          </pic:cNvPicPr>
-                        </pic:nvPicPr>
-                        <pic:blipFill>
-                          <a:blip r:embed="rId10" cstate="none"/>
-                          <a:srcRect/>
-                          <a:stretch>
-                            <a:fillRect/>
-                          </a:stretch>
-                        </pic:blipFill>
-                        <pic:spPr bwMode="auto">
-                          <a:xfrm>
-                            <a:off x="0" y="0"/>
-                            <a:ext cx="1714500" cy="1066800"/>
-                          </a:xfrm>
-                          <a:prstGeom prst="rect">
-                            <a:avLst/>
-                          </a:prstGeom>
-                        </pic:spPr>
-                      </pic:pic>
-                    </a:graphicData>
-                  </a:graphic>
-                </wp:inline>
-              </w:drawing>
-            </w:r>
-          </w:p>
-        </w:tc>
-      </w:tr>
-      <w:tr>
-        <w:tc>
-          <w:tcPr>
-            <w:tcW w:type="dxa" w:w="3120"/>
-            <w:tcBorders>
-              <w:top w:val="single" w:color="999999" w:sz="1"/>
-              <w:left w:val="single" w:color="999999" w:sz="1"/>
-              <w:bottom w:val="single" w:color="999999" w:sz="1"/>
-              <w:right w:val="single" w:color="999999" w:sz="1"/>
-            </w:tcBorders>
-            <w:tcMar>
-              <w:top w:type="dxa" w:w="60"/>
-              <w:left w:type="dxa" w:w="100"/>
-              <w:bottom w:type="dxa" w:w="60"/>
-              <w:right w:type="dxa" w:w="100"/>
-            </w:tcMar>
-          </w:tcPr>
-          <w:p>
-            <w:r>
-              <w:rPr>
-                <w:rFonts w:ascii="Arial" w:eastAsia="微软雅黑"/>
-                <w:b w:val="false"/>
-                <w:bCs w:val="false"/>
-                <w:sz w:val="20"/>
-                <w:szCs w:val="20"/>
-              </w:rPr>
-              <w:t xml:space="preserve">Pattern 选择</w:t>
-            </w:r>
-          </w:p>
-        </w:tc>
-        <w:tc>
-          <w:tcPr>
-            <w:tcW w:type="dxa" w:w="3120"/>
-            <w:tcBorders>
-              <w:top w:val="single" w:color="999999" w:sz="1"/>
-              <w:left w:val="single" w:color="999999" w:sz="1"/>
-              <w:bottom w:val="single" w:color="999999" w:sz="1"/>
-              <w:right w:val="single" w:color="999999" w:sz="1"/>
-            </w:tcBorders>
-            <w:tcMar>
-              <w:top w:type="dxa" w:w="60"/>
-              <w:left w:type="dxa" w:w="100"/>
-              <w:bottom w:type="dxa" w:w="60"/>
-              <w:right w:type="dxa" w:w="100"/>
-            </w:tcMar>
-          </w:tcPr>
-          <w:p>
-            <w:r>
-              <w:rPr>
-                <w:rFonts w:ascii="Arial" w:eastAsia="微软雅黑"/>
-                <w:b w:val="false"/>
-                <w:bCs w:val="false"/>
-                <w:sz w:val="20"/>
-                <w:szCs w:val="20"/>
-              </w:rPr>
-              <w:t xml:space="preserve">29 条用户可见 pattern 按类勾选（Free 11 条可执行 + Pro 域锁标）：地址 / memtest86+ 系 / AMT 系 / 行锤 / 厂商系</w:t>
-            </w:r>
-          </w:p>
-        </w:tc>
-        <w:tc>
-          <w:tcPr>
-            <w:tcW w:type="dxa" w:w="3120"/>
-            <w:tcBorders>
-              <w:top w:val="single" w:color="999999" w:sz="1"/>
-              <w:left w:val="single" w:color="999999" w:sz="1"/>
-              <w:bottom w:val="single" w:color="999999" w:sz="1"/>
-              <w:right w:val="single" w:color="999999" w:sz="1"/>
-            </w:tcBorders>
-            <w:tcMar>
-              <w:top w:type="dxa" w:w="60"/>
-              <w:left w:type="dxa" w:w="100"/>
-              <w:bottom w:type="dxa" w:w="60"/>
-              <w:right w:type="dxa" w:w="100"/>
-            </w:tcMar>
-          </w:tcPr>
-          <w:p>
-            <w:pPr>
-              <w:jc w:val="center"/>
-            </w:pPr>
-            <w:r>
-              <w:drawing>
-                <wp:inline distT="0" distB="0" distL="0" distR="0">
-                  <wp:extent cx="1714500" cy="1066800"/>
-                  <wp:effectExtent t="0" r="0" b="0" l="0"/>
-                  <wp:docPr id="1" name="s26-free-locked" descr="s26-free-locked" title="s26-free-locked"/>
                   <wp:cNvGraphicFramePr>
                     <a:graphicFrameLocks xmlns:a="http://schemas.openxmlformats.org/drawingml/2006/main" noChangeAspect="1"/>
                   </wp:cNvGraphicFramePr>
@@ -865,7 +832,7 @@
                 <w:sz w:val="20"/>
                 <w:szCs w:val="20"/>
               </w:rPr>
-              <w:t xml:space="preserve">线程模式</w:t>
+              <w:t xml:space="preserve">Pattern 选择</w:t>
             </w:r>
           </w:p>
         </w:tc>
@@ -894,7 +861,7 @@
                 <w:sz w:val="20"/>
                 <w:szCs w:val="20"/>
               </w:rPr>
-              <w:t xml:space="preserve">单线程 / 多线程 / 顺序轮巡 / 轮流 四选一（Free 版后两模式锁标、Pro 专属），多核缺席自动降级并注明</w:t>
+              <w:t xml:space="preserve">31 条用户可见 pattern 按类勾选（Free 用户可见 13 条可勾选 + Pro 域锁标）：地址 / memtest86+ 系 / 行锤 / AMT 系 / 厂商系 / SIMD 宽访存</w:t>
             </w:r>
           </w:p>
         </w:tc>
@@ -923,7 +890,7 @@
                 <wp:inline distT="0" distB="0" distL="0" distR="0">
                   <wp:extent cx="1714500" cy="1066800"/>
                   <wp:effectExtent t="0" r="0" b="0" l="0"/>
-                  <wp:docPr id="1" name="s32-thread-free-locked" descr="s32-thread-free-locked" title="s32-thread-free-locked"/>
+                  <wp:docPr id="1" name="s03-pattern" descr="s03-pattern" title="s03-pattern"/>
                   <wp:cNvGraphicFramePr>
                     <a:graphicFrameLocks xmlns:a="http://schemas.openxmlformats.org/drawingml/2006/main" noChangeAspect="1"/>
                   </wp:cNvGraphicFramePr>
@@ -987,7 +954,7 @@
                 <w:sz w:val="20"/>
                 <w:szCs w:val="20"/>
               </w:rPr>
-              <w:t xml:space="preserve">测试配置</w:t>
+              <w:t xml:space="preserve">线程模式</w:t>
             </w:r>
           </w:p>
         </w:tc>
@@ -1016,7 +983,7 @@
                 <w:sz w:val="20"/>
                 <w:szCs w:val="20"/>
               </w:rPr>
-              <w:t xml:space="preserve">轮数上限 1–99 或连续运行；Pro 版含"禁用缓存测试模式"</w:t>
+              <w:t xml:space="preserve">单线程 / 多线程 / 顺序轮巡 / 轮流 四选一（Free 版后两模式锁标、Pro 专属），多核缺席自动降级并注明</w:t>
             </w:r>
           </w:p>
         </w:tc>
@@ -1045,7 +1012,7 @@
                 <wp:inline distT="0" distB="0" distL="0" distR="0">
                   <wp:extent cx="1714500" cy="1066800"/>
                   <wp:effectExtent t="0" r="0" b="0" l="0"/>
-                  <wp:docPr id="1" name="s05-config" descr="s05-config" title="s05-config"/>
+                  <wp:docPr id="1" name="s04-thread" descr="s04-thread" title="s04-thread"/>
                   <wp:cNvGraphicFramePr>
                     <a:graphicFrameLocks xmlns:a="http://schemas.openxmlformats.org/drawingml/2006/main" noChangeAspect="1"/>
                   </wp:cNvGraphicFramePr>
@@ -1109,7 +1076,7 @@
                 <w:sz w:val="20"/>
                 <w:szCs w:val="20"/>
               </w:rPr>
-              <w:t xml:space="preserve">运行监控</w:t>
+              <w:t xml:space="preserve">测试配置</w:t>
             </w:r>
           </w:p>
         </w:tc>
@@ -1138,7 +1105,7 @@
                 <w:sz w:val="20"/>
                 <w:szCs w:val="20"/>
               </w:rPr>
-              <w:t xml:space="preserve">整轮进度条、已测累计字节、当前测试卡、DIMM 带光晕流动</w:t>
+              <w:t xml:space="preserve">轮数上限 1–99 或连续运行；Pro 版含"禁用缓存测试模式"</w:t>
             </w:r>
           </w:p>
         </w:tc>
@@ -1167,7 +1134,7 @@
                 <wp:inline distT="0" distB="0" distL="0" distR="0">
                   <wp:extent cx="1714500" cy="1066800"/>
                   <wp:effectExtent t="0" r="0" b="0" l="0"/>
-                  <wp:docPr id="1" name="s08-running" descr="s08-running" title="s08-running"/>
+                  <wp:docPr id="1" name="s05-config" descr="s05-config" title="s05-config"/>
                   <wp:cNvGraphicFramePr>
                     <a:graphicFrameLocks xmlns:a="http://schemas.openxmlformats.org/drawingml/2006/main" noChangeAspect="1"/>
                   </wp:cNvGraphicFramePr>
@@ -1231,7 +1198,7 @@
                 <w:sz w:val="20"/>
                 <w:szCs w:val="20"/>
               </w:rPr>
-              <w:t xml:space="preserve">暂停 / 继续</w:t>
+              <w:t xml:space="preserve">运行监控</w:t>
             </w:r>
           </w:p>
         </w:tc>
@@ -1260,7 +1227,7 @@
                 <w:sz w:val="20"/>
                 <w:szCs w:val="20"/>
               </w:rPr>
-              <w:t xml:space="preserve">运行中按 Esc 或菜单"暂停测试"即暂停（进度现场全保），再按 Esc 或"继续测试"恢复——停止入口只有一个</w:t>
+              <w:t xml:space="preserve">整轮进度条、已测累计字节、当前测试卡、DIMM 带光晕流动</w:t>
             </w:r>
           </w:p>
         </w:tc>
@@ -1289,7 +1256,7 @@
                 <wp:inline distT="0" distB="0" distL="0" distR="0">
                   <wp:extent cx="1714500" cy="1066800"/>
                   <wp:effectExtent t="0" r="0" b="0" l="0"/>
-                  <wp:docPr id="1" name="s16-paused" descr="s16-paused" title="s16-paused"/>
+                  <wp:docPr id="1" name="s08-running" descr="s08-running" title="s08-running"/>
                   <wp:cNvGraphicFramePr>
                     <a:graphicFrameLocks xmlns:a="http://schemas.openxmlformats.org/drawingml/2006/main" noChangeAspect="1"/>
                   </wp:cNvGraphicFramePr>
@@ -1353,7 +1320,7 @@
                 <w:sz w:val="20"/>
                 <w:szCs w:val="20"/>
               </w:rPr>
-              <w:t xml:space="preserve">错误三通道</w:t>
+              <w:t xml:space="preserve">暂停 / 继续</w:t>
             </w:r>
           </w:p>
         </w:tc>
@@ -1382,96 +1349,7 @@
                 <w:sz w:val="20"/>
                 <w:szCs w:val="20"/>
               </w:rPr>
-              <w:t xml:space="preserve">错误日志区 + 串口 TEST_FAIL 行 + 颗粒红光晕，徽章转 FAIL</w:t>
-            </w:r>
-          </w:p>
-        </w:tc>
-        <w:tc>
-          <w:tcPr>
-            <w:tcW w:type="dxa" w:w="3120"/>
-            <w:tcBorders>
-              <w:top w:val="single" w:color="999999" w:sz="1"/>
-              <w:left w:val="single" w:color="999999" w:sz="1"/>
-              <w:bottom w:val="single" w:color="999999" w:sz="1"/>
-              <w:right w:val="single" w:color="999999" w:sz="1"/>
-            </w:tcBorders>
-            <w:tcMar>
-              <w:top w:type="dxa" w:w="60"/>
-              <w:left w:type="dxa" w:w="100"/>
-              <w:bottom w:type="dxa" w:w="60"/>
-              <w:right w:type="dxa" w:w="100"/>
-            </w:tcMar>
-          </w:tcPr>
-          <w:p>
-            <w:r>
-              <w:rPr>
-                <w:rFonts w:ascii="Arial" w:eastAsia="微软雅黑"/>
-                <w:b w:val="false"/>
-                <w:bCs w:val="false"/>
-                <w:sz w:val="20"/>
-                <w:szCs w:val="20"/>
-              </w:rPr>
-              <w:t xml:space="preserve">—</w:t>
-            </w:r>
-          </w:p>
-        </w:tc>
-      </w:tr>
-      <w:tr>
-        <w:tc>
-          <w:tcPr>
-            <w:tcW w:type="dxa" w:w="3120"/>
-            <w:tcBorders>
-              <w:top w:val="single" w:color="999999" w:sz="1"/>
-              <w:left w:val="single" w:color="999999" w:sz="1"/>
-              <w:bottom w:val="single" w:color="999999" w:sz="1"/>
-              <w:right w:val="single" w:color="999999" w:sz="1"/>
-            </w:tcBorders>
-            <w:tcMar>
-              <w:top w:type="dxa" w:w="60"/>
-              <w:left w:type="dxa" w:w="100"/>
-              <w:bottom w:type="dxa" w:w="60"/>
-              <w:right w:type="dxa" w:w="100"/>
-            </w:tcMar>
-          </w:tcPr>
-          <w:p>
-            <w:r>
-              <w:rPr>
-                <w:rFonts w:ascii="Arial" w:eastAsia="微软雅黑"/>
-                <w:b w:val="false"/>
-                <w:bCs w:val="false"/>
-                <w:sz w:val="20"/>
-                <w:szCs w:val="20"/>
-              </w:rPr>
-              <w:t xml:space="preserve">DIMM 可视化</w:t>
-            </w:r>
-          </w:p>
-        </w:tc>
-        <w:tc>
-          <w:tcPr>
-            <w:tcW w:type="dxa" w:w="3120"/>
-            <w:tcBorders>
-              <w:top w:val="single" w:color="999999" w:sz="1"/>
-              <w:left w:val="single" w:color="999999" w:sz="1"/>
-              <w:bottom w:val="single" w:color="999999" w:sz="1"/>
-              <w:right w:val="single" w:color="999999" w:sz="1"/>
-            </w:tcBorders>
-            <w:tcMar>
-              <w:top w:type="dxa" w:w="60"/>
-              <w:left w:type="dxa" w:w="100"/>
-              <w:bottom w:type="dxa" w:w="60"/>
-              <w:right w:type="dxa" w:w="100"/>
-            </w:tcMar>
-          </w:tcPr>
-          <w:p>
-            <w:r>
-              <w:rPr>
-                <w:rFonts w:ascii="Arial" w:eastAsia="微软雅黑"/>
-                <w:b w:val="false"/>
-                <w:bCs w:val="false"/>
-                <w:sz w:val="20"/>
-                <w:szCs w:val="20"/>
-              </w:rPr>
-              <w:t xml:space="preserve">SMBIOS 动态槽位（最大 48，空槽置灰 + 分组头），颗粒图标，活动槽光晕，悬停 tooltip</w:t>
+              <w:t xml:space="preserve">运行中按 Esc 或菜单"暂停测试"即暂停（进度现场全保），再按 Esc 或"继续测试"恢复——停止入口只有一个</w:t>
             </w:r>
           </w:p>
         </w:tc>
@@ -1500,129 +1378,7 @@
                 <wp:inline distT="0" distB="0" distL="0" distR="0">
                   <wp:extent cx="1714500" cy="1066800"/>
                   <wp:effectExtent t="0" r="0" b="0" l="0"/>
-                  <wp:docPr id="1" name="s18-dimms-groups" descr="s18-dimms-groups" title="s18-dimms-groups"/>
-                  <wp:cNvGraphicFramePr>
-                    <a:graphicFrameLocks xmlns:a="http://schemas.openxmlformats.org/drawingml/2006/main" noChangeAspect="1"/>
-                  </wp:cNvGraphicFramePr>
-                  <a:graphic xmlns:a="http://schemas.openxmlformats.org/drawingml/2006/main">
-                    <a:graphicData uri="http://schemas.openxmlformats.org/drawingml/2006/picture">
-                      <pic:pic xmlns:pic="http://schemas.openxmlformats.org/drawingml/2006/picture">
-                        <pic:nvPicPr>
-                          <pic:cNvPr id="0" name="" descr=""/>
-                          <pic:cNvPicPr>
-                            <a:picLocks noChangeAspect="1" noChangeArrowheads="1"/>
-                          </pic:cNvPicPr>
-                        </pic:nvPicPr>
-                        <pic:blipFill>
-                          <a:blip r:embed="rId10" cstate="none"/>
-                          <a:srcRect/>
-                          <a:stretch>
-                            <a:fillRect/>
-                          </a:stretch>
-                        </pic:blipFill>
-                        <pic:spPr bwMode="auto">
-                          <a:xfrm>
-                            <a:off x="0" y="0"/>
-                            <a:ext cx="1714500" cy="1066800"/>
-                          </a:xfrm>
-                          <a:prstGeom prst="rect">
-                            <a:avLst/>
-                          </a:prstGeom>
-                        </pic:spPr>
-                      </pic:pic>
-                    </a:graphicData>
-                  </a:graphic>
-                </wp:inline>
-              </w:drawing>
-            </w:r>
-          </w:p>
-        </w:tc>
-      </w:tr>
-      <w:tr>
-        <w:tc>
-          <w:tcPr>
-            <w:tcW w:type="dxa" w:w="3120"/>
-            <w:tcBorders>
-              <w:top w:val="single" w:color="999999" w:sz="1"/>
-              <w:left w:val="single" w:color="999999" w:sz="1"/>
-              <w:bottom w:val="single" w:color="999999" w:sz="1"/>
-              <w:right w:val="single" w:color="999999" w:sz="1"/>
-            </w:tcBorders>
-            <w:tcMar>
-              <w:top w:type="dxa" w:w="60"/>
-              <w:left w:type="dxa" w:w="100"/>
-              <w:bottom w:type="dxa" w:w="60"/>
-              <w:right w:type="dxa" w:w="100"/>
-            </w:tcMar>
-          </w:tcPr>
-          <w:p>
-            <w:r>
-              <w:rPr>
-                <w:rFonts w:ascii="Arial" w:eastAsia="微软雅黑"/>
-                <w:b w:val="false"/>
-                <w:bCs w:val="false"/>
-                <w:sz w:val="20"/>
-                <w:szCs w:val="20"/>
-              </w:rPr>
-              <w:t xml:space="preserve">HTML 报告</w:t>
-            </w:r>
-          </w:p>
-        </w:tc>
-        <w:tc>
-          <w:tcPr>
-            <w:tcW w:type="dxa" w:w="3120"/>
-            <w:tcBorders>
-              <w:top w:val="single" w:color="999999" w:sz="1"/>
-              <w:left w:val="single" w:color="999999" w:sz="1"/>
-              <w:bottom w:val="single" w:color="999999" w:sz="1"/>
-              <w:right w:val="single" w:color="999999" w:sz="1"/>
-            </w:tcBorders>
-            <w:tcMar>
-              <w:top w:type="dxa" w:w="60"/>
-              <w:left w:type="dxa" w:w="100"/>
-              <w:bottom w:type="dxa" w:w="60"/>
-              <w:right w:type="dxa" w:w="100"/>
-            </w:tcMar>
-          </w:tcPr>
-          <w:p>
-            <w:r>
-              <w:rPr>
-                <w:rFonts w:ascii="Arial" w:eastAsia="微软雅黑"/>
-                <w:b w:val="false"/>
-                <w:bCs w:val="false"/>
-                <w:sz w:val="20"/>
-                <w:szCs w:val="20"/>
-              </w:rPr>
-              <w:t xml:space="preserve">停止 / 达标 / 退出三触发写盘，错误明细 + DIMM 布局</w:t>
-            </w:r>
-          </w:p>
-        </w:tc>
-        <w:tc>
-          <w:tcPr>
-            <w:tcW w:type="dxa" w:w="3120"/>
-            <w:tcBorders>
-              <w:top w:val="single" w:color="999999" w:sz="1"/>
-              <w:left w:val="single" w:color="999999" w:sz="1"/>
-              <w:bottom w:val="single" w:color="999999" w:sz="1"/>
-              <w:right w:val="single" w:color="999999" w:sz="1"/>
-            </w:tcBorders>
-            <w:tcMar>
-              <w:top w:type="dxa" w:w="60"/>
-              <w:left w:type="dxa" w:w="100"/>
-              <w:bottom w:type="dxa" w:w="60"/>
-              <w:right w:type="dxa" w:w="100"/>
-            </w:tcMar>
-          </w:tcPr>
-          <w:p>
-            <w:pPr>
-              <w:jc w:val="center"/>
-            </w:pPr>
-            <w:r>
-              <w:drawing>
-                <wp:inline distT="0" distB="0" distL="0" distR="0">
-                  <wp:extent cx="1714500" cy="1066800"/>
-                  <wp:effectExtent t="0" r="0" b="0" l="0"/>
-                  <wp:docPr id="1" name="s15-free-report" descr="s15-free-report" title="s15-free-report"/>
+                  <wp:docPr id="1" name="s16-paused" descr="s16-paused" title="s16-paused"/>
                   <wp:cNvGraphicFramePr>
                     <a:graphicFrameLocks xmlns:a="http://schemas.openxmlformats.org/drawingml/2006/main" noChangeAspect="1"/>
                   </wp:cNvGraphicFramePr>
@@ -1686,7 +1442,7 @@
                 <w:sz w:val="20"/>
                 <w:szCs w:val="20"/>
               </w:rPr>
-              <w:t xml:space="preserve">内存信息（Pro）</w:t>
+              <w:t xml:space="preserve">错误三通道</w:t>
             </w:r>
           </w:p>
         </w:tc>
@@ -1715,274 +1471,7 @@
                 <w:sz w:val="20"/>
                 <w:szCs w:val="20"/>
               </w:rPr>
-              <w:t xml:space="preserve">设置→内存信息…：SPD 深度解析（平台 / 通路 / 数据源 + 槽位档案 + CRC 对账）</w:t>
-            </w:r>
-          </w:p>
-        </w:tc>
-        <w:tc>
-          <w:tcPr>
-            <w:tcW w:type="dxa" w:w="3120"/>
-            <w:tcBorders>
-              <w:top w:val="single" w:color="999999" w:sz="1"/>
-              <w:left w:val="single" w:color="999999" w:sz="1"/>
-              <w:bottom w:val="single" w:color="999999" w:sz="1"/>
-              <w:right w:val="single" w:color="999999" w:sz="1"/>
-            </w:tcBorders>
-            <w:tcMar>
-              <w:top w:type="dxa" w:w="60"/>
-              <w:left w:type="dxa" w:w="100"/>
-              <w:bottom w:type="dxa" w:w="60"/>
-              <w:right w:type="dxa" w:w="100"/>
-            </w:tcMar>
-          </w:tcPr>
-          <w:p>
-            <w:r>
-              <w:rPr>
-                <w:rFonts w:ascii="Arial" w:eastAsia="微软雅黑"/>
-                <w:b w:val="false"/>
-                <w:bCs w:val="false"/>
-                <w:sz w:val="20"/>
-                <w:szCs w:val="20"/>
-              </w:rPr>
-              <w:t xml:space="preserve">—</w:t>
-            </w:r>
-          </w:p>
-        </w:tc>
-      </w:tr>
-      <w:tr>
-        <w:tc>
-          <w:tcPr>
-            <w:tcW w:type="dxa" w:w="3120"/>
-            <w:tcBorders>
-              <w:top w:val="single" w:color="999999" w:sz="1"/>
-              <w:left w:val="single" w:color="999999" w:sz="1"/>
-              <w:bottom w:val="single" w:color="999999" w:sz="1"/>
-              <w:right w:val="single" w:color="999999" w:sz="1"/>
-            </w:tcBorders>
-            <w:tcMar>
-              <w:top w:type="dxa" w:w="60"/>
-              <w:left w:type="dxa" w:w="100"/>
-              <w:bottom w:type="dxa" w:w="60"/>
-              <w:right w:type="dxa" w:w="100"/>
-            </w:tcMar>
-          </w:tcPr>
-          <w:p>
-            <w:r>
-              <w:rPr>
-                <w:rFonts w:ascii="Arial" w:eastAsia="微软雅黑"/>
-                <w:b w:val="false"/>
-                <w:bCs w:val="false"/>
-                <w:sz w:val="20"/>
-                <w:szCs w:val="20"/>
-              </w:rPr>
-              <w:t xml:space="preserve">带宽基准（Pro）</w:t>
-            </w:r>
-          </w:p>
-        </w:tc>
-        <w:tc>
-          <w:tcPr>
-            <w:tcW w:type="dxa" w:w="3120"/>
-            <w:tcBorders>
-              <w:top w:val="single" w:color="999999" w:sz="1"/>
-              <w:left w:val="single" w:color="999999" w:sz="1"/>
-              <w:bottom w:val="single" w:color="999999" w:sz="1"/>
-              <w:right w:val="single" w:color="999999" w:sz="1"/>
-            </w:tcBorders>
-            <w:tcMar>
-              <w:top w:type="dxa" w:w="60"/>
-              <w:left w:type="dxa" w:w="100"/>
-              <w:bottom w:type="dxa" w:w="60"/>
-              <w:right w:type="dxa" w:w="100"/>
-            </w:tcMar>
-          </w:tcPr>
-          <w:p>
-            <w:r>
-              <w:rPr>
-                <w:rFonts w:ascii="Arial" w:eastAsia="微软雅黑"/>
-                <w:b w:val="false"/>
-                <w:bCs w:val="false"/>
-                <w:sz w:val="20"/>
-                <w:szCs w:val="20"/>
-              </w:rPr>
-              <w:t xml:space="preserve">读 / 写 / 拷贝三卡实时带宽</w:t>
-            </w:r>
-          </w:p>
-        </w:tc>
-        <w:tc>
-          <w:tcPr>
-            <w:tcW w:type="dxa" w:w="3120"/>
-            <w:tcBorders>
-              <w:top w:val="single" w:color="999999" w:sz="1"/>
-              <w:left w:val="single" w:color="999999" w:sz="1"/>
-              <w:bottom w:val="single" w:color="999999" w:sz="1"/>
-              <w:right w:val="single" w:color="999999" w:sz="1"/>
-            </w:tcBorders>
-            <w:tcMar>
-              <w:top w:type="dxa" w:w="60"/>
-              <w:left w:type="dxa" w:w="100"/>
-              <w:bottom w:type="dxa" w:w="60"/>
-              <w:right w:type="dxa" w:w="100"/>
-            </w:tcMar>
-          </w:tcPr>
-          <w:p>
-            <w:r>
-              <w:rPr>
-                <w:rFonts w:ascii="Arial" w:eastAsia="微软雅黑"/>
-                <w:b w:val="false"/>
-                <w:bCs w:val="false"/>
-                <w:sz w:val="20"/>
-                <w:szCs w:val="20"/>
-              </w:rPr>
-              <w:t xml:space="preserve">—</w:t>
-            </w:r>
-          </w:p>
-        </w:tc>
-      </w:tr>
-      <w:tr>
-        <w:tc>
-          <w:tcPr>
-            <w:tcW w:type="dxa" w:w="3120"/>
-            <w:tcBorders>
-              <w:top w:val="single" w:color="999999" w:sz="1"/>
-              <w:left w:val="single" w:color="999999" w:sz="1"/>
-              <w:bottom w:val="single" w:color="999999" w:sz="1"/>
-              <w:right w:val="single" w:color="999999" w:sz="1"/>
-            </w:tcBorders>
-            <w:tcMar>
-              <w:top w:type="dxa" w:w="60"/>
-              <w:left w:type="dxa" w:w="100"/>
-              <w:bottom w:type="dxa" w:w="60"/>
-              <w:right w:type="dxa" w:w="100"/>
-            </w:tcMar>
-          </w:tcPr>
-          <w:p>
-            <w:r>
-              <w:rPr>
-                <w:rFonts w:ascii="Arial" w:eastAsia="微软雅黑"/>
-                <w:b w:val="false"/>
-                <w:bCs w:val="false"/>
-                <w:sz w:val="20"/>
-                <w:szCs w:val="20"/>
-              </w:rPr>
-              <w:t xml:space="preserve">注入演示（Pro）</w:t>
-            </w:r>
-          </w:p>
-        </w:tc>
-        <w:tc>
-          <w:tcPr>
-            <w:tcW w:type="dxa" w:w="3120"/>
-            <w:tcBorders>
-              <w:top w:val="single" w:color="999999" w:sz="1"/>
-              <w:left w:val="single" w:color="999999" w:sz="1"/>
-              <w:bottom w:val="single" w:color="999999" w:sz="1"/>
-              <w:right w:val="single" w:color="999999" w:sz="1"/>
-            </w:tcBorders>
-            <w:tcMar>
-              <w:top w:type="dxa" w:w="60"/>
-              <w:left w:type="dxa" w:w="100"/>
-              <w:bottom w:type="dxa" w:w="60"/>
-              <w:right w:type="dxa" w:w="100"/>
-            </w:tcMar>
-          </w:tcPr>
-          <w:p>
-            <w:r>
-              <w:rPr>
-                <w:rFonts w:ascii="Arial" w:eastAsia="微软雅黑"/>
-                <w:b w:val="false"/>
-                <w:bCs w:val="false"/>
-                <w:sz w:val="20"/>
-                <w:szCs w:val="20"/>
-              </w:rPr>
-              <w:t xml:space="preserve">勾选体验功能或 inject-demo 参数，演示错误上报全链路</w:t>
-            </w:r>
-          </w:p>
-        </w:tc>
-        <w:tc>
-          <w:tcPr>
-            <w:tcW w:type="dxa" w:w="3120"/>
-            <w:tcBorders>
-              <w:top w:val="single" w:color="999999" w:sz="1"/>
-              <w:left w:val="single" w:color="999999" w:sz="1"/>
-              <w:bottom w:val="single" w:color="999999" w:sz="1"/>
-              <w:right w:val="single" w:color="999999" w:sz="1"/>
-            </w:tcBorders>
-            <w:tcMar>
-              <w:top w:type="dxa" w:w="60"/>
-              <w:left w:type="dxa" w:w="100"/>
-              <w:bottom w:type="dxa" w:w="60"/>
-              <w:right w:type="dxa" w:w="100"/>
-            </w:tcMar>
-          </w:tcPr>
-          <w:p>
-            <w:r>
-              <w:rPr>
-                <w:rFonts w:ascii="Arial" w:eastAsia="微软雅黑"/>
-                <w:b w:val="false"/>
-                <w:bCs w:val="false"/>
-                <w:sz w:val="20"/>
-                <w:szCs w:val="20"/>
-              </w:rPr>
-              <w:t xml:space="preserve">—</w:t>
-            </w:r>
-          </w:p>
-        </w:tc>
-      </w:tr>
-      <w:tr>
-        <w:tc>
-          <w:tcPr>
-            <w:tcW w:type="dxa" w:w="3120"/>
-            <w:tcBorders>
-              <w:top w:val="single" w:color="999999" w:sz="1"/>
-              <w:left w:val="single" w:color="999999" w:sz="1"/>
-              <w:bottom w:val="single" w:color="999999" w:sz="1"/>
-              <w:right w:val="single" w:color="999999" w:sz="1"/>
-            </w:tcBorders>
-            <w:tcMar>
-              <w:top w:type="dxa" w:w="60"/>
-              <w:left w:type="dxa" w:w="100"/>
-              <w:bottom w:type="dxa" w:w="60"/>
-              <w:right w:type="dxa" w:w="100"/>
-            </w:tcMar>
-          </w:tcPr>
-          <w:p>
-            <w:r>
-              <w:rPr>
-                <w:rFonts w:ascii="Arial" w:eastAsia="微软雅黑"/>
-                <w:b w:val="false"/>
-                <w:bCs w:val="false"/>
-                <w:sz w:val="20"/>
-                <w:szCs w:val="20"/>
-              </w:rPr>
-              <w:t xml:space="preserve">退出</w:t>
-            </w:r>
-          </w:p>
-        </w:tc>
-        <w:tc>
-          <w:tcPr>
-            <w:tcW w:type="dxa" w:w="3120"/>
-            <w:tcBorders>
-              <w:top w:val="single" w:color="999999" w:sz="1"/>
-              <w:left w:val="single" w:color="999999" w:sz="1"/>
-              <w:bottom w:val="single" w:color="999999" w:sz="1"/>
-              <w:right w:val="single" w:color="999999" w:sz="1"/>
-            </w:tcBorders>
-            <w:tcMar>
-              <w:top w:type="dxa" w:w="60"/>
-              <w:left w:type="dxa" w:w="100"/>
-              <w:bottom w:type="dxa" w:w="60"/>
-              <w:right w:type="dxa" w:w="100"/>
-            </w:tcMar>
-          </w:tcPr>
-          <w:p>
-            <w:r>
-              <w:rPr>
-                <w:rFonts w:ascii="Arial" w:eastAsia="微软雅黑"/>
-                <w:b w:val="false"/>
-                <w:bCs w:val="false"/>
-                <w:sz w:val="20"/>
-                <w:szCs w:val="20"/>
-              </w:rPr>
-              <w:t xml:space="preserve">空闲 Esc 或"帮助 → 退出"弹退出确认；运行中 Esc 是暂停/继续</w:t>
+              <w:t xml:space="preserve">错误日志区 + 串口 TEST_FAIL 行 + 颗粒红光晕，徽章转 FAIL</w:t>
             </w:r>
           </w:p>
         </w:tc>
@@ -2011,7 +1500,251 @@
                 <wp:inline distT="0" distB="0" distL="0" distR="0">
                   <wp:extent cx="1714500" cy="1066800"/>
                   <wp:effectExtent t="0" r="0" b="0" l="0"/>
-                  <wp:docPr id="1" name="s07-quit" descr="s07-quit" title="s07-quit"/>
+                  <wp:docPr id="1" name="s09-inject" descr="s09-inject" title="s09-inject"/>
+                  <wp:cNvGraphicFramePr>
+                    <a:graphicFrameLocks xmlns:a="http://schemas.openxmlformats.org/drawingml/2006/main" noChangeAspect="1"/>
+                  </wp:cNvGraphicFramePr>
+                  <a:graphic xmlns:a="http://schemas.openxmlformats.org/drawingml/2006/main">
+                    <a:graphicData uri="http://schemas.openxmlformats.org/drawingml/2006/picture">
+                      <pic:pic xmlns:pic="http://schemas.openxmlformats.org/drawingml/2006/picture">
+                        <pic:nvPicPr>
+                          <pic:cNvPr id="0" name="" descr=""/>
+                          <pic:cNvPicPr>
+                            <a:picLocks noChangeAspect="1" noChangeArrowheads="1"/>
+                          </pic:cNvPicPr>
+                        </pic:nvPicPr>
+                        <pic:blipFill>
+                          <a:blip r:embed="rId8" cstate="none"/>
+                          <a:srcRect/>
+                          <a:stretch>
+                            <a:fillRect/>
+                          </a:stretch>
+                        </pic:blipFill>
+                        <pic:spPr bwMode="auto">
+                          <a:xfrm>
+                            <a:off x="0" y="0"/>
+                            <a:ext cx="1714500" cy="1066800"/>
+                          </a:xfrm>
+                          <a:prstGeom prst="rect">
+                            <a:avLst/>
+                          </a:prstGeom>
+                        </pic:spPr>
+                      </pic:pic>
+                    </a:graphicData>
+                  </a:graphic>
+                </wp:inline>
+              </w:drawing>
+            </w:r>
+          </w:p>
+        </w:tc>
+      </w:tr>
+      <w:tr>
+        <w:tc>
+          <w:tcPr>
+            <w:tcW w:type="dxa" w:w="3120"/>
+            <w:tcBorders>
+              <w:top w:val="single" w:color="999999" w:sz="1"/>
+              <w:left w:val="single" w:color="999999" w:sz="1"/>
+              <w:bottom w:val="single" w:color="999999" w:sz="1"/>
+              <w:right w:val="single" w:color="999999" w:sz="1"/>
+            </w:tcBorders>
+            <w:tcMar>
+              <w:top w:type="dxa" w:w="60"/>
+              <w:left w:type="dxa" w:w="100"/>
+              <w:bottom w:type="dxa" w:w="60"/>
+              <w:right w:type="dxa" w:w="100"/>
+            </w:tcMar>
+          </w:tcPr>
+          <w:p>
+            <w:r>
+              <w:rPr>
+                <w:rFonts w:ascii="Arial" w:eastAsia="微软雅黑"/>
+                <w:b w:val="false"/>
+                <w:bCs w:val="false"/>
+                <w:sz w:val="20"/>
+                <w:szCs w:val="20"/>
+              </w:rPr>
+              <w:t xml:space="preserve">DIMM 可视化</w:t>
+            </w:r>
+          </w:p>
+        </w:tc>
+        <w:tc>
+          <w:tcPr>
+            <w:tcW w:type="dxa" w:w="3120"/>
+            <w:tcBorders>
+              <w:top w:val="single" w:color="999999" w:sz="1"/>
+              <w:left w:val="single" w:color="999999" w:sz="1"/>
+              <w:bottom w:val="single" w:color="999999" w:sz="1"/>
+              <w:right w:val="single" w:color="999999" w:sz="1"/>
+            </w:tcBorders>
+            <w:tcMar>
+              <w:top w:type="dxa" w:w="60"/>
+              <w:left w:type="dxa" w:w="100"/>
+              <w:bottom w:type="dxa" w:w="60"/>
+              <w:right w:type="dxa" w:w="100"/>
+            </w:tcMar>
+          </w:tcPr>
+          <w:p>
+            <w:r>
+              <w:rPr>
+                <w:rFonts w:ascii="Arial" w:eastAsia="微软雅黑"/>
+                <w:b w:val="false"/>
+                <w:bCs w:val="false"/>
+                <w:sz w:val="20"/>
+                <w:szCs w:val="20"/>
+              </w:rPr>
+              <w:t xml:space="preserve">SMBIOS 动态槽位（最大 48，空槽置灰 + 分组头），颗粒图标，活动槽光晕，悬停 tooltip</w:t>
+            </w:r>
+          </w:p>
+        </w:tc>
+        <w:tc>
+          <w:tcPr>
+            <w:tcW w:type="dxa" w:w="3120"/>
+            <w:tcBorders>
+              <w:top w:val="single" w:color="999999" w:sz="1"/>
+              <w:left w:val="single" w:color="999999" w:sz="1"/>
+              <w:bottom w:val="single" w:color="999999" w:sz="1"/>
+              <w:right w:val="single" w:color="999999" w:sz="1"/>
+            </w:tcBorders>
+            <w:tcMar>
+              <w:top w:type="dxa" w:w="60"/>
+              <w:left w:type="dxa" w:w="100"/>
+              <w:bottom w:type="dxa" w:w="60"/>
+              <w:right w:type="dxa" w:w="100"/>
+            </w:tcMar>
+          </w:tcPr>
+          <w:p>
+            <w:pPr>
+              <w:jc w:val="center"/>
+            </w:pPr>
+            <w:r>
+              <w:drawing>
+                <wp:inline distT="0" distB="0" distL="0" distR="0">
+                  <wp:extent cx="1714500" cy="1066800"/>
+                  <wp:effectExtent t="0" r="0" b="0" l="0"/>
+                  <wp:docPr id="1" name="s18-dimms-groups" descr="s18-dimms-groups" title="s18-dimms-groups"/>
+                  <wp:cNvGraphicFramePr>
+                    <a:graphicFrameLocks xmlns:a="http://schemas.openxmlformats.org/drawingml/2006/main" noChangeAspect="1"/>
+                  </wp:cNvGraphicFramePr>
+                  <a:graphic xmlns:a="http://schemas.openxmlformats.org/drawingml/2006/main">
+                    <a:graphicData uri="http://schemas.openxmlformats.org/drawingml/2006/picture">
+                      <pic:pic xmlns:pic="http://schemas.openxmlformats.org/drawingml/2006/picture">
+                        <pic:nvPicPr>
+                          <pic:cNvPr id="0" name="" descr=""/>
+                          <pic:cNvPicPr>
+                            <a:picLocks noChangeAspect="1" noChangeArrowheads="1"/>
+                          </pic:cNvPicPr>
+                        </pic:nvPicPr>
+                        <pic:blipFill>
+                          <a:blip r:embed="rId11" cstate="none"/>
+                          <a:srcRect/>
+                          <a:stretch>
+                            <a:fillRect/>
+                          </a:stretch>
+                        </pic:blipFill>
+                        <pic:spPr bwMode="auto">
+                          <a:xfrm>
+                            <a:off x="0" y="0"/>
+                            <a:ext cx="1714500" cy="1066800"/>
+                          </a:xfrm>
+                          <a:prstGeom prst="rect">
+                            <a:avLst/>
+                          </a:prstGeom>
+                        </pic:spPr>
+                      </pic:pic>
+                    </a:graphicData>
+                  </a:graphic>
+                </wp:inline>
+              </w:drawing>
+            </w:r>
+          </w:p>
+        </w:tc>
+      </w:tr>
+      <w:tr>
+        <w:tc>
+          <w:tcPr>
+            <w:tcW w:type="dxa" w:w="3120"/>
+            <w:tcBorders>
+              <w:top w:val="single" w:color="999999" w:sz="1"/>
+              <w:left w:val="single" w:color="999999" w:sz="1"/>
+              <w:bottom w:val="single" w:color="999999" w:sz="1"/>
+              <w:right w:val="single" w:color="999999" w:sz="1"/>
+            </w:tcBorders>
+            <w:tcMar>
+              <w:top w:type="dxa" w:w="60"/>
+              <w:left w:type="dxa" w:w="100"/>
+              <w:bottom w:type="dxa" w:w="60"/>
+              <w:right w:type="dxa" w:w="100"/>
+            </w:tcMar>
+          </w:tcPr>
+          <w:p>
+            <w:r>
+              <w:rPr>
+                <w:rFonts w:ascii="Arial" w:eastAsia="微软雅黑"/>
+                <w:b w:val="false"/>
+                <w:bCs w:val="false"/>
+                <w:sz w:val="20"/>
+                <w:szCs w:val="20"/>
+              </w:rPr>
+              <w:t xml:space="preserve">HTML 报告</w:t>
+            </w:r>
+          </w:p>
+        </w:tc>
+        <w:tc>
+          <w:tcPr>
+            <w:tcW w:type="dxa" w:w="3120"/>
+            <w:tcBorders>
+              <w:top w:val="single" w:color="999999" w:sz="1"/>
+              <w:left w:val="single" w:color="999999" w:sz="1"/>
+              <w:bottom w:val="single" w:color="999999" w:sz="1"/>
+              <w:right w:val="single" w:color="999999" w:sz="1"/>
+            </w:tcBorders>
+            <w:tcMar>
+              <w:top w:type="dxa" w:w="60"/>
+              <w:left w:type="dxa" w:w="100"/>
+              <w:bottom w:type="dxa" w:w="60"/>
+              <w:right w:type="dxa" w:w="100"/>
+            </w:tcMar>
+          </w:tcPr>
+          <w:p>
+            <w:r>
+              <w:rPr>
+                <w:rFonts w:ascii="Arial" w:eastAsia="微软雅黑"/>
+                <w:b w:val="false"/>
+                <w:bCs w:val="false"/>
+                <w:sz w:val="20"/>
+                <w:szCs w:val="20"/>
+              </w:rPr>
+              <w:t xml:space="preserve">停止 / 达标 / 退出三触发写盘，错误明细 + DIMM 布局</w:t>
+            </w:r>
+          </w:p>
+        </w:tc>
+        <w:tc>
+          <w:tcPr>
+            <w:tcW w:type="dxa" w:w="3120"/>
+            <w:tcBorders>
+              <w:top w:val="single" w:color="999999" w:sz="1"/>
+              <w:left w:val="single" w:color="999999" w:sz="1"/>
+              <w:bottom w:val="single" w:color="999999" w:sz="1"/>
+              <w:right w:val="single" w:color="999999" w:sz="1"/>
+            </w:tcBorders>
+            <w:tcMar>
+              <w:top w:type="dxa" w:w="60"/>
+              <w:left w:type="dxa" w:w="100"/>
+              <w:bottom w:type="dxa" w:w="60"/>
+              <w:right w:type="dxa" w:w="100"/>
+            </w:tcMar>
+          </w:tcPr>
+          <w:p>
+            <w:pPr>
+              <w:jc w:val="center"/>
+            </w:pPr>
+            <w:r>
+              <w:drawing>
+                <wp:inline distT="0" distB="0" distL="0" distR="0">
+                  <wp:extent cx="1714500" cy="1066800"/>
+                  <wp:effectExtent t="0" r="0" b="0" l="0"/>
+                  <wp:docPr id="1" name="s15-report" descr="s15-report" title="s15-report"/>
                   <wp:cNvGraphicFramePr>
                     <a:graphicFrameLocks xmlns:a="http://schemas.openxmlformats.org/drawingml/2006/main" noChangeAspect="1"/>
                   </wp:cNvGraphicFramePr>
@@ -2049,6 +1782,603 @@
           </w:p>
         </w:tc>
       </w:tr>
+      <w:tr>
+        <w:tc>
+          <w:tcPr>
+            <w:tcW w:type="dxa" w:w="3120"/>
+            <w:tcBorders>
+              <w:top w:val="single" w:color="999999" w:sz="1"/>
+              <w:left w:val="single" w:color="999999" w:sz="1"/>
+              <w:bottom w:val="single" w:color="999999" w:sz="1"/>
+              <w:right w:val="single" w:color="999999" w:sz="1"/>
+            </w:tcBorders>
+            <w:tcMar>
+              <w:top w:type="dxa" w:w="60"/>
+              <w:left w:type="dxa" w:w="100"/>
+              <w:bottom w:type="dxa" w:w="60"/>
+              <w:right w:type="dxa" w:w="100"/>
+            </w:tcMar>
+          </w:tcPr>
+          <w:p>
+            <w:r>
+              <w:rPr>
+                <w:rFonts w:ascii="Arial" w:eastAsia="微软雅黑"/>
+                <w:b w:val="false"/>
+                <w:bCs w:val="false"/>
+                <w:sz w:val="20"/>
+                <w:szCs w:val="20"/>
+              </w:rPr>
+              <w:t xml:space="preserve">介质能不能存设置/报告</w:t>
+            </w:r>
+          </w:p>
+        </w:tc>
+        <w:tc>
+          <w:tcPr>
+            <w:tcW w:type="dxa" w:w="3120"/>
+            <w:tcBorders>
+              <w:top w:val="single" w:color="999999" w:sz="1"/>
+              <w:left w:val="single" w:color="999999" w:sz="1"/>
+              <w:bottom w:val="single" w:color="999999" w:sz="1"/>
+              <w:right w:val="single" w:color="999999" w:sz="1"/>
+            </w:tcBorders>
+            <w:tcMar>
+              <w:top w:type="dxa" w:w="60"/>
+              <w:left w:type="dxa" w:w="100"/>
+              <w:bottom w:type="dxa" w:w="60"/>
+              <w:right w:type="dxa" w:w="100"/>
+            </w:tcMar>
+          </w:tcPr>
+          <w:p>
+            <w:r>
+              <w:rPr>
+                <w:rFonts w:ascii="Arial" w:eastAsia="微软雅黑"/>
+                <w:b w:val="false"/>
+                <w:bCs w:val="false"/>
+                <w:sz w:val="20"/>
+                <w:szCs w:val="20"/>
+              </w:rPr>
+              <w:t xml:space="preserve">按启动形态而异——</w:t>
+            </w:r>
+            <w:r>
+              <w:rPr>
+                <w:rFonts w:ascii="Arial" w:eastAsia="微软雅黑"/>
+                <w:b w:val="false"/>
+                <w:bCs w:val="false"/>
+                <w:sz w:val="20"/>
+                <w:szCs w:val="20"/>
+              </w:rPr>
+              <w:t xml:space="preserve">要两者都稳</w:t>
+            </w:r>
+            <w:r>
+              <w:rPr>
+                <w:rFonts w:ascii="Arial" w:eastAsia="微软雅黑"/>
+                <w:b w:val="false"/>
+                <w:bCs w:val="false"/>
+                <w:sz w:val="20"/>
+                <w:szCs w:val="20"/>
+              </w:rPr>
+              <w:t xml:space="preserve">请把 efi 拷到可写 FAT32 盘跑（详表见两本详版手册 1.2）</w:t>
+            </w:r>
+          </w:p>
+        </w:tc>
+        <w:tc>
+          <w:tcPr>
+            <w:tcW w:type="dxa" w:w="3120"/>
+            <w:tcBorders>
+              <w:top w:val="single" w:color="999999" w:sz="1"/>
+              <w:left w:val="single" w:color="999999" w:sz="1"/>
+              <w:bottom w:val="single" w:color="999999" w:sz="1"/>
+              <w:right w:val="single" w:color="999999" w:sz="1"/>
+            </w:tcBorders>
+            <w:tcMar>
+              <w:top w:type="dxa" w:w="60"/>
+              <w:left w:type="dxa" w:w="100"/>
+              <w:bottom w:type="dxa" w:w="60"/>
+              <w:right w:type="dxa" w:w="100"/>
+            </w:tcMar>
+          </w:tcPr>
+          <w:p>
+            <w:r>
+              <w:rPr>
+                <w:rFonts w:ascii="Arial" w:eastAsia="微软雅黑"/>
+                <w:b w:val="false"/>
+                <w:bCs w:val="false"/>
+                <w:sz w:val="20"/>
+                <w:szCs w:val="20"/>
+              </w:rPr>
+              <w:t xml:space="preserve">—</w:t>
+            </w:r>
+          </w:p>
+        </w:tc>
+      </w:tr>
+      <w:tr>
+        <w:tc>
+          <w:tcPr>
+            <w:tcW w:type="dxa" w:w="3120"/>
+            <w:tcBorders>
+              <w:top w:val="single" w:color="999999" w:sz="1"/>
+              <w:left w:val="single" w:color="999999" w:sz="1"/>
+              <w:bottom w:val="single" w:color="999999" w:sz="1"/>
+              <w:right w:val="single" w:color="999999" w:sz="1"/>
+            </w:tcBorders>
+            <w:tcMar>
+              <w:top w:type="dxa" w:w="60"/>
+              <w:left w:type="dxa" w:w="100"/>
+              <w:bottom w:type="dxa" w:w="60"/>
+              <w:right w:type="dxa" w:w="100"/>
+            </w:tcMar>
+          </w:tcPr>
+          <w:p>
+            <w:r>
+              <w:rPr>
+                <w:rFonts w:ascii="Arial" w:eastAsia="微软雅黑"/>
+                <w:b w:val="false"/>
+                <w:bCs w:val="false"/>
+                <w:sz w:val="20"/>
+                <w:szCs w:val="20"/>
+              </w:rPr>
+              <w:t xml:space="preserve">内存信息（Pro）</w:t>
+            </w:r>
+          </w:p>
+        </w:tc>
+        <w:tc>
+          <w:tcPr>
+            <w:tcW w:type="dxa" w:w="3120"/>
+            <w:tcBorders>
+              <w:top w:val="single" w:color="999999" w:sz="1"/>
+              <w:left w:val="single" w:color="999999" w:sz="1"/>
+              <w:bottom w:val="single" w:color="999999" w:sz="1"/>
+              <w:right w:val="single" w:color="999999" w:sz="1"/>
+            </w:tcBorders>
+            <w:tcMar>
+              <w:top w:type="dxa" w:w="60"/>
+              <w:left w:type="dxa" w:w="100"/>
+              <w:bottom w:type="dxa" w:w="60"/>
+              <w:right w:type="dxa" w:w="100"/>
+            </w:tcMar>
+          </w:tcPr>
+          <w:p>
+            <w:r>
+              <w:rPr>
+                <w:rFonts w:ascii="Arial" w:eastAsia="微软雅黑"/>
+                <w:b w:val="false"/>
+                <w:bCs w:val="false"/>
+                <w:sz w:val="20"/>
+                <w:szCs w:val="20"/>
+              </w:rPr>
+              <w:t xml:space="preserve">设置→内存信息…：SPD 深度解析（平台 / 通路 / 数据源 + 槽位档案 + CRC 对账 + 温度明细 + ECC 明细）</w:t>
+            </w:r>
+          </w:p>
+        </w:tc>
+        <w:tc>
+          <w:tcPr>
+            <w:tcW w:type="dxa" w:w="3120"/>
+            <w:tcBorders>
+              <w:top w:val="single" w:color="999999" w:sz="1"/>
+              <w:left w:val="single" w:color="999999" w:sz="1"/>
+              <w:bottom w:val="single" w:color="999999" w:sz="1"/>
+              <w:right w:val="single" w:color="999999" w:sz="1"/>
+            </w:tcBorders>
+            <w:tcMar>
+              <w:top w:type="dxa" w:w="60"/>
+              <w:left w:type="dxa" w:w="100"/>
+              <w:bottom w:type="dxa" w:w="60"/>
+              <w:right w:type="dxa" w:w="100"/>
+            </w:tcMar>
+          </w:tcPr>
+          <w:p>
+            <w:pPr>
+              <w:jc w:val="center"/>
+            </w:pPr>
+            <w:r>
+              <w:drawing>
+                <wp:inline distT="0" distB="0" distL="0" distR="0">
+                  <wp:extent cx="1714500" cy="1066800"/>
+                  <wp:effectExtent t="0" r="0" b="0" l="0"/>
+                  <wp:docPr id="1" name="s21-spd-info" descr="s21-spd-info" title="s21-spd-info"/>
+                  <wp:cNvGraphicFramePr>
+                    <a:graphicFrameLocks xmlns:a="http://schemas.openxmlformats.org/drawingml/2006/main" noChangeAspect="1"/>
+                  </wp:cNvGraphicFramePr>
+                  <a:graphic xmlns:a="http://schemas.openxmlformats.org/drawingml/2006/main">
+                    <a:graphicData uri="http://schemas.openxmlformats.org/drawingml/2006/picture">
+                      <pic:pic xmlns:pic="http://schemas.openxmlformats.org/drawingml/2006/picture">
+                        <pic:nvPicPr>
+                          <pic:cNvPr id="0" name="" descr=""/>
+                          <pic:cNvPicPr>
+                            <a:picLocks noChangeAspect="1" noChangeArrowheads="1"/>
+                          </pic:cNvPicPr>
+                        </pic:nvPicPr>
+                        <pic:blipFill>
+                          <a:blip r:embed="rId18" cstate="none"/>
+                          <a:srcRect/>
+                          <a:stretch>
+                            <a:fillRect/>
+                          </a:stretch>
+                        </pic:blipFill>
+                        <pic:spPr bwMode="auto">
+                          <a:xfrm>
+                            <a:off x="0" y="0"/>
+                            <a:ext cx="1714500" cy="1066800"/>
+                          </a:xfrm>
+                          <a:prstGeom prst="rect">
+                            <a:avLst/>
+                          </a:prstGeom>
+                        </pic:spPr>
+                      </pic:pic>
+                    </a:graphicData>
+                  </a:graphic>
+                </wp:inline>
+              </w:drawing>
+            </w:r>
+          </w:p>
+        </w:tc>
+      </w:tr>
+      <w:tr>
+        <w:tc>
+          <w:tcPr>
+            <w:tcW w:type="dxa" w:w="3120"/>
+            <w:tcBorders>
+              <w:top w:val="single" w:color="999999" w:sz="1"/>
+              <w:left w:val="single" w:color="999999" w:sz="1"/>
+              <w:bottom w:val="single" w:color="999999" w:sz="1"/>
+              <w:right w:val="single" w:color="999999" w:sz="1"/>
+            </w:tcBorders>
+            <w:tcMar>
+              <w:top w:type="dxa" w:w="60"/>
+              <w:left w:type="dxa" w:w="100"/>
+              <w:bottom w:type="dxa" w:w="60"/>
+              <w:right w:type="dxa" w:w="100"/>
+            </w:tcMar>
+          </w:tcPr>
+          <w:p>
+            <w:r>
+              <w:rPr>
+                <w:rFonts w:ascii="Arial" w:eastAsia="微软雅黑"/>
+                <w:b w:val="false"/>
+                <w:bCs w:val="false"/>
+                <w:sz w:val="20"/>
+                <w:szCs w:val="20"/>
+              </w:rPr>
+              <w:t xml:space="preserve">带宽基准（两版都有）</w:t>
+            </w:r>
+          </w:p>
+        </w:tc>
+        <w:tc>
+          <w:tcPr>
+            <w:tcW w:type="dxa" w:w="3120"/>
+            <w:tcBorders>
+              <w:top w:val="single" w:color="999999" w:sz="1"/>
+              <w:left w:val="single" w:color="999999" w:sz="1"/>
+              <w:bottom w:val="single" w:color="999999" w:sz="1"/>
+              <w:right w:val="single" w:color="999999" w:sz="1"/>
+            </w:tcBorders>
+            <w:tcMar>
+              <w:top w:type="dxa" w:w="60"/>
+              <w:left w:type="dxa" w:w="100"/>
+              <w:bottom w:type="dxa" w:w="60"/>
+              <w:right w:type="dxa" w:w="100"/>
+            </w:tcMar>
+          </w:tcPr>
+          <w:p>
+            <w:r>
+              <w:rPr>
+                <w:rFonts w:ascii="Arial" w:eastAsia="微软雅黑"/>
+                <w:b w:val="false"/>
+                <w:bCs w:val="false"/>
+                <w:sz w:val="20"/>
+                <w:szCs w:val="20"/>
+              </w:rPr>
+              <w:t xml:space="preserve">工作集扫描带宽曲线；Free 只画读取一条线，Pro 另加写/拷贝/SIMD 对照三条与四档缓存台阶标注</w:t>
+            </w:r>
+          </w:p>
+        </w:tc>
+        <w:tc>
+          <w:tcPr>
+            <w:tcW w:type="dxa" w:w="3120"/>
+            <w:tcBorders>
+              <w:top w:val="single" w:color="999999" w:sz="1"/>
+              <w:left w:val="single" w:color="999999" w:sz="1"/>
+              <w:bottom w:val="single" w:color="999999" w:sz="1"/>
+              <w:right w:val="single" w:color="999999" w:sz="1"/>
+            </w:tcBorders>
+            <w:tcMar>
+              <w:top w:type="dxa" w:w="60"/>
+              <w:left w:type="dxa" w:w="100"/>
+              <w:bottom w:type="dxa" w:w="60"/>
+              <w:right w:type="dxa" w:w="100"/>
+            </w:tcMar>
+          </w:tcPr>
+          <w:p>
+            <w:pPr>
+              <w:jc w:val="center"/>
+            </w:pPr>
+            <w:r>
+              <w:drawing>
+                <wp:inline distT="0" distB="0" distL="0" distR="0">
+                  <wp:extent cx="1714500" cy="1066800"/>
+                  <wp:effectExtent t="0" r="0" b="0" l="0"/>
+                  <wp:docPr id="1" name="s24-bench" descr="s24-bench" title="s24-bench"/>
+                  <wp:cNvGraphicFramePr>
+                    <a:graphicFrameLocks xmlns:a="http://schemas.openxmlformats.org/drawingml/2006/main" noChangeAspect="1"/>
+                  </wp:cNvGraphicFramePr>
+                  <a:graphic xmlns:a="http://schemas.openxmlformats.org/drawingml/2006/main">
+                    <a:graphicData uri="http://schemas.openxmlformats.org/drawingml/2006/picture">
+                      <pic:pic xmlns:pic="http://schemas.openxmlformats.org/drawingml/2006/picture">
+                        <pic:nvPicPr>
+                          <pic:cNvPr id="0" name="" descr=""/>
+                          <pic:cNvPicPr>
+                            <a:picLocks noChangeAspect="1" noChangeArrowheads="1"/>
+                          </pic:cNvPicPr>
+                        </pic:nvPicPr>
+                        <pic:blipFill>
+                          <a:blip r:embed="rId19" cstate="none"/>
+                          <a:srcRect/>
+                          <a:stretch>
+                            <a:fillRect/>
+                          </a:stretch>
+                        </pic:blipFill>
+                        <pic:spPr bwMode="auto">
+                          <a:xfrm>
+                            <a:off x="0" y="0"/>
+                            <a:ext cx="1714500" cy="1066800"/>
+                          </a:xfrm>
+                          <a:prstGeom prst="rect">
+                            <a:avLst/>
+                          </a:prstGeom>
+                        </pic:spPr>
+                      </pic:pic>
+                    </a:graphicData>
+                  </a:graphic>
+                </wp:inline>
+              </w:drawing>
+            </w:r>
+          </w:p>
+        </w:tc>
+      </w:tr>
+      <w:tr>
+        <w:tc>
+          <w:tcPr>
+            <w:tcW w:type="dxa" w:w="3120"/>
+            <w:tcBorders>
+              <w:top w:val="single" w:color="999999" w:sz="1"/>
+              <w:left w:val="single" w:color="999999" w:sz="1"/>
+              <w:bottom w:val="single" w:color="999999" w:sz="1"/>
+              <w:right w:val="single" w:color="999999" w:sz="1"/>
+            </w:tcBorders>
+            <w:tcMar>
+              <w:top w:type="dxa" w:w="60"/>
+              <w:left w:type="dxa" w:w="100"/>
+              <w:bottom w:type="dxa" w:w="60"/>
+              <w:right w:type="dxa" w:w="100"/>
+            </w:tcMar>
+          </w:tcPr>
+          <w:p>
+            <w:r>
+              <w:rPr>
+                <w:rFonts w:ascii="Arial" w:eastAsia="微软雅黑"/>
+                <w:b w:val="false"/>
+                <w:bCs w:val="false"/>
+                <w:sz w:val="20"/>
+                <w:szCs w:val="20"/>
+              </w:rPr>
+              <w:t xml:space="preserve">注入演示（Pro）</w:t>
+            </w:r>
+          </w:p>
+        </w:tc>
+        <w:tc>
+          <w:tcPr>
+            <w:tcW w:type="dxa" w:w="3120"/>
+            <w:tcBorders>
+              <w:top w:val="single" w:color="999999" w:sz="1"/>
+              <w:left w:val="single" w:color="999999" w:sz="1"/>
+              <w:bottom w:val="single" w:color="999999" w:sz="1"/>
+              <w:right w:val="single" w:color="999999" w:sz="1"/>
+            </w:tcBorders>
+            <w:tcMar>
+              <w:top w:type="dxa" w:w="60"/>
+              <w:left w:type="dxa" w:w="100"/>
+              <w:bottom w:type="dxa" w:w="60"/>
+              <w:right w:type="dxa" w:w="100"/>
+            </w:tcMar>
+          </w:tcPr>
+          <w:p>
+            <w:r>
+              <w:rPr>
+                <w:rFonts w:ascii="Arial" w:eastAsia="微软雅黑"/>
+                <w:b w:val="false"/>
+                <w:bCs w:val="false"/>
+                <w:sz w:val="20"/>
+                <w:szCs w:val="20"/>
+              </w:rPr>
+              <w:t xml:space="preserve">勾选体验功能或 inject-demo 参数，演示错误上报全链路</w:t>
+            </w:r>
+          </w:p>
+        </w:tc>
+        <w:tc>
+          <w:tcPr>
+            <w:tcW w:type="dxa" w:w="3120"/>
+            <w:tcBorders>
+              <w:top w:val="single" w:color="999999" w:sz="1"/>
+              <w:left w:val="single" w:color="999999" w:sz="1"/>
+              <w:bottom w:val="single" w:color="999999" w:sz="1"/>
+              <w:right w:val="single" w:color="999999" w:sz="1"/>
+            </w:tcBorders>
+            <w:tcMar>
+              <w:top w:type="dxa" w:w="60"/>
+              <w:left w:type="dxa" w:w="100"/>
+              <w:bottom w:type="dxa" w:w="60"/>
+              <w:right w:type="dxa" w:w="100"/>
+            </w:tcMar>
+          </w:tcPr>
+          <w:p>
+            <w:pPr>
+              <w:jc w:val="center"/>
+            </w:pPr>
+            <w:r>
+              <w:drawing>
+                <wp:inline distT="0" distB="0" distL="0" distR="0">
+                  <wp:extent cx="1714500" cy="1066800"/>
+                  <wp:effectExtent t="0" r="0" b="0" l="0"/>
+                  <wp:docPr id="1" name="s06-feature" descr="s06-feature" title="s06-feature"/>
+                  <wp:cNvGraphicFramePr>
+                    <a:graphicFrameLocks xmlns:a="http://schemas.openxmlformats.org/drawingml/2006/main" noChangeAspect="1"/>
+                  </wp:cNvGraphicFramePr>
+                  <a:graphic xmlns:a="http://schemas.openxmlformats.org/drawingml/2006/main">
+                    <a:graphicData uri="http://schemas.openxmlformats.org/drawingml/2006/picture">
+                      <pic:pic xmlns:pic="http://schemas.openxmlformats.org/drawingml/2006/picture">
+                        <pic:nvPicPr>
+                          <pic:cNvPr id="0" name="" descr=""/>
+                          <pic:cNvPicPr>
+                            <a:picLocks noChangeAspect="1" noChangeArrowheads="1"/>
+                          </pic:cNvPicPr>
+                        </pic:nvPicPr>
+                        <pic:blipFill>
+                          <a:blip r:embed="rId20" cstate="none"/>
+                          <a:srcRect/>
+                          <a:stretch>
+                            <a:fillRect/>
+                          </a:stretch>
+                        </pic:blipFill>
+                        <pic:spPr bwMode="auto">
+                          <a:xfrm>
+                            <a:off x="0" y="0"/>
+                            <a:ext cx="1714500" cy="1066800"/>
+                          </a:xfrm>
+                          <a:prstGeom prst="rect">
+                            <a:avLst/>
+                          </a:prstGeom>
+                        </pic:spPr>
+                      </pic:pic>
+                    </a:graphicData>
+                  </a:graphic>
+                </wp:inline>
+              </w:drawing>
+            </w:r>
+          </w:p>
+        </w:tc>
+      </w:tr>
+      <w:tr>
+        <w:tc>
+          <w:tcPr>
+            <w:tcW w:type="dxa" w:w="3120"/>
+            <w:tcBorders>
+              <w:top w:val="single" w:color="999999" w:sz="1"/>
+              <w:left w:val="single" w:color="999999" w:sz="1"/>
+              <w:bottom w:val="single" w:color="999999" w:sz="1"/>
+              <w:right w:val="single" w:color="999999" w:sz="1"/>
+            </w:tcBorders>
+            <w:tcMar>
+              <w:top w:type="dxa" w:w="60"/>
+              <w:left w:type="dxa" w:w="100"/>
+              <w:bottom w:type="dxa" w:w="60"/>
+              <w:right w:type="dxa" w:w="100"/>
+            </w:tcMar>
+          </w:tcPr>
+          <w:p>
+            <w:r>
+              <w:rPr>
+                <w:rFonts w:ascii="Arial" w:eastAsia="微软雅黑"/>
+                <w:b w:val="false"/>
+                <w:bCs w:val="false"/>
+                <w:sz w:val="20"/>
+                <w:szCs w:val="20"/>
+              </w:rPr>
+              <w:t xml:space="preserve">退出</w:t>
+            </w:r>
+          </w:p>
+        </w:tc>
+        <w:tc>
+          <w:tcPr>
+            <w:tcW w:type="dxa" w:w="3120"/>
+            <w:tcBorders>
+              <w:top w:val="single" w:color="999999" w:sz="1"/>
+              <w:left w:val="single" w:color="999999" w:sz="1"/>
+              <w:bottom w:val="single" w:color="999999" w:sz="1"/>
+              <w:right w:val="single" w:color="999999" w:sz="1"/>
+            </w:tcBorders>
+            <w:tcMar>
+              <w:top w:type="dxa" w:w="60"/>
+              <w:left w:type="dxa" w:w="100"/>
+              <w:bottom w:type="dxa" w:w="60"/>
+              <w:right w:type="dxa" w:w="100"/>
+            </w:tcMar>
+          </w:tcPr>
+          <w:p>
+            <w:r>
+              <w:rPr>
+                <w:rFonts w:ascii="Arial" w:eastAsia="微软雅黑"/>
+                <w:b w:val="false"/>
+                <w:bCs w:val="false"/>
+                <w:sz w:val="20"/>
+                <w:szCs w:val="20"/>
+              </w:rPr>
+              <w:t xml:space="preserve">空闲 Esc 或"帮助 → 退出"弹退出确认；运行中 Esc 是暂停/继续</w:t>
+            </w:r>
+          </w:p>
+        </w:tc>
+        <w:tc>
+          <w:tcPr>
+            <w:tcW w:type="dxa" w:w="3120"/>
+            <w:tcBorders>
+              <w:top w:val="single" w:color="999999" w:sz="1"/>
+              <w:left w:val="single" w:color="999999" w:sz="1"/>
+              <w:bottom w:val="single" w:color="999999" w:sz="1"/>
+              <w:right w:val="single" w:color="999999" w:sz="1"/>
+            </w:tcBorders>
+            <w:tcMar>
+              <w:top w:type="dxa" w:w="60"/>
+              <w:left w:type="dxa" w:w="100"/>
+              <w:bottom w:type="dxa" w:w="60"/>
+              <w:right w:type="dxa" w:w="100"/>
+            </w:tcMar>
+          </w:tcPr>
+          <w:p>
+            <w:pPr>
+              <w:jc w:val="center"/>
+            </w:pPr>
+            <w:r>
+              <w:drawing>
+                <wp:inline distT="0" distB="0" distL="0" distR="0">
+                  <wp:extent cx="1714500" cy="1066800"/>
+                  <wp:effectExtent t="0" r="0" b="0" l="0"/>
+                  <wp:docPr id="1" name="s07-quit" descr="s07-quit" title="s07-quit"/>
+                  <wp:cNvGraphicFramePr>
+                    <a:graphicFrameLocks xmlns:a="http://schemas.openxmlformats.org/drawingml/2006/main" noChangeAspect="1"/>
+                  </wp:cNvGraphicFramePr>
+                  <a:graphic xmlns:a="http://schemas.openxmlformats.org/drawingml/2006/main">
+                    <a:graphicData uri="http://schemas.openxmlformats.org/drawingml/2006/picture">
+                      <pic:pic xmlns:pic="http://schemas.openxmlformats.org/drawingml/2006/picture">
+                        <pic:nvPicPr>
+                          <pic:cNvPr id="0" name="" descr=""/>
+                          <pic:cNvPicPr>
+                            <a:picLocks noChangeAspect="1" noChangeArrowheads="1"/>
+                          </pic:cNvPicPr>
+                        </pic:nvPicPr>
+                        <pic:blipFill>
+                          <a:blip r:embed="rId21" cstate="none"/>
+                          <a:srcRect/>
+                          <a:stretch>
+                            <a:fillRect/>
+                          </a:stretch>
+                        </pic:blipFill>
+                        <pic:spPr bwMode="auto">
+                          <a:xfrm>
+                            <a:off x="0" y="0"/>
+                            <a:ext cx="1714500" cy="1066800"/>
+                          </a:xfrm>
+                          <a:prstGeom prst="rect">
+                            <a:avLst/>
+                          </a:prstGeom>
+                        </pic:spPr>
+                      </pic:pic>
+                    </a:graphicData>
+                  </a:graphic>
+                </wp:inline>
+              </w:drawing>
+            </w:r>
+          </w:p>
+        </w:tc>
+      </w:tr>
     </w:tbl>
     <w:p/>
     <w:p>
@@ -2361,7 +2691,7 @@
         <w:rPr>
           <w:rFonts w:ascii="Arial" w:eastAsia="微软雅黑"/>
         </w:rPr>
-        <w:t xml:space="preserve">（如 v0.1.7.free.401），可与构建记录核对。</w:t>
+        <w:t xml:space="preserve">（如 v0.1.7.free.562），可与构建记录核对。</w:t>
       </w:r>
     </w:p>
     <w:p>
@@ -2384,7 +2714,7 @@
         <w:rPr>
           <w:rFonts w:ascii="Arial" w:eastAsia="微软雅黑"/>
         </w:rPr>
-        <w:t xml:space="preserve">：31 条真实 pattern（Free 用户可见 11 条；2 条引擎自检参考条不对外展示；增补条默认不勾选）；四线程模式（MP Services 真实多核调度，顺序轮巡/轮流两模式 Pro 专属，Free 上限 16 / Pro 上限 512）；SMBIOS 动态 DIMM 可视化带（最大 48 槽）；Pro 版 SPD 深度内存信息页、厂商门控、颗粒级错误定位、带宽基准、禁用缓存、坏块清单导出；自我重定位；HTML 报告；分辨率自适应（≥1280×800 自动索取）；设置持久化（ADVMTEST.CFG 与软件同级存放）。</w:t>
+        <w:t xml:space="preserve">：33 条真实 pattern（Free 用户可见 13 条；2 条引擎自检参考条不对外展示；增补条默认不勾选；SIMD-256 需固件启用 AVX2，多数固件未开时自动锁定、不影响其它条）；四线程模式（MP Services 真实多核调度，顺序轮巡/轮流两模式 Pro 专属，Free 上限 16 / Pro 上限 512）；SMBIOS 动态 DIMM 可视化带（最大 48 槽）；底部平台信息条（CPU · 主板 · 内存总量 + 起测时刻 / 已测时长）；Pro 版 SPD 深度内存信息页（含温度与 ECC 明细）、厂商门控、颗粒级错误定位、带宽曲线、禁用缓存、坏块清单导出；自我重定位；HTML 报告；分辨率自适应（≥1280×800 自动索取）；设置持久化（ADVMTEST.CFG 与软件同级存放）。</w:t>
       </w:r>
     </w:p>
     <w:p>
@@ -2407,13 +2737,13 @@
         <w:rPr>
           <w:rFonts w:ascii="Arial" w:eastAsia="微软雅黑"/>
         </w:rPr>
-        <w:t xml:space="preserve">：免费版个人用户免费使用；专业版商业用途（营利性部署 / 分发 / 预装）需授权——升级途径：请联系作者（详见免费版技术手册 </w:t>
-      </w:r>
-      <w:r>
-        <w:rPr>
-          <w:rFonts w:ascii="Arial" w:eastAsia="微软雅黑"/>
-        </w:rPr>
-        <w:t xml:space="preserve">advmemtest-free-user-guide.md</w:t>
+        <w:t xml:space="preserve">：免费版个人用户免费使用；专业版商业用途（营利性部署 / 分发 / 预装）需授权——升级途径：请联系作者（详见专业版技术手册 </w:t>
+      </w:r>
+      <w:r>
+        <w:rPr>
+          <w:rFonts w:ascii="Arial" w:eastAsia="微软雅黑"/>
+        </w:rPr>
+        <w:t xml:space="preserve">docs/manual/user-guide-pro.md</w:t>
       </w:r>
       <w:r>
         <w:rPr>
@@ -2442,7 +2772,19 @@
         <w:rPr>
           <w:rFonts w:ascii="Arial" w:eastAsia="微软雅黑"/>
         </w:rPr>
-        <w:t xml:space="preserve">：在真实服务器平台上以固件 MRC 的地址交错映射为准（"近似映射 / 平台映射"两级标注见免费版技术手册 7.1）；本手册所述行为以 QEMU 验证环境为基准，真机差异以实测为准。</w:t>
+        <w:t xml:space="preserve">：在真实服务器平台上以固件 MRC 的地址交错映射为准（"近似映射 / 平台映射"两级标注见 </w:t>
+      </w:r>
+      <w:r>
+        <w:rPr>
+          <w:rFonts w:ascii="Arial" w:eastAsia="微软雅黑"/>
+        </w:rPr>
+        <w:t xml:space="preserve">docs/manual/user-guide-pro.md</w:t>
+      </w:r>
+      <w:r>
+        <w:rPr>
+          <w:rFonts w:ascii="Arial" w:eastAsia="微软雅黑"/>
+        </w:rPr>
+        <w:t xml:space="preserve"> 4.2）；本手册所述行为以 QEMU 验证环境为基准，真机差异以实测为准。</w:t>
       </w:r>
     </w:p>
     <w:sectPr>

</xml_diff>

<commit_message>
Update AdvMemTest to 0.1.7.721 (Free binaries + manuals + README)
Co-Authored-By: Claude Code <noreply@anthropic.com>
</commit_message>
<xml_diff>
--- a/AdvMemTest/docs/manual/advmemtest-quick-guide.docx
+++ b/AdvMemTest/docs/manual/advmemtest-quick-guide.docx
@@ -131,7 +131,7 @@
         <w:rPr>
           <w:rFonts w:ascii="Arial" w:eastAsia="微软雅黑"/>
         </w:rPr>
-        <w:t xml:space="preserve">13 条用户可见经典测试条目（另有 2 条引擎自检参考条不对外展示）、个人免费使用；</w:t>
+        <w:t xml:space="preserve">14 条用户可见经典测试条目（另有 2 条引擎自检参考条不对外展示）、个人免费使用；</w:t>
       </w:r>
       <w:r>
         <w:rPr>
@@ -145,7 +145,7 @@
         <w:rPr>
           <w:rFonts w:ascii="Arial" w:eastAsia="微软雅黑"/>
         </w:rPr>
-        <w:t xml:space="preserve">33 条全量条目，再加颗粒级错误定位、SPD 深度信息（含内存温度与 ECC 明细）、带宽曲线、禁用缓存、顺序轮巡/轮流多核模式、512 核多核扩展与坏块清单导出，商业用途需授权。两版均无外部依赖——单个 efi 文件拷进 Shell 即可运行，全简体中文界面，鼠标与键盘双路操作，面向服务器、工作站的装机验收、故障排查与返修质检。</w:t>
+        <w:t xml:space="preserve">36 条全量条目，再加颗粒级错误定位、SPD 深度信息（含内存温度与 ECC 明细）、带宽曲线、禁用缓存、顺序轮巡/轮流多核模式、512 核多核扩展与坏块清单导出，商业用途需授权。两版均无外部依赖——单个 efi 文件拷进 Shell 即可运行，全简体中文界面，鼠标与键盘双路操作，面向服务器、工作站的装机验收、故障排查与返修质检。</w:t>
       </w:r>
     </w:p>
     <w:p>
@@ -369,7 +369,47 @@
         <w:rPr>
           <w:rFonts w:ascii="Arial" w:eastAsia="微软雅黑"/>
         </w:rPr>
-        <w:t xml:space="preserve"> 单线程之外提供三条多核模式：多线程（内存按核切段、并行压测，4 核实测吞吐约 2.5 倍）、顺序轮巡（每核全量轮流跑一遍）、轮流（pattern 与核心对轮转）。Memtest86 只有轮巡，advmemtest 是真实的切分并发。多核机器上起测默认即全核并行（免费版上限 16 核，专业版按系统核数实探、上限 512 核）。</w:t>
+        <w:t xml:space="preserve"> 单线程之外提供三条多核模式：多线程（内存按核切段、并行压测，4 核实测吞吐约 2.5 倍）、顺序轮巡（每核全量轮流跑一遍）、轮流（pattern 与核心对轮转）。Memtest86 只有轮巡，advmemtest 是真实的切分并发。多核机器上起测默认进入多核并行模式：</w:t>
+      </w:r>
+      <w:r>
+        <w:rPr>
+          <w:rFonts w:ascii="Arial" w:eastAsia="微软雅黑"/>
+          <w:b/>
+          <w:bCs/>
+        </w:rPr>
+        <w:t xml:space="preserve">切分类（PAR_SPLIT）pattern 全核并发</w:t>
+      </w:r>
+      <w:r>
+        <w:rPr>
+          <w:rFonts w:ascii="Arial" w:eastAsia="微软雅黑"/>
+        </w:rPr>
+        <w:t xml:space="preserve">；</w:t>
+      </w:r>
+      <w:r>
+        <w:rPr>
+          <w:rFonts w:ascii="Arial" w:eastAsia="微软雅黑"/>
+          <w:b/>
+          <w:bCs/>
+        </w:rPr>
+        <w:t xml:space="preserve">轮换类（PAR_ROTATE）pattern 缺省只由 1 核跑完整内存</w:t>
+      </w:r>
+      <w:r>
+        <w:rPr>
+          <w:rFonts w:ascii="Arial" w:eastAsia="微软雅黑"/>
+        </w:rPr>
+        <w:t xml:space="preserve">（覆盖等价、不做 ×N 重复全量，CFG </w:t>
+      </w:r>
+      <w:r>
+        <w:rPr>
+          <w:rFonts w:ascii="Arial" w:eastAsia="微软雅黑"/>
+        </w:rPr>
+        <w:t xml:space="preserve">par.rotate.cores</w:t>
+      </w:r>
+      <w:r>
+        <w:rPr>
+          <w:rFonts w:ascii="Arial" w:eastAsia="微软雅黑"/>
+        </w:rPr>
+        <w:t xml:space="preserve"> 可调宽）。免费版上限 16 核，专业版按系统核数实探、上限 512 核。</w:t>
       </w:r>
     </w:p>
     <w:p>
@@ -490,19 +530,45 @@
         <w:rPr>
           <w:rFonts w:ascii="Arial" w:eastAsia="微软雅黑"/>
         </w:rPr>
-        <w:t xml:space="preserve"> 停止测试、跑满指定轮数或退出时，自动把整场测试写成 </w:t>
-      </w:r>
-      <w:r>
-        <w:rPr>
-          <w:rFonts w:ascii="Arial" w:eastAsia="微软雅黑"/>
-        </w:rPr>
-        <w:t xml:space="preserve">fs0:\advmemtest_report.html</w:t>
-      </w:r>
-      <w:r>
-        <w:rPr>
-          <w:rFonts w:ascii="Arial" w:eastAsia="微软雅黑"/>
-        </w:rPr>
-        <w:t xml:space="preserve">：汇总统计、错误明细（Pro 含颗粒定位，Free 仅地址）、DIMM 布局可视化一页呈现，浏览器直接打开，适合存档和随返修件流转。Pro 版同时导出 </w:t>
+        <w:t xml:space="preserve"> 停止测试（含错误阈值自动停止）、跑满指定轮数时自动把整场测试写成</w:t>
+      </w:r>
+      <w:r>
+        <w:rPr>
+          <w:rFonts w:ascii="Arial" w:eastAsia="微软雅黑"/>
+          <w:b/>
+          <w:bCs/>
+        </w:rPr>
+        <w:t xml:space="preserve">第一个 SFS 卷根（通常 `fs0:`；串口行固定打印 `fs0:`）</w:t>
+      </w:r>
+      <w:r>
+        <w:rPr>
+          <w:rFonts w:ascii="Arial" w:eastAsia="微软雅黑"/>
+        </w:rPr>
+        <w:t xml:space="preserve">下的 </w:t>
+      </w:r>
+      <w:r>
+        <w:rPr>
+          <w:rFonts w:ascii="Arial" w:eastAsia="微软雅黑"/>
+        </w:rPr>
+        <w:t xml:space="preserve">advmemtest_report.html</w:t>
+      </w:r>
+      <w:r>
+        <w:rPr>
+          <w:rFonts w:ascii="Arial" w:eastAsia="微软雅黑"/>
+        </w:rPr>
+        <w:t xml:space="preserve">（退出时仅在本次系列已有错误且尚未写过报告时补写）：汇总统计、错误明细（Pro 含颗粒定位，Free 仅地址）、错误位分布、累计覆盖、DIMM 布局可视化一页呈现，浏览器直接打开，适合存档和随返修件流转。每次写报告还会在同目录写一份机器可读的 </w:t>
+      </w:r>
+      <w:r>
+        <w:rPr>
+          <w:rFonts w:ascii="Arial" w:eastAsia="微软雅黑"/>
+        </w:rPr>
+        <w:t xml:space="preserve">ADVERR.CSV</w:t>
+      </w:r>
+      <w:r>
+        <w:rPr>
+          <w:rFonts w:ascii="Arial" w:eastAsia="微软雅黑"/>
+        </w:rPr>
+        <w:t xml:space="preserve">（逐条错误，最多 64 行；Free 版定位列恒空，Pro 版带颗粒定位、定位无效时该列留空）。Pro 版同时导出 </w:t>
       </w:r>
       <w:r>
         <w:rPr>
@@ -514,7 +580,7 @@
         <w:rPr>
           <w:rFonts w:ascii="Arial" w:eastAsia="微软雅黑"/>
         </w:rPr>
-        <w:t xml:space="preserve">（Linux BadRAM 格式）与 </w:t>
+        <w:t xml:space="preserve">（Linux BadRAM 格式）、</w:t>
       </w:r>
       <w:r>
         <w:rPr>
@@ -526,7 +592,59 @@
         <w:rPr>
           <w:rFonts w:ascii="Arial" w:eastAsia="微软雅黑"/>
         </w:rPr>
-        <w:t xml:space="preserve">（Windows bcdedit 命令）两份坏块清单。</w:t>
+        <w:t xml:space="preserve">（Windows bcdedit 命令）与 </w:t>
+      </w:r>
+      <w:r>
+        <w:rPr>
+          <w:rFonts w:ascii="Arial" w:eastAsia="微软雅黑"/>
+        </w:rPr>
+        <w:t xml:space="preserve">badram_grow.txt</w:t>
+      </w:r>
+      <w:r>
+        <w:rPr>
+          <w:rFonts w:ascii="Arial" w:eastAsia="微软雅黑"/>
+        </w:rPr>
+        <w:t xml:space="preserve">（</w:t>
+      </w:r>
+      <w:r>
+        <w:rPr>
+          <w:rFonts w:ascii="Arial" w:eastAsia="微软雅黑"/>
+          <w:b/>
+          <w:bCs/>
+        </w:rPr>
+        <w:t xml:space="preserve">实验性生长档 A/B 对照</w:t>
+      </w:r>
+      <w:r>
+        <w:rPr>
+          <w:rFonts w:ascii="Arial" w:eastAsia="微软雅黑"/>
+        </w:rPr>
+        <w:t xml:space="preserve">——可能过度覆盖健康页，仅供对照，</w:t>
+      </w:r>
+      <w:r>
+        <w:rPr>
+          <w:rFonts w:ascii="Arial" w:eastAsia="微软雅黑"/>
+          <w:b/>
+          <w:bCs/>
+        </w:rPr>
+        <w:t xml:space="preserve">勿直接用于内核屏蔽</w:t>
+      </w:r>
+      <w:r>
+        <w:rPr>
+          <w:rFonts w:ascii="Arial" w:eastAsia="微软雅黑"/>
+        </w:rPr>
+        <w:t xml:space="preserve">；严格档口径不变、仍是唯一推荐产物）三份坏块清单，报告与串口各给出 A/B 摘要（不自动择优），温度曲线上另按与曲线同轴的真实时间标出错误时刻红点（含起测前/暂停，不是 </w:t>
+      </w:r>
+      <w:r>
+        <w:rPr>
+          <w:rFonts w:ascii="Arial" w:eastAsia="微软雅黑"/>
+        </w:rPr>
+        <w:t xml:space="preserve">TEST_FAIL</w:t>
+      </w:r>
+      <w:r>
+        <w:rPr>
+          <w:rFonts w:ascii="Arial" w:eastAsia="微软雅黑"/>
+        </w:rPr>
+        <w:t xml:space="preserve"> 的已测时刻）。</w:t>
       </w:r>
     </w:p>
     <w:p>
@@ -915,7 +1033,7 @@
                 <w:sz w:val="20"/>
                 <w:szCs w:val="20"/>
               </w:rPr>
-              <w:t xml:space="preserve">31 条用户可见 pattern 按类勾选（Free 用户可见 13 条可勾选 + Pro 域锁标）：地址 / memtest86+ 系 / 行锤 / AMT 系 / 厂商系 / SIMD 宽访存</w:t>
+              <w:t xml:space="preserve">36 条 pattern 按类勾选（Pro 用户可见 34 条；Free 用户可见 14 条可勾选 + Pro 域锁标）：地址 / memtest86+ 系 / 行锤 / Advanced 系 / 厂商系 / SIMD 宽访存 / 总线应力、缓存驻留与 BG 条纹</w:t>
             </w:r>
           </w:p>
         </w:tc>
@@ -1159,7 +1277,47 @@
                 <w:sz w:val="20"/>
                 <w:szCs w:val="20"/>
               </w:rPr>
-              <w:t xml:space="preserve">轮数上限 1–99 或连续运行；Pro 版含"禁用缓存测试模式"</w:t>
+              <w:t xml:space="preserve">轮数上限 1–99 或连续运行；倒计时自动开始测试（Free 默认开、10 秒可调 3–120；Pro 缺省关，可显式开启）；无人值守状态汇报（默认开、1 分钟一行，BMC 存活行）；Pro 版含串口触发起测（</w:t>
+            </w:r>
+            <w:r>
+              <w:rPr>
+                <w:rFonts w:ascii="Arial" w:eastAsia="微软雅黑"/>
+                <w:b w:val="false"/>
+                <w:bCs w:val="false"/>
+                <w:sz w:val="20"/>
+                <w:szCs w:val="20"/>
+              </w:rPr>
+              <w:t xml:space="preserve">serial.start</w:t>
+            </w:r>
+            <w:r>
+              <w:rPr>
+                <w:rFonts w:ascii="Arial" w:eastAsia="微软雅黑"/>
+                <w:b w:val="false"/>
+                <w:bCs w:val="false"/>
+                <w:sz w:val="20"/>
+                <w:szCs w:val="20"/>
+              </w:rPr>
+              <w:t xml:space="preserve">）、完成动作（</w:t>
+            </w:r>
+            <w:r>
+              <w:rPr>
+                <w:rFonts w:ascii="Arial" w:eastAsia="微软雅黑"/>
+                <w:b w:val="false"/>
+                <w:bCs w:val="false"/>
+                <w:sz w:val="20"/>
+                <w:szCs w:val="20"/>
+              </w:rPr>
+              <w:t xml:space="preserve">finish.action</w:t>
+            </w:r>
+            <w:r>
+              <w:rPr>
+                <w:rFonts w:ascii="Arial" w:eastAsia="微软雅黑"/>
+                <w:b w:val="false"/>
+                <w:bCs w:val="false"/>
+                <w:sz w:val="20"/>
+                <w:szCs w:val="20"/>
+              </w:rPr>
+              <w:t xml:space="preserve">）与"禁用缓存测试模式"</w:t>
             </w:r>
           </w:p>
         </w:tc>
@@ -1374,6 +1532,205 @@
                 <w:sz w:val="20"/>
                 <w:szCs w:val="20"/>
               </w:rPr>
+              <w:t xml:space="preserve">多核轮换与工作量诊断（两版都有）</w:t>
+            </w:r>
+          </w:p>
+        </w:tc>
+        <w:tc>
+          <w:tcPr>
+            <w:tcW w:type="dxa" w:w="3120"/>
+            <w:tcBorders>
+              <w:top w:val="single" w:color="999999" w:sz="1"/>
+              <w:left w:val="single" w:color="999999" w:sz="1"/>
+              <w:bottom w:val="single" w:color="999999" w:sz="1"/>
+              <w:right w:val="single" w:color="999999" w:sz="1"/>
+            </w:tcBorders>
+            <w:tcMar>
+              <w:top w:type="dxa" w:w="60"/>
+              <w:left w:type="dxa" w:w="100"/>
+              <w:bottom w:type="dxa" w:w="60"/>
+              <w:right w:type="dxa" w:w="100"/>
+            </w:tcMar>
+          </w:tcPr>
+          <w:p>
+            <w:r>
+              <w:rPr>
+                <w:rFonts w:ascii="Arial" w:eastAsia="微软雅黑"/>
+                <w:b w:val="false"/>
+                <w:bCs w:val="false"/>
+                <w:sz w:val="20"/>
+                <w:szCs w:val="20"/>
+              </w:rPr>
+              <w:t xml:space="preserve">FB-40 提速</w:t>
+            </w:r>
+            <w:r>
+              <w:rPr>
+                <w:rFonts w:ascii="Arial" w:eastAsia="微软雅黑"/>
+                <w:b w:val="false"/>
+                <w:bCs w:val="false"/>
+                <w:sz w:val="20"/>
+                <w:szCs w:val="20"/>
+              </w:rPr>
+              <w:t xml:space="preserve">：</w:t>
+            </w:r>
+            <w:r>
+              <w:rPr>
+                <w:rFonts w:ascii="Arial" w:eastAsia="微软雅黑"/>
+                <w:b w:val="false"/>
+                <w:bCs w:val="false"/>
+                <w:sz w:val="20"/>
+                <w:szCs w:val="20"/>
+              </w:rPr>
+              <w:t xml:space="preserve">PAR_ROTATE</w:t>
+            </w:r>
+            <w:r>
+              <w:rPr>
+                <w:rFonts w:ascii="Arial" w:eastAsia="微软雅黑"/>
+                <w:b w:val="false"/>
+                <w:bCs w:val="false"/>
+                <w:sz w:val="20"/>
+                <w:szCs w:val="20"/>
+              </w:rPr>
+              <w:t xml:space="preserve">（逐核轮换）条目在多线程下</w:t>
+            </w:r>
+            <w:r>
+              <w:rPr>
+                <w:rFonts w:ascii="Arial" w:eastAsia="微软雅黑"/>
+                <w:b w:val="false"/>
+                <w:bCs w:val="false"/>
+                <w:sz w:val="20"/>
+                <w:szCs w:val="20"/>
+              </w:rPr>
+              <w:t xml:space="preserve">缺省只由 1 核跑完整内存</w:t>
+            </w:r>
+            <w:r>
+              <w:rPr>
+                <w:rFonts w:ascii="Arial" w:eastAsia="微软雅黑"/>
+                <w:b w:val="false"/>
+                <w:bCs w:val="false"/>
+                <w:sz w:val="20"/>
+                <w:szCs w:val="20"/>
+              </w:rPr>
+              <w:t xml:space="preserve">（覆盖等价、不做 ×N 重复全量）；CFG </w:t>
+            </w:r>
+            <w:r>
+              <w:rPr>
+                <w:rFonts w:ascii="Arial" w:eastAsia="微软雅黑"/>
+                <w:b w:val="false"/>
+                <w:bCs w:val="false"/>
+                <w:sz w:val="20"/>
+                <w:szCs w:val="20"/>
+              </w:rPr>
+              <w:t xml:space="preserve">par.rotate.cores</w:t>
+            </w:r>
+            <w:r>
+              <w:rPr>
+                <w:rFonts w:ascii="Arial" w:eastAsia="微软雅黑"/>
+                <w:b w:val="false"/>
+                <w:bCs w:val="false"/>
+                <w:sz w:val="20"/>
+                <w:szCs w:val="20"/>
+              </w:rPr>
+              <w:t xml:space="preserve"> 调宽度（缺省 1，2..上限=参与核数，</w:t>
+            </w:r>
+            <w:r>
+              <w:rPr>
+                <w:rFonts w:ascii="Arial" w:eastAsia="微软雅黑"/>
+                <w:b w:val="false"/>
+                <w:bCs w:val="false"/>
+                <w:sz w:val="20"/>
+                <w:szCs w:val="20"/>
+              </w:rPr>
+              <w:t xml:space="preserve">0</w:t>
+            </w:r>
+            <w:r>
+              <w:rPr>
+                <w:rFonts w:ascii="Arial" w:eastAsia="微软雅黑"/>
+                <w:b w:val="false"/>
+                <w:bCs w:val="false"/>
+                <w:sz w:val="20"/>
+                <w:szCs w:val="20"/>
+              </w:rPr>
+              <w:t xml:space="preserve"> = 旧版全核各自全量、最慢）。多核起测且选中这类条目时串口打一行 </w:t>
+            </w:r>
+            <w:r>
+              <w:rPr>
+                <w:rFonts w:ascii="Arial" w:eastAsia="微软雅黑"/>
+                <w:b w:val="false"/>
+                <w:bCs w:val="false"/>
+                <w:sz w:val="20"/>
+                <w:szCs w:val="20"/>
+              </w:rPr>
+              <w:t xml:space="preserve">perf: N cores x M full-memory pattern(s) (PAR_ROTATE); rotate on K core(s); …</w:t>
+            </w:r>
+            <w:r>
+              <w:rPr>
+                <w:rFonts w:ascii="Arial" w:eastAsia="微软雅黑"/>
+                <w:b w:val="false"/>
+                <w:bCs w:val="false"/>
+                <w:sz w:val="20"/>
+                <w:szCs w:val="20"/>
+              </w:rPr>
+              <w:t xml:space="preserve">（K = 实际参与轮换核数）。只诊断，不改判定/资格/进度；单核（含拉起失败/降级）不打</w:t>
+            </w:r>
+          </w:p>
+        </w:tc>
+        <w:tc>
+          <w:tcPr>
+            <w:tcW w:type="dxa" w:w="3120"/>
+            <w:tcBorders>
+              <w:top w:val="single" w:color="999999" w:sz="1"/>
+              <w:left w:val="single" w:color="999999" w:sz="1"/>
+              <w:bottom w:val="single" w:color="999999" w:sz="1"/>
+              <w:right w:val="single" w:color="999999" w:sz="1"/>
+            </w:tcBorders>
+            <w:tcMar>
+              <w:top w:type="dxa" w:w="60"/>
+              <w:left w:type="dxa" w:w="100"/>
+              <w:bottom w:type="dxa" w:w="60"/>
+              <w:right w:type="dxa" w:w="100"/>
+            </w:tcMar>
+          </w:tcPr>
+          <w:p>
+            <w:r>
+              <w:rPr>
+                <w:rFonts w:ascii="Arial" w:eastAsia="微软雅黑"/>
+                <w:b w:val="false"/>
+                <w:bCs w:val="false"/>
+                <w:sz w:val="20"/>
+                <w:szCs w:val="20"/>
+              </w:rPr>
+              <w:t xml:space="preserve">—</w:t>
+            </w:r>
+          </w:p>
+        </w:tc>
+      </w:tr>
+      <w:tr>
+        <w:tc>
+          <w:tcPr>
+            <w:tcW w:type="dxa" w:w="3120"/>
+            <w:tcBorders>
+              <w:top w:val="single" w:color="999999" w:sz="1"/>
+              <w:left w:val="single" w:color="999999" w:sz="1"/>
+              <w:bottom w:val="single" w:color="999999" w:sz="1"/>
+              <w:right w:val="single" w:color="999999" w:sz="1"/>
+            </w:tcBorders>
+            <w:tcMar>
+              <w:top w:type="dxa" w:w="60"/>
+              <w:left w:type="dxa" w:w="100"/>
+              <w:bottom w:type="dxa" w:w="60"/>
+              <w:right w:type="dxa" w:w="100"/>
+            </w:tcMar>
+          </w:tcPr>
+          <w:p>
+            <w:r>
+              <w:rPr>
+                <w:rFonts w:ascii="Arial" w:eastAsia="微软雅黑"/>
+                <w:b w:val="false"/>
+                <w:bCs w:val="false"/>
+                <w:sz w:val="20"/>
+                <w:szCs w:val="20"/>
+              </w:rPr>
               <w:t xml:space="preserve">暂停 / 继续</w:t>
             </w:r>
           </w:p>
@@ -1769,7 +2126,27 @@
                 <w:sz w:val="20"/>
                 <w:szCs w:val="20"/>
               </w:rPr>
-              <w:t xml:space="preserve">停止 / 达标 / 退出三触发写盘，错误明细 + DIMM 布局</w:t>
+              <w:t xml:space="preserve">停止 / 达标时写盘（有错误退出时补写），错误明细 + 错误位分布 + 累计覆盖 + DIMM 布局；随报告写 </w:t>
+            </w:r>
+            <w:r>
+              <w:rPr>
+                <w:rFonts w:ascii="Arial" w:eastAsia="微软雅黑"/>
+                <w:b w:val="false"/>
+                <w:bCs w:val="false"/>
+                <w:sz w:val="20"/>
+                <w:szCs w:val="20"/>
+              </w:rPr>
+              <w:t xml:space="preserve">ADVERR.CSV</w:t>
+            </w:r>
+            <w:r>
+              <w:rPr>
+                <w:rFonts w:ascii="Arial" w:eastAsia="微软雅黑"/>
+                <w:b w:val="false"/>
+                <w:bCs w:val="false"/>
+                <w:sz w:val="20"/>
+                <w:szCs w:val="20"/>
+              </w:rPr>
+              <w:t xml:space="preserve">（Pro 版含颗粒定位列，定位无效留空）</w:t>
             </w:r>
           </w:p>
         </w:tc>
@@ -1862,56 +2239,136 @@
                 <w:sz w:val="20"/>
                 <w:szCs w:val="20"/>
               </w:rPr>
-              <w:t xml:space="preserve">介质能不能存设置/报告</w:t>
-            </w:r>
-          </w:p>
-        </w:tc>
-        <w:tc>
-          <w:tcPr>
-            <w:tcW w:type="dxa" w:w="3120"/>
-            <w:tcBorders>
-              <w:top w:val="single" w:color="999999" w:sz="1"/>
-              <w:left w:val="single" w:color="999999" w:sz="1"/>
-              <w:bottom w:val="single" w:color="999999" w:sz="1"/>
-              <w:right w:val="single" w:color="999999" w:sz="1"/>
-            </w:tcBorders>
-            <w:tcMar>
-              <w:top w:type="dxa" w:w="60"/>
-              <w:left w:type="dxa" w:w="100"/>
-              <w:bottom w:type="dxa" w:w="60"/>
-              <w:right w:type="dxa" w:w="100"/>
-            </w:tcMar>
-          </w:tcPr>
-          <w:p>
-            <w:r>
-              <w:rPr>
-                <w:rFonts w:ascii="Arial" w:eastAsia="微软雅黑"/>
-                <w:b w:val="false"/>
-                <w:bCs w:val="false"/>
-                <w:sz w:val="20"/>
-                <w:szCs w:val="20"/>
-              </w:rPr>
-              <w:t xml:space="preserve">按启动形态而异——</w:t>
-            </w:r>
-            <w:r>
-              <w:rPr>
-                <w:rFonts w:ascii="Arial" w:eastAsia="微软雅黑"/>
-                <w:b w:val="false"/>
-                <w:bCs w:val="false"/>
-                <w:sz w:val="20"/>
-                <w:szCs w:val="20"/>
-              </w:rPr>
-              <w:t xml:space="preserve">要两者都稳</w:t>
-            </w:r>
-            <w:r>
-              <w:rPr>
-                <w:rFonts w:ascii="Arial" w:eastAsia="微软雅黑"/>
-                <w:b w:val="false"/>
-                <w:bCs w:val="false"/>
-                <w:sz w:val="20"/>
-                <w:szCs w:val="20"/>
-              </w:rPr>
-              <w:t xml:space="preserve">请把 efi 拷到可写 FAT32 盘跑（详表见两本详版手册 1.2）</w:t>
+              <w:t xml:space="preserve">ECC 会话判定（两版都有）</w:t>
+            </w:r>
+          </w:p>
+        </w:tc>
+        <w:tc>
+          <w:tcPr>
+            <w:tcW w:type="dxa" w:w="3120"/>
+            <w:tcBorders>
+              <w:top w:val="single" w:color="999999" w:sz="1"/>
+              <w:left w:val="single" w:color="999999" w:sz="1"/>
+              <w:bottom w:val="single" w:color="999999" w:sz="1"/>
+              <w:right w:val="single" w:color="999999" w:sz="1"/>
+            </w:tcBorders>
+            <w:tcMar>
+              <w:top w:type="dxa" w:w="60"/>
+              <w:left w:type="dxa" w:w="100"/>
+              <w:bottom w:type="dxa" w:w="60"/>
+              <w:right w:type="dxa" w:w="100"/>
+            </w:tcMar>
+          </w:tcPr>
+          <w:p>
+            <w:r>
+              <w:rPr>
+                <w:rFonts w:ascii="Arial" w:eastAsia="微软雅黑"/>
+                <w:b w:val="false"/>
+                <w:bCs w:val="false"/>
+                <w:sz w:val="20"/>
+                <w:szCs w:val="20"/>
+              </w:rPr>
+              <w:t xml:space="preserve">起测取 MCA bank 基线、停止做逐 bank 差分：新增 UE 或新增 CE 达阈值即判 ECC FAIL 并进 </w:t>
+            </w:r>
+            <w:r>
+              <w:rPr>
+                <w:rFonts w:ascii="Arial" w:eastAsia="微软雅黑"/>
+                <w:b w:val="false"/>
+                <w:bCs w:val="false"/>
+                <w:sz w:val="20"/>
+                <w:szCs w:val="20"/>
+              </w:rPr>
+              <w:t xml:space="preserve">RESULT</w:t>
+            </w:r>
+            <w:r>
+              <w:rPr>
+                <w:rFonts w:ascii="Arial" w:eastAsia="微软雅黑"/>
+                <w:b w:val="false"/>
+                <w:bCs w:val="false"/>
+                <w:sz w:val="20"/>
+                <w:szCs w:val="20"/>
+              </w:rPr>
+              <w:t xml:space="preserve">（</w:t>
+            </w:r>
+            <w:r>
+              <w:rPr>
+                <w:rFonts w:ascii="Arial" w:eastAsia="微软雅黑"/>
+                <w:b w:val="false"/>
+                <w:bCs w:val="false"/>
+                <w:sz w:val="20"/>
+                <w:szCs w:val="20"/>
+              </w:rPr>
+              <w:t xml:space="preserve">errors=0</w:t>
+            </w:r>
+            <w:r>
+              <w:rPr>
+                <w:rFonts w:ascii="Arial" w:eastAsia="微软雅黑"/>
+                <w:b w:val="false"/>
+                <w:bCs w:val="false"/>
+                <w:sz w:val="20"/>
+                <w:szCs w:val="20"/>
+              </w:rPr>
+              <w:t xml:space="preserve"> 也可 FAIL）；</w:t>
+            </w:r>
+            <w:r>
+              <w:rPr>
+                <w:rFonts w:ascii="Arial" w:eastAsia="微软雅黑"/>
+                <w:b w:val="false"/>
+                <w:bCs w:val="false"/>
+                <w:sz w:val="20"/>
+                <w:szCs w:val="20"/>
+              </w:rPr>
+              <w:t xml:space="preserve">ecc.ue.fail</w:t>
+            </w:r>
+            <w:r>
+              <w:rPr>
+                <w:rFonts w:ascii="Arial" w:eastAsia="微软雅黑"/>
+                <w:b w:val="false"/>
+                <w:bCs w:val="false"/>
+                <w:sz w:val="20"/>
+                <w:szCs w:val="20"/>
+              </w:rPr>
+              <w:t xml:space="preserve"> / </w:t>
+            </w:r>
+            <w:r>
+              <w:rPr>
+                <w:rFonts w:ascii="Arial" w:eastAsia="微软雅黑"/>
+                <w:b w:val="false"/>
+                <w:bCs w:val="false"/>
+                <w:sz w:val="20"/>
+                <w:szCs w:val="20"/>
+              </w:rPr>
+              <w:t xml:space="preserve">ecc.ce.threshold</w:t>
+            </w:r>
+            <w:r>
+              <w:rPr>
+                <w:rFonts w:ascii="Arial" w:eastAsia="微软雅黑"/>
+                <w:b w:val="false"/>
+                <w:bCs w:val="false"/>
+                <w:sz w:val="20"/>
+                <w:szCs w:val="20"/>
+              </w:rPr>
+              <w:t xml:space="preserve"> </w:t>
+            </w:r>
+            <w:r>
+              <w:rPr>
+                <w:rFonts w:ascii="Arial" w:eastAsia="微软雅黑"/>
+                <w:b w:val="false"/>
+                <w:bCs w:val="false"/>
+                <w:sz w:val="20"/>
+                <w:szCs w:val="20"/>
+              </w:rPr>
+              <w:t xml:space="preserve">两键均 Pro 专属</w:t>
+            </w:r>
+            <w:r>
+              <w:rPr>
+                <w:rFonts w:ascii="Arial" w:eastAsia="微软雅黑"/>
+                <w:b w:val="false"/>
+                <w:bCs w:val="false"/>
+                <w:sz w:val="20"/>
+                <w:szCs w:val="20"/>
+              </w:rPr>
+              <w:t xml:space="preserve">（CFG 或 PXE site.cfg），Free 固定缺省策略；无通路判 UNKNOWN、不拖红；Pro 报告含"会话新增/判定"行，Free 仅串口</w:t>
             </w:r>
           </w:p>
         </w:tc>
@@ -1971,6 +2428,394 @@
                 <w:sz w:val="20"/>
                 <w:szCs w:val="20"/>
               </w:rPr>
+              <w:t xml:space="preserve">ECC 地址/颗粒定位（Pro）</w:t>
+            </w:r>
+          </w:p>
+        </w:tc>
+        <w:tc>
+          <w:tcPr>
+            <w:tcW w:type="dxa" w:w="3120"/>
+            <w:tcBorders>
+              <w:top w:val="single" w:color="999999" w:sz="1"/>
+              <w:left w:val="single" w:color="999999" w:sz="1"/>
+              <w:bottom w:val="single" w:color="999999" w:sz="1"/>
+              <w:right w:val="single" w:color="999999" w:sz="1"/>
+            </w:tcBorders>
+            <w:tcMar>
+              <w:top w:type="dxa" w:w="60"/>
+              <w:left w:type="dxa" w:w="100"/>
+              <w:bottom w:type="dxa" w:w="60"/>
+              <w:right w:type="dxa" w:w="100"/>
+            </w:tcMar>
+          </w:tcPr>
+          <w:p>
+            <w:r>
+              <w:rPr>
+                <w:rFonts w:ascii="Arial" w:eastAsia="微软雅黑"/>
+                <w:b w:val="false"/>
+                <w:bCs w:val="false"/>
+                <w:sz w:val="20"/>
+                <w:szCs w:val="20"/>
+              </w:rPr>
+              <w:t xml:space="preserve">有记录的 MCA bank 在 </w:t>
+            </w:r>
+            <w:r>
+              <w:rPr>
+                <w:rFonts w:ascii="Arial" w:eastAsia="微软雅黑"/>
+                <w:b w:val="false"/>
+                <w:bCs w:val="false"/>
+                <w:sz w:val="20"/>
+                <w:szCs w:val="20"/>
+              </w:rPr>
+              <w:t xml:space="preserve">MCi_STATUS</w:t>
+            </w:r>
+            <w:r>
+              <w:rPr>
+                <w:rFonts w:ascii="Arial" w:eastAsia="微软雅黑"/>
+                <w:b w:val="false"/>
+                <w:bCs w:val="false"/>
+                <w:sz w:val="20"/>
+                <w:szCs w:val="20"/>
+              </w:rPr>
+              <w:t xml:space="preserve"> 的 ADDRV=1 时读 </w:t>
+            </w:r>
+            <w:r>
+              <w:rPr>
+                <w:rFonts w:ascii="Arial" w:eastAsia="微软雅黑"/>
+                <w:b w:val="false"/>
+                <w:bCs w:val="false"/>
+                <w:sz w:val="20"/>
+                <w:szCs w:val="20"/>
+              </w:rPr>
+              <w:t xml:space="preserve">MCi_ADDR</w:t>
+            </w:r>
+            <w:r>
+              <w:rPr>
+                <w:rFonts w:ascii="Arial" w:eastAsia="微软雅黑"/>
+                <w:b w:val="false"/>
+                <w:bCs w:val="false"/>
+                <w:sz w:val="20"/>
+                <w:szCs w:val="20"/>
+              </w:rPr>
+              <w:t xml:space="preserve">；串口逐 bank 打 </w:t>
+            </w:r>
+            <w:r>
+              <w:rPr>
+                <w:rFonts w:ascii="Arial" w:eastAsia="微软雅黑"/>
+                <w:b w:val="false"/>
+                <w:bCs w:val="false"/>
+                <w:sz w:val="20"/>
+                <w:szCs w:val="20"/>
+              </w:rPr>
+              <w:t xml:space="preserve">ECC_LOC:</w:t>
+            </w:r>
+            <w:r>
+              <w:rPr>
+                <w:rFonts w:ascii="Arial" w:eastAsia="微软雅黑"/>
+                <w:b w:val="false"/>
+                <w:bCs w:val="false"/>
+                <w:sz w:val="20"/>
+                <w:szCs w:val="20"/>
+              </w:rPr>
+              <w:t xml:space="preserve"> 定位行（地址 + </w:t>
+            </w:r>
+            <w:r>
+              <w:rPr>
+                <w:rFonts w:ascii="Arial" w:eastAsia="微软雅黑"/>
+                <w:b w:val="false"/>
+                <w:bCs w:val="false"/>
+                <w:sz w:val="20"/>
+                <w:szCs w:val="20"/>
+              </w:rPr>
+              <w:t xml:space="preserve">S/C/D/R/dev</w:t>
+            </w:r>
+            <w:r>
+              <w:rPr>
+                <w:rFonts w:ascii="Arial" w:eastAsia="微软雅黑"/>
+                <w:b w:val="false"/>
+                <w:bCs w:val="false"/>
+                <w:sz w:val="20"/>
+                <w:szCs w:val="20"/>
+              </w:rPr>
+              <w:t xml:space="preserve"> 位置），报告 MCA bank 明细为六列（bank/类型/MCi_STATUS/地址/位置/</w:t>
+            </w:r>
+            <w:r>
+              <w:rPr>
+                <w:rFonts w:ascii="Arial" w:eastAsia="微软雅黑"/>
+                <w:b w:val="false"/>
+                <w:bCs w:val="false"/>
+                <w:sz w:val="20"/>
+                <w:szCs w:val="20"/>
+              </w:rPr>
+              <w:t xml:space="preserve">Misc</w:t>
+            </w:r>
+            <w:r>
+              <w:rPr>
+                <w:rFonts w:ascii="Arial" w:eastAsia="微软雅黑"/>
+                <w:b w:val="false"/>
+                <w:bCs w:val="false"/>
+                <w:sz w:val="20"/>
+                <w:szCs w:val="20"/>
+              </w:rPr>
+              <w:t xml:space="preserve">；Misc 追加在最后，按五列解析的旧脚本仍兼容；</w:t>
+            </w:r>
+            <w:r>
+              <w:rPr>
+                <w:rFonts w:ascii="Arial" w:eastAsia="微软雅黑"/>
+                <w:b w:val="false"/>
+                <w:bCs w:val="false"/>
+                <w:sz w:val="20"/>
+                <w:szCs w:val="20"/>
+              </w:rPr>
+              <w:t xml:space="preserve">misc=0x…</w:t>
+            </w:r>
+            <w:r>
+              <w:rPr>
+                <w:rFonts w:ascii="Arial" w:eastAsia="微软雅黑"/>
+                <w:b w:val="false"/>
+                <w:bCs w:val="false"/>
+                <w:sz w:val="20"/>
+                <w:szCs w:val="20"/>
+              </w:rPr>
+              <w:t xml:space="preserve">/</w:t>
+            </w:r>
+            <w:r>
+              <w:rPr>
+                <w:rFonts w:ascii="Arial" w:eastAsia="微软雅黑"/>
+                <w:b w:val="false"/>
+                <w:bCs w:val="false"/>
+                <w:sz w:val="20"/>
+                <w:szCs w:val="20"/>
+              </w:rPr>
+              <w:t xml:space="preserve">misc=-</w:t>
+            </w:r>
+            <w:r>
+              <w:rPr>
+                <w:rFonts w:ascii="Arial" w:eastAsia="微软雅黑"/>
+                <w:b w:val="false"/>
+                <w:bCs w:val="false"/>
+                <w:sz w:val="20"/>
+                <w:szCs w:val="20"/>
+              </w:rPr>
+              <w:t xml:space="preserve"> 只透传不解码），内存信息页 bank 条目主行尾附 </w:t>
+            </w:r>
+            <w:r>
+              <w:rPr>
+                <w:rFonts w:ascii="Arial" w:eastAsia="微软雅黑"/>
+                <w:b w:val="false"/>
+                <w:bCs w:val="false"/>
+                <w:sz w:val="20"/>
+                <w:szCs w:val="20"/>
+              </w:rPr>
+              <w:t xml:space="preserve"> · R&lt;n&gt;/dev&lt;n&gt;</w:t>
+            </w:r>
+            <w:r>
+              <w:rPr>
+                <w:rFonts w:ascii="Arial" w:eastAsia="微软雅黑"/>
+                <w:b w:val="false"/>
+                <w:bCs w:val="false"/>
+                <w:sz w:val="20"/>
+                <w:szCs w:val="20"/>
+              </w:rPr>
+              <w:t xml:space="preserve">、Misc 另起子行；内置几何近似映射标 </w:t>
+            </w:r>
+            <w:r>
+              <w:rPr>
+                <w:rFonts w:ascii="Arial" w:eastAsia="微软雅黑"/>
+                <w:b w:val="false"/>
+                <w:bCs w:val="false"/>
+                <w:sz w:val="20"/>
+                <w:szCs w:val="20"/>
+              </w:rPr>
+              <w:t xml:space="preserve">(approx)</w:t>
+            </w:r>
+          </w:p>
+        </w:tc>
+        <w:tc>
+          <w:tcPr>
+            <w:tcW w:type="dxa" w:w="3120"/>
+            <w:tcBorders>
+              <w:top w:val="single" w:color="999999" w:sz="1"/>
+              <w:left w:val="single" w:color="999999" w:sz="1"/>
+              <w:bottom w:val="single" w:color="999999" w:sz="1"/>
+              <w:right w:val="single" w:color="999999" w:sz="1"/>
+            </w:tcBorders>
+            <w:tcMar>
+              <w:top w:type="dxa" w:w="60"/>
+              <w:left w:type="dxa" w:w="100"/>
+              <w:bottom w:type="dxa" w:w="60"/>
+              <w:right w:type="dxa" w:w="100"/>
+            </w:tcMar>
+          </w:tcPr>
+          <w:p>
+            <w:r>
+              <w:rPr>
+                <w:rFonts w:ascii="Arial" w:eastAsia="微软雅黑"/>
+                <w:b w:val="false"/>
+                <w:bCs w:val="false"/>
+                <w:sz w:val="20"/>
+                <w:szCs w:val="20"/>
+              </w:rPr>
+              <w:t xml:space="preserve">—</w:t>
+            </w:r>
+          </w:p>
+        </w:tc>
+      </w:tr>
+      <w:tr>
+        <w:tc>
+          <w:tcPr>
+            <w:tcW w:type="dxa" w:w="3120"/>
+            <w:tcBorders>
+              <w:top w:val="single" w:color="999999" w:sz="1"/>
+              <w:left w:val="single" w:color="999999" w:sz="1"/>
+              <w:bottom w:val="single" w:color="999999" w:sz="1"/>
+              <w:right w:val="single" w:color="999999" w:sz="1"/>
+            </w:tcBorders>
+            <w:tcMar>
+              <w:top w:type="dxa" w:w="60"/>
+              <w:left w:type="dxa" w:w="100"/>
+              <w:bottom w:type="dxa" w:w="60"/>
+              <w:right w:type="dxa" w:w="100"/>
+            </w:tcMar>
+          </w:tcPr>
+          <w:p>
+            <w:r>
+              <w:rPr>
+                <w:rFonts w:ascii="Arial" w:eastAsia="微软雅黑"/>
+                <w:b w:val="false"/>
+                <w:bCs w:val="false"/>
+                <w:sz w:val="20"/>
+                <w:szCs w:val="20"/>
+              </w:rPr>
+              <w:t xml:space="preserve">介质能不能存设置/报告</w:t>
+            </w:r>
+          </w:p>
+        </w:tc>
+        <w:tc>
+          <w:tcPr>
+            <w:tcW w:type="dxa" w:w="3120"/>
+            <w:tcBorders>
+              <w:top w:val="single" w:color="999999" w:sz="1"/>
+              <w:left w:val="single" w:color="999999" w:sz="1"/>
+              <w:bottom w:val="single" w:color="999999" w:sz="1"/>
+              <w:right w:val="single" w:color="999999" w:sz="1"/>
+            </w:tcBorders>
+            <w:tcMar>
+              <w:top w:type="dxa" w:w="60"/>
+              <w:left w:type="dxa" w:w="100"/>
+              <w:bottom w:type="dxa" w:w="60"/>
+              <w:right w:type="dxa" w:w="100"/>
+            </w:tcMar>
+          </w:tcPr>
+          <w:p>
+            <w:r>
+              <w:rPr>
+                <w:rFonts w:ascii="Arial" w:eastAsia="微软雅黑"/>
+                <w:b w:val="false"/>
+                <w:bCs w:val="false"/>
+                <w:sz w:val="20"/>
+                <w:szCs w:val="20"/>
+              </w:rPr>
+              <w:t xml:space="preserve">按启动形态而异——</w:t>
+            </w:r>
+            <w:r>
+              <w:rPr>
+                <w:rFonts w:ascii="Arial" w:eastAsia="微软雅黑"/>
+                <w:b w:val="false"/>
+                <w:bCs w:val="false"/>
+                <w:sz w:val="20"/>
+                <w:szCs w:val="20"/>
+              </w:rPr>
+              <w:t xml:space="preserve">本地启动要两者都稳</w:t>
+            </w:r>
+            <w:r>
+              <w:rPr>
+                <w:rFonts w:ascii="Arial" w:eastAsia="微软雅黑"/>
+                <w:b w:val="false"/>
+                <w:bCs w:val="false"/>
+                <w:sz w:val="20"/>
+                <w:szCs w:val="20"/>
+              </w:rPr>
+              <w:t xml:space="preserve">请把 efi 拷到可写 FAT32 盘跑；</w:t>
+            </w:r>
+            <w:r>
+              <w:rPr>
+                <w:rFonts w:ascii="Arial" w:eastAsia="微软雅黑"/>
+                <w:b w:val="false"/>
+                <w:bCs w:val="false"/>
+                <w:sz w:val="20"/>
+                <w:szCs w:val="20"/>
+              </w:rPr>
+              <w:t xml:space="preserve">Pro 版 PXE 直启的设置只能由 `site.cfg` 下发</w:t>
+            </w:r>
+            <w:r>
+              <w:rPr>
+                <w:rFonts w:ascii="Arial" w:eastAsia="微软雅黑"/>
+                <w:b w:val="false"/>
+                <w:bCs w:val="false"/>
+                <w:sz w:val="20"/>
+                <w:szCs w:val="20"/>
+              </w:rPr>
+              <w:t xml:space="preserve">（详表见两本详版手册 1.2）</w:t>
+            </w:r>
+          </w:p>
+        </w:tc>
+        <w:tc>
+          <w:tcPr>
+            <w:tcW w:type="dxa" w:w="3120"/>
+            <w:tcBorders>
+              <w:top w:val="single" w:color="999999" w:sz="1"/>
+              <w:left w:val="single" w:color="999999" w:sz="1"/>
+              <w:bottom w:val="single" w:color="999999" w:sz="1"/>
+              <w:right w:val="single" w:color="999999" w:sz="1"/>
+            </w:tcBorders>
+            <w:tcMar>
+              <w:top w:type="dxa" w:w="60"/>
+              <w:left w:type="dxa" w:w="100"/>
+              <w:bottom w:type="dxa" w:w="60"/>
+              <w:right w:type="dxa" w:w="100"/>
+            </w:tcMar>
+          </w:tcPr>
+          <w:p>
+            <w:r>
+              <w:rPr>
+                <w:rFonts w:ascii="Arial" w:eastAsia="微软雅黑"/>
+                <w:b w:val="false"/>
+                <w:bCs w:val="false"/>
+                <w:sz w:val="20"/>
+                <w:szCs w:val="20"/>
+              </w:rPr>
+              <w:t xml:space="preserve">—</w:t>
+            </w:r>
+          </w:p>
+        </w:tc>
+      </w:tr>
+      <w:tr>
+        <w:tc>
+          <w:tcPr>
+            <w:tcW w:type="dxa" w:w="3120"/>
+            <w:tcBorders>
+              <w:top w:val="single" w:color="999999" w:sz="1"/>
+              <w:left w:val="single" w:color="999999" w:sz="1"/>
+              <w:bottom w:val="single" w:color="999999" w:sz="1"/>
+              <w:right w:val="single" w:color="999999" w:sz="1"/>
+            </w:tcBorders>
+            <w:tcMar>
+              <w:top w:type="dxa" w:w="60"/>
+              <w:left w:type="dxa" w:w="100"/>
+              <w:bottom w:type="dxa" w:w="60"/>
+              <w:right w:type="dxa" w:w="100"/>
+            </w:tcMar>
+          </w:tcPr>
+          <w:p>
+            <w:r>
+              <w:rPr>
+                <w:rFonts w:ascii="Arial" w:eastAsia="微软雅黑"/>
+                <w:b w:val="false"/>
+                <w:bCs w:val="false"/>
+                <w:sz w:val="20"/>
+                <w:szCs w:val="20"/>
+              </w:rPr>
               <w:t xml:space="preserve">内存信息（Pro）</w:t>
             </w:r>
           </w:p>
@@ -2000,7 +2845,27 @@
                 <w:sz w:val="20"/>
                 <w:szCs w:val="20"/>
               </w:rPr>
-              <w:t xml:space="preserve">设置→内存信息…：SPD 深度解析（平台 / 通路 / 数据源 + 槽位档案 + CRC 对账 + 温度明细 + ECC 明细）</w:t>
+              <w:t xml:space="preserve">设置→内存信息…：SPD 深度解析（平台 / 通路 / 数据源 + 槽位档案 + CRC 对账 + </w:t>
+            </w:r>
+            <w:r>
+              <w:rPr>
+                <w:rFonts w:ascii="Arial" w:eastAsia="微软雅黑"/>
+                <w:b w:val="false"/>
+                <w:bCs w:val="false"/>
+                <w:sz w:val="20"/>
+                <w:szCs w:val="20"/>
+              </w:rPr>
+              <w:t xml:space="preserve">内存设置</w:t>
+            </w:r>
+            <w:r>
+              <w:rPr>
+                <w:rFonts w:ascii="Arial" w:eastAsia="微软雅黑"/>
+                <w:b w:val="false"/>
+                <w:bCs w:val="false"/>
+                <w:sz w:val="20"/>
+                <w:szCs w:val="20"/>
+              </w:rPr>
+              <w:t xml:space="preserve"> + 温度明细 + ECC 明细）</w:t>
             </w:r>
           </w:p>
         </w:tc>
@@ -2093,6 +2958,324 @@
                 <w:sz w:val="20"/>
                 <w:szCs w:val="20"/>
               </w:rPr>
+              <w:t xml:space="preserve">内存设置（Pro）</w:t>
+            </w:r>
+          </w:p>
+        </w:tc>
+        <w:tc>
+          <w:tcPr>
+            <w:tcW w:type="dxa" w:w="3120"/>
+            <w:tcBorders>
+              <w:top w:val="single" w:color="999999" w:sz="1"/>
+              <w:left w:val="single" w:color="999999" w:sz="1"/>
+              <w:bottom w:val="single" w:color="999999" w:sz="1"/>
+              <w:right w:val="single" w:color="999999" w:sz="1"/>
+            </w:tcBorders>
+            <w:tcMar>
+              <w:top w:type="dxa" w:w="60"/>
+              <w:left w:type="dxa" w:w="100"/>
+              <w:bottom w:type="dxa" w:w="60"/>
+              <w:right w:type="dxa" w:w="100"/>
+            </w:tcMar>
+          </w:tcPr>
+          <w:p>
+            <w:r>
+              <w:rPr>
+                <w:rFonts w:ascii="Arial" w:eastAsia="微软雅黑"/>
+                <w:b w:val="false"/>
+                <w:bCs w:val="false"/>
+                <w:sz w:val="20"/>
+                <w:szCs w:val="20"/>
+              </w:rPr>
+              <w:t xml:space="preserve">槽详情与报告同源：SMBIOS 实况速度/电压（0=未报，逐字段判零）、SPD 标称时序（仅 CRC 通过槽）、XMP 3.0 profile1（名称/速率/CL；tAA 缺失不猜）、EXPO 仅存在性（不解码）；IMC 实况时序</w:t>
+            </w:r>
+            <w:r>
+              <w:rPr>
+                <w:rFonts w:ascii="Arial" w:eastAsia="微软雅黑"/>
+                <w:b w:val="false"/>
+                <w:bCs w:val="false"/>
+                <w:sz w:val="20"/>
+                <w:szCs w:val="20"/>
+              </w:rPr>
+              <w:t xml:space="preserve">不可用（平台未提供）</w:t>
+            </w:r>
+            <w:r>
+              <w:rPr>
+                <w:rFonts w:ascii="Arial" w:eastAsia="微软雅黑"/>
+                <w:b w:val="false"/>
+                <w:bCs w:val="false"/>
+                <w:sz w:val="20"/>
+                <w:szCs w:val="20"/>
+              </w:rPr>
+              <w:t xml:space="preserve">；无 SPD 缓存时报告整节省略；槽位按序号近似并标注</w:t>
+            </w:r>
+          </w:p>
+        </w:tc>
+        <w:tc>
+          <w:tcPr>
+            <w:tcW w:type="dxa" w:w="3120"/>
+            <w:tcBorders>
+              <w:top w:val="single" w:color="999999" w:sz="1"/>
+              <w:left w:val="single" w:color="999999" w:sz="1"/>
+              <w:bottom w:val="single" w:color="999999" w:sz="1"/>
+              <w:right w:val="single" w:color="999999" w:sz="1"/>
+            </w:tcBorders>
+            <w:tcMar>
+              <w:top w:type="dxa" w:w="60"/>
+              <w:left w:type="dxa" w:w="100"/>
+              <w:bottom w:type="dxa" w:w="60"/>
+              <w:right w:type="dxa" w:w="100"/>
+            </w:tcMar>
+          </w:tcPr>
+          <w:p>
+            <w:r>
+              <w:rPr>
+                <w:rFonts w:ascii="Arial" w:eastAsia="微软雅黑"/>
+                <w:b w:val="false"/>
+                <w:bCs w:val="false"/>
+                <w:sz w:val="20"/>
+                <w:szCs w:val="20"/>
+              </w:rPr>
+              <w:t xml:space="preserve">—</w:t>
+            </w:r>
+          </w:p>
+        </w:tc>
+      </w:tr>
+      <w:tr>
+        <w:tc>
+          <w:tcPr>
+            <w:tcW w:type="dxa" w:w="3120"/>
+            <w:tcBorders>
+              <w:top w:val="single" w:color="999999" w:sz="1"/>
+              <w:left w:val="single" w:color="999999" w:sz="1"/>
+              <w:bottom w:val="single" w:color="999999" w:sz="1"/>
+              <w:right w:val="single" w:color="999999" w:sz="1"/>
+            </w:tcBorders>
+            <w:tcMar>
+              <w:top w:type="dxa" w:w="60"/>
+              <w:left w:type="dxa" w:w="100"/>
+              <w:bottom w:type="dxa" w:w="60"/>
+              <w:right w:type="dxa" w:w="100"/>
+            </w:tcMar>
+          </w:tcPr>
+          <w:p>
+            <w:r>
+              <w:rPr>
+                <w:rFonts w:ascii="Arial" w:eastAsia="微软雅黑"/>
+                <w:b w:val="false"/>
+                <w:bCs w:val="false"/>
+                <w:sz w:val="20"/>
+                <w:szCs w:val="20"/>
+              </w:rPr>
+              <w:t xml:space="preserve">坏块清单 A/B（Pro）</w:t>
+            </w:r>
+          </w:p>
+        </w:tc>
+        <w:tc>
+          <w:tcPr>
+            <w:tcW w:type="dxa" w:w="3120"/>
+            <w:tcBorders>
+              <w:top w:val="single" w:color="999999" w:sz="1"/>
+              <w:left w:val="single" w:color="999999" w:sz="1"/>
+              <w:bottom w:val="single" w:color="999999" w:sz="1"/>
+              <w:right w:val="single" w:color="999999" w:sz="1"/>
+            </w:tcBorders>
+            <w:tcMar>
+              <w:top w:type="dxa" w:w="60"/>
+              <w:left w:type="dxa" w:w="100"/>
+              <w:bottom w:type="dxa" w:w="60"/>
+              <w:right w:type="dxa" w:w="100"/>
+            </w:tcMar>
+          </w:tcPr>
+          <w:p>
+            <w:r>
+              <w:rPr>
+                <w:rFonts w:ascii="Arial" w:eastAsia="微软雅黑"/>
+                <w:b w:val="false"/>
+                <w:bCs w:val="false"/>
+                <w:sz w:val="20"/>
+                <w:szCs w:val="20"/>
+              </w:rPr>
+              <w:t xml:space="preserve">严格档 </w:t>
+            </w:r>
+            <w:r>
+              <w:rPr>
+                <w:rFonts w:ascii="Arial" w:eastAsia="微软雅黑"/>
+                <w:b w:val="false"/>
+                <w:bCs w:val="false"/>
+                <w:sz w:val="20"/>
+                <w:szCs w:val="20"/>
+              </w:rPr>
+              <w:t xml:space="preserve">badram.txt</w:t>
+            </w:r>
+            <w:r>
+              <w:rPr>
+                <w:rFonts w:ascii="Arial" w:eastAsia="微软雅黑"/>
+                <w:b w:val="false"/>
+                <w:bCs w:val="false"/>
+                <w:sz w:val="20"/>
+                <w:szCs w:val="20"/>
+              </w:rPr>
+              <w:t xml:space="preserve"> + Windows BCD </w:t>
+            </w:r>
+            <w:r>
+              <w:rPr>
+                <w:rFonts w:ascii="Arial" w:eastAsia="微软雅黑"/>
+                <w:b w:val="false"/>
+                <w:bCs w:val="false"/>
+                <w:sz w:val="20"/>
+                <w:szCs w:val="20"/>
+              </w:rPr>
+              <w:t xml:space="preserve">badmemorylist.txt</w:t>
+            </w:r>
+            <w:r>
+              <w:rPr>
+                <w:rFonts w:ascii="Arial" w:eastAsia="微软雅黑"/>
+                <w:b w:val="false"/>
+                <w:bCs w:val="false"/>
+                <w:sz w:val="20"/>
+                <w:szCs w:val="20"/>
+              </w:rPr>
+              <w:t xml:space="preserve"> + </w:t>
+            </w:r>
+            <w:r>
+              <w:rPr>
+                <w:rFonts w:ascii="Arial" w:eastAsia="微软雅黑"/>
+                <w:b w:val="false"/>
+                <w:bCs w:val="false"/>
+                <w:sz w:val="20"/>
+                <w:szCs w:val="20"/>
+              </w:rPr>
+              <w:t xml:space="preserve">实验性生长档</w:t>
+            </w:r>
+            <w:r>
+              <w:rPr>
+                <w:rFonts w:ascii="Arial" w:eastAsia="微软雅黑"/>
+                <w:b w:val="false"/>
+                <w:bCs w:val="false"/>
+                <w:sz w:val="20"/>
+                <w:szCs w:val="20"/>
+              </w:rPr>
+              <w:t xml:space="preserve"> </w:t>
+            </w:r>
+            <w:r>
+              <w:rPr>
+                <w:rFonts w:ascii="Arial" w:eastAsia="微软雅黑"/>
+                <w:b w:val="false"/>
+                <w:bCs w:val="false"/>
+                <w:sz w:val="20"/>
+                <w:szCs w:val="20"/>
+              </w:rPr>
+              <w:t xml:space="preserve">badram_grow.txt</w:t>
+            </w:r>
+            <w:r>
+              <w:rPr>
+                <w:rFonts w:ascii="Arial" w:eastAsia="微软雅黑"/>
+                <w:b w:val="false"/>
+                <w:bCs w:val="false"/>
+                <w:sz w:val="20"/>
+                <w:szCs w:val="20"/>
+              </w:rPr>
+              <w:t xml:space="preserve">；生长档可能过度覆盖健康页，</w:t>
+            </w:r>
+            <w:r>
+              <w:rPr>
+                <w:rFonts w:ascii="Arial" w:eastAsia="微软雅黑"/>
+                <w:b w:val="false"/>
+                <w:bCs w:val="false"/>
+                <w:sz w:val="20"/>
+                <w:szCs w:val="20"/>
+              </w:rPr>
+              <w:t xml:space="preserve">仅供 A/B 对照、勿用于内核屏蔽</w:t>
+            </w:r>
+            <w:r>
+              <w:rPr>
+                <w:rFonts w:ascii="Arial" w:eastAsia="微软雅黑"/>
+                <w:b w:val="false"/>
+                <w:bCs w:val="false"/>
+                <w:sz w:val="20"/>
+                <w:szCs w:val="20"/>
+              </w:rPr>
+              <w:t xml:space="preserve">；报告/串口给 A/B 摘要，</w:t>
+            </w:r>
+            <w:r>
+              <w:rPr>
+                <w:rFonts w:ascii="Arial" w:eastAsia="微软雅黑"/>
+                <w:b w:val="false"/>
+                <w:bCs w:val="false"/>
+                <w:sz w:val="20"/>
+                <w:szCs w:val="20"/>
+              </w:rPr>
+              <w:t xml:space="preserve">不自动择优</w:t>
+            </w:r>
+            <w:r>
+              <w:rPr>
+                <w:rFonts w:ascii="Arial" w:eastAsia="微软雅黑"/>
+                <w:b w:val="false"/>
+                <w:bCs w:val="false"/>
+                <w:sz w:val="20"/>
+                <w:szCs w:val="20"/>
+              </w:rPr>
+              <w:t xml:space="preserve">；无错误也写头部</w:t>
+            </w:r>
+          </w:p>
+        </w:tc>
+        <w:tc>
+          <w:tcPr>
+            <w:tcW w:type="dxa" w:w="3120"/>
+            <w:tcBorders>
+              <w:top w:val="single" w:color="999999" w:sz="1"/>
+              <w:left w:val="single" w:color="999999" w:sz="1"/>
+              <w:bottom w:val="single" w:color="999999" w:sz="1"/>
+              <w:right w:val="single" w:color="999999" w:sz="1"/>
+            </w:tcBorders>
+            <w:tcMar>
+              <w:top w:type="dxa" w:w="60"/>
+              <w:left w:type="dxa" w:w="100"/>
+              <w:bottom w:type="dxa" w:w="60"/>
+              <w:right w:type="dxa" w:w="100"/>
+            </w:tcMar>
+          </w:tcPr>
+          <w:p>
+            <w:r>
+              <w:rPr>
+                <w:rFonts w:ascii="Arial" w:eastAsia="微软雅黑"/>
+                <w:b w:val="false"/>
+                <w:bCs w:val="false"/>
+                <w:sz w:val="20"/>
+                <w:szCs w:val="20"/>
+              </w:rPr>
+              <w:t xml:space="preserve">—</w:t>
+            </w:r>
+          </w:p>
+        </w:tc>
+      </w:tr>
+      <w:tr>
+        <w:tc>
+          <w:tcPr>
+            <w:tcW w:type="dxa" w:w="3120"/>
+            <w:tcBorders>
+              <w:top w:val="single" w:color="999999" w:sz="1"/>
+              <w:left w:val="single" w:color="999999" w:sz="1"/>
+              <w:bottom w:val="single" w:color="999999" w:sz="1"/>
+              <w:right w:val="single" w:color="999999" w:sz="1"/>
+            </w:tcBorders>
+            <w:tcMar>
+              <w:top w:type="dxa" w:w="60"/>
+              <w:left w:type="dxa" w:w="100"/>
+              <w:bottom w:type="dxa" w:w="60"/>
+              <w:right w:type="dxa" w:w="100"/>
+            </w:tcMar>
+          </w:tcPr>
+          <w:p>
+            <w:r>
+              <w:rPr>
+                <w:rFonts w:ascii="Arial" w:eastAsia="微软雅黑"/>
+                <w:b w:val="false"/>
+                <w:bCs w:val="false"/>
+                <w:sz w:val="20"/>
+                <w:szCs w:val="20"/>
+              </w:rPr>
               <w:t xml:space="preserve">带宽基准（两版都有）</w:t>
             </w:r>
           </w:p>
@@ -2215,6 +3398,682 @@
                 <w:sz w:val="20"/>
                 <w:szCs w:val="20"/>
               </w:rPr>
+              <w:t xml:space="preserve">缓存开/关 A/B（Pro）</w:t>
+            </w:r>
+          </w:p>
+        </w:tc>
+        <w:tc>
+          <w:tcPr>
+            <w:tcW w:type="dxa" w:w="3120"/>
+            <w:tcBorders>
+              <w:top w:val="single" w:color="999999" w:sz="1"/>
+              <w:left w:val="single" w:color="999999" w:sz="1"/>
+              <w:bottom w:val="single" w:color="999999" w:sz="1"/>
+              <w:right w:val="single" w:color="999999" w:sz="1"/>
+            </w:tcBorders>
+            <w:tcMar>
+              <w:top w:type="dxa" w:w="60"/>
+              <w:left w:type="dxa" w:w="100"/>
+              <w:bottom w:type="dxa" w:w="60"/>
+              <w:right w:type="dxa" w:w="100"/>
+            </w:tcMar>
+          </w:tcPr>
+          <w:p>
+            <w:r>
+              <w:rPr>
+                <w:rFonts w:ascii="Arial" w:eastAsia="微软雅黑"/>
+                <w:b w:val="false"/>
+                <w:bCs w:val="false"/>
+                <w:sz w:val="20"/>
+                <w:szCs w:val="20"/>
+              </w:rPr>
+              <w:t xml:space="preserve">CFG-only </w:t>
+            </w:r>
+            <w:r>
+              <w:rPr>
+                <w:rFonts w:ascii="Arial" w:eastAsia="微软雅黑"/>
+                <w:b w:val="false"/>
+                <w:bCs w:val="false"/>
+                <w:sz w:val="20"/>
+                <w:szCs w:val="20"/>
+              </w:rPr>
+              <w:t xml:space="preserve">cache.ab=1</w:t>
+            </w:r>
+            <w:r>
+              <w:rPr>
+                <w:rFonts w:ascii="Arial" w:eastAsia="微软雅黑"/>
+                <w:b w:val="false"/>
+                <w:bCs w:val="false"/>
+                <w:sz w:val="20"/>
+                <w:szCs w:val="20"/>
+              </w:rPr>
+              <w:t xml:space="preserve">：同一 pattern 集先缓存开跑一轮、再 CR0.CD 缓存关跑一轮，报告按（地址,异或,pattern）差分 </w:t>
+            </w:r>
+            <w:r>
+              <w:rPr>
+                <w:rFonts w:ascii="Arial" w:eastAsia="微软雅黑"/>
+                <w:b w:val="false"/>
+                <w:bCs w:val="false"/>
+                <w:sz w:val="20"/>
+                <w:szCs w:val="20"/>
+              </w:rPr>
+              <w:t xml:space="preserve">only_a</w:t>
+            </w:r>
+            <w:r>
+              <w:rPr>
+                <w:rFonts w:ascii="Arial" w:eastAsia="微软雅黑"/>
+                <w:b w:val="false"/>
+                <w:bCs w:val="false"/>
+                <w:sz w:val="20"/>
+                <w:szCs w:val="20"/>
+              </w:rPr>
+              <w:t xml:space="preserve">/</w:t>
+            </w:r>
+            <w:r>
+              <w:rPr>
+                <w:rFonts w:ascii="Arial" w:eastAsia="微软雅黑"/>
+                <w:b w:val="false"/>
+                <w:bCs w:val="false"/>
+                <w:sz w:val="20"/>
+                <w:szCs w:val="20"/>
+              </w:rPr>
+              <w:t xml:space="preserve">only_b</w:t>
+            </w:r>
+            <w:r>
+              <w:rPr>
+                <w:rFonts w:ascii="Arial" w:eastAsia="微软雅黑"/>
+                <w:b w:val="false"/>
+                <w:bCs w:val="false"/>
+                <w:sz w:val="20"/>
+                <w:szCs w:val="20"/>
+              </w:rPr>
+              <w:t xml:space="preserve">/</w:t>
+            </w:r>
+            <w:r>
+              <w:rPr>
+                <w:rFonts w:ascii="Arial" w:eastAsia="微软雅黑"/>
+                <w:b w:val="false"/>
+                <w:bCs w:val="false"/>
+                <w:sz w:val="20"/>
+                <w:szCs w:val="20"/>
+              </w:rPr>
+              <w:t xml:space="preserve">both</w:t>
+            </w:r>
+            <w:r>
+              <w:rPr>
+                <w:rFonts w:ascii="Arial" w:eastAsia="微软雅黑"/>
+                <w:b w:val="false"/>
+                <w:bCs w:val="false"/>
+                <w:sz w:val="20"/>
+                <w:szCs w:val="20"/>
+              </w:rPr>
+              <w:t xml:space="preserve">；强制两轮、不改 CFG 的 </w:t>
+            </w:r>
+            <w:r>
+              <w:rPr>
+                <w:rFonts w:ascii="Arial" w:eastAsia="微软雅黑"/>
+                <w:b w:val="false"/>
+                <w:bCs w:val="false"/>
+                <w:sz w:val="20"/>
+                <w:szCs w:val="20"/>
+              </w:rPr>
+              <w:t xml:space="preserve">pass.limit</w:t>
+            </w:r>
+            <w:r>
+              <w:rPr>
+                <w:rFonts w:ascii="Arial" w:eastAsia="微软雅黑"/>
+                <w:b w:val="false"/>
+                <w:bCs w:val="false"/>
+                <w:sz w:val="20"/>
+                <w:szCs w:val="20"/>
+              </w:rPr>
+              <w:t xml:space="preserve">；错误快照截断时明确标注"不构成完整对照"；Free 读到该键忽略</w:t>
+            </w:r>
+          </w:p>
+        </w:tc>
+        <w:tc>
+          <w:tcPr>
+            <w:tcW w:type="dxa" w:w="3120"/>
+            <w:tcBorders>
+              <w:top w:val="single" w:color="999999" w:sz="1"/>
+              <w:left w:val="single" w:color="999999" w:sz="1"/>
+              <w:bottom w:val="single" w:color="999999" w:sz="1"/>
+              <w:right w:val="single" w:color="999999" w:sz="1"/>
+            </w:tcBorders>
+            <w:tcMar>
+              <w:top w:type="dxa" w:w="60"/>
+              <w:left w:type="dxa" w:w="100"/>
+              <w:bottom w:type="dxa" w:w="60"/>
+              <w:right w:type="dxa" w:w="100"/>
+            </w:tcMar>
+          </w:tcPr>
+          <w:p>
+            <w:r>
+              <w:rPr>
+                <w:rFonts w:ascii="Arial" w:eastAsia="微软雅黑"/>
+                <w:b w:val="false"/>
+                <w:bCs w:val="false"/>
+                <w:sz w:val="20"/>
+                <w:szCs w:val="20"/>
+              </w:rPr>
+              <w:t xml:space="preserve">—</w:t>
+            </w:r>
+          </w:p>
+        </w:tc>
+      </w:tr>
+      <w:tr>
+        <w:tc>
+          <w:tcPr>
+            <w:tcW w:type="dxa" w:w="3120"/>
+            <w:tcBorders>
+              <w:top w:val="single" w:color="999999" w:sz="1"/>
+              <w:left w:val="single" w:color="999999" w:sz="1"/>
+              <w:bottom w:val="single" w:color="999999" w:sz="1"/>
+              <w:right w:val="single" w:color="999999" w:sz="1"/>
+            </w:tcBorders>
+            <w:tcMar>
+              <w:top w:type="dxa" w:w="60"/>
+              <w:left w:type="dxa" w:w="100"/>
+              <w:bottom w:type="dxa" w:w="60"/>
+              <w:right w:type="dxa" w:w="100"/>
+            </w:tcMar>
+          </w:tcPr>
+          <w:p>
+            <w:r>
+              <w:rPr>
+                <w:rFonts w:ascii="Arial" w:eastAsia="微软雅黑"/>
+                <w:b w:val="false"/>
+                <w:bCs w:val="false"/>
+                <w:sz w:val="20"/>
+                <w:szCs w:val="20"/>
+              </w:rPr>
+              <w:t xml:space="preserve">坏区排除/定点复测（Pro）</w:t>
+            </w:r>
+          </w:p>
+        </w:tc>
+        <w:tc>
+          <w:tcPr>
+            <w:tcW w:type="dxa" w:w="3120"/>
+            <w:tcBorders>
+              <w:top w:val="single" w:color="999999" w:sz="1"/>
+              <w:left w:val="single" w:color="999999" w:sz="1"/>
+              <w:bottom w:val="single" w:color="999999" w:sz="1"/>
+              <w:right w:val="single" w:color="999999" w:sz="1"/>
+            </w:tcBorders>
+            <w:tcMar>
+              <w:top w:type="dxa" w:w="60"/>
+              <w:left w:type="dxa" w:w="100"/>
+              <w:bottom w:type="dxa" w:w="60"/>
+              <w:right w:type="dxa" w:w="100"/>
+            </w:tcMar>
+          </w:tcPr>
+          <w:p>
+            <w:r>
+              <w:rPr>
+                <w:rFonts w:ascii="Arial" w:eastAsia="微软雅黑"/>
+                <w:b w:val="false"/>
+                <w:bCs w:val="false"/>
+                <w:sz w:val="20"/>
+                <w:szCs w:val="20"/>
+              </w:rPr>
+              <w:t xml:space="preserve">启动参数 </w:t>
+            </w:r>
+            <w:r>
+              <w:rPr>
+                <w:rFonts w:ascii="Arial" w:eastAsia="微软雅黑"/>
+                <w:b w:val="false"/>
+                <w:bCs w:val="false"/>
+                <w:sz w:val="20"/>
+                <w:szCs w:val="20"/>
+              </w:rPr>
+              <w:t xml:space="preserve">retest=exclude</w:t>
+            </w:r>
+            <w:r>
+              <w:rPr>
+                <w:rFonts w:ascii="Arial" w:eastAsia="微软雅黑"/>
+                <w:b w:val="false"/>
+                <w:bCs w:val="false"/>
+                <w:sz w:val="20"/>
+                <w:szCs w:val="20"/>
+              </w:rPr>
+              <w:t xml:space="preserve">（跳过 </w:t>
+            </w:r>
+            <w:r>
+              <w:rPr>
+                <w:rFonts w:ascii="Arial" w:eastAsia="微软雅黑"/>
+                <w:b w:val="false"/>
+                <w:bCs w:val="false"/>
+                <w:sz w:val="20"/>
+                <w:szCs w:val="20"/>
+              </w:rPr>
+              <w:t xml:space="preserve">fs0:\badram.txt</w:t>
+            </w:r>
+            <w:r>
+              <w:rPr>
+                <w:rFonts w:ascii="Arial" w:eastAsia="微软雅黑"/>
+                <w:b w:val="false"/>
+                <w:bCs w:val="false"/>
+                <w:sz w:val="20"/>
+                <w:szCs w:val="20"/>
+              </w:rPr>
+              <w:t xml:space="preserve"> 已知坏页）或 </w:t>
+            </w:r>
+            <w:r>
+              <w:rPr>
+                <w:rFonts w:ascii="Arial" w:eastAsia="微软雅黑"/>
+                <w:b w:val="false"/>
+                <w:bCs w:val="false"/>
+                <w:sz w:val="20"/>
+                <w:szCs w:val="20"/>
+              </w:rPr>
+              <w:t xml:space="preserve">retest=focus</w:t>
+            </w:r>
+            <w:r>
+              <w:rPr>
+                <w:rFonts w:ascii="Arial" w:eastAsia="微软雅黑"/>
+                <w:b w:val="false"/>
+                <w:bCs w:val="false"/>
+                <w:sz w:val="20"/>
+                <w:szCs w:val="20"/>
+              </w:rPr>
+              <w:t xml:space="preserve">（只测故障地址 ±N MB 窗口，</w:t>
+            </w:r>
+            <w:r>
+              <w:rPr>
+                <w:rFonts w:ascii="Arial" w:eastAsia="微软雅黑"/>
+                <w:b w:val="false"/>
+                <w:bCs w:val="false"/>
+                <w:sz w:val="20"/>
+                <w:szCs w:val="20"/>
+              </w:rPr>
+              <w:t xml:space="preserve">retest.window.mb</w:t>
+            </w:r>
+            <w:r>
+              <w:rPr>
+                <w:rFonts w:ascii="Arial" w:eastAsia="微软雅黑"/>
+                <w:b w:val="false"/>
+                <w:bCs w:val="false"/>
+                <w:sz w:val="20"/>
+                <w:szCs w:val="20"/>
+              </w:rPr>
+              <w:t xml:space="preserve"> 1–1024、缺省 64）；只改测试视图、不改占用/归还；解析截断/错误/空视图 fail-closed 拒启；报告 </w:t>
+            </w:r>
+            <w:r>
+              <w:rPr>
+                <w:rFonts w:ascii="Arial" w:eastAsia="微软雅黑"/>
+                <w:b w:val="false"/>
+                <w:bCs w:val="false"/>
+                <w:sz w:val="20"/>
+                <w:szCs w:val="20"/>
+              </w:rPr>
+              <w:t xml:space="preserve">复测视图</w:t>
+            </w:r>
+            <w:r>
+              <w:rPr>
+                <w:rFonts w:ascii="Arial" w:eastAsia="微软雅黑"/>
+                <w:b w:val="false"/>
+                <w:bCs w:val="false"/>
+                <w:sz w:val="20"/>
+                <w:szCs w:val="20"/>
+              </w:rPr>
+              <w:t xml:space="preserve"> 节明示结果不代表全内存健康；Free 忽略</w:t>
+            </w:r>
+          </w:p>
+        </w:tc>
+        <w:tc>
+          <w:tcPr>
+            <w:tcW w:type="dxa" w:w="3120"/>
+            <w:tcBorders>
+              <w:top w:val="single" w:color="999999" w:sz="1"/>
+              <w:left w:val="single" w:color="999999" w:sz="1"/>
+              <w:bottom w:val="single" w:color="999999" w:sz="1"/>
+              <w:right w:val="single" w:color="999999" w:sz="1"/>
+            </w:tcBorders>
+            <w:tcMar>
+              <w:top w:type="dxa" w:w="60"/>
+              <w:left w:type="dxa" w:w="100"/>
+              <w:bottom w:type="dxa" w:w="60"/>
+              <w:right w:type="dxa" w:w="100"/>
+            </w:tcMar>
+          </w:tcPr>
+          <w:p>
+            <w:r>
+              <w:rPr>
+                <w:rFonts w:ascii="Arial" w:eastAsia="微软雅黑"/>
+                <w:b w:val="false"/>
+                <w:bCs w:val="false"/>
+                <w:sz w:val="20"/>
+                <w:szCs w:val="20"/>
+              </w:rPr>
+              <w:t xml:space="preserve">—</w:t>
+            </w:r>
+          </w:p>
+        </w:tc>
+      </w:tr>
+      <w:tr>
+        <w:tc>
+          <w:tcPr>
+            <w:tcW w:type="dxa" w:w="3120"/>
+            <w:tcBorders>
+              <w:top w:val="single" w:color="999999" w:sz="1"/>
+              <w:left w:val="single" w:color="999999" w:sz="1"/>
+              <w:bottom w:val="single" w:color="999999" w:sz="1"/>
+              <w:right w:val="single" w:color="999999" w:sz="1"/>
+            </w:tcBorders>
+            <w:tcMar>
+              <w:top w:type="dxa" w:w="60"/>
+              <w:left w:type="dxa" w:w="100"/>
+              <w:bottom w:type="dxa" w:w="60"/>
+              <w:right w:type="dxa" w:w="100"/>
+            </w:tcMar>
+          </w:tcPr>
+          <w:p>
+            <w:r>
+              <w:rPr>
+                <w:rFonts w:ascii="Arial" w:eastAsia="微软雅黑"/>
+                <w:b w:val="false"/>
+                <w:bCs w:val="false"/>
+                <w:sz w:val="20"/>
+                <w:szCs w:val="20"/>
+              </w:rPr>
+              <w:t xml:space="preserve">跨会话趋势（Pro）</w:t>
+            </w:r>
+          </w:p>
+        </w:tc>
+        <w:tc>
+          <w:tcPr>
+            <w:tcW w:type="dxa" w:w="3120"/>
+            <w:tcBorders>
+              <w:top w:val="single" w:color="999999" w:sz="1"/>
+              <w:left w:val="single" w:color="999999" w:sz="1"/>
+              <w:bottom w:val="single" w:color="999999" w:sz="1"/>
+              <w:right w:val="single" w:color="999999" w:sz="1"/>
+            </w:tcBorders>
+            <w:tcMar>
+              <w:top w:type="dxa" w:w="60"/>
+              <w:left w:type="dxa" w:w="100"/>
+              <w:bottom w:type="dxa" w:w="60"/>
+              <w:right w:type="dxa" w:w="100"/>
+            </w:tcMar>
+          </w:tcPr>
+          <w:p>
+            <w:r>
+              <w:rPr>
+                <w:rFonts w:ascii="Arial" w:eastAsia="微软雅黑"/>
+                <w:b w:val="false"/>
+                <w:bCs w:val="false"/>
+                <w:sz w:val="20"/>
+                <w:szCs w:val="20"/>
+              </w:rPr>
+              <w:t xml:space="preserve">每次报告追加 </w:t>
+            </w:r>
+            <w:r>
+              <w:rPr>
+                <w:rFonts w:ascii="Arial" w:eastAsia="微软雅黑"/>
+                <w:b w:val="false"/>
+                <w:bCs w:val="false"/>
+                <w:sz w:val="20"/>
+                <w:szCs w:val="20"/>
+              </w:rPr>
+              <w:t xml:space="preserve">fs0:\advmemtest_sessions.csv</w:t>
+            </w:r>
+            <w:r>
+              <w:rPr>
+                <w:rFonts w:ascii="Arial" w:eastAsia="微软雅黑"/>
+                <w:b w:val="false"/>
+                <w:bCs w:val="false"/>
+                <w:sz w:val="20"/>
+                <w:szCs w:val="20"/>
+              </w:rPr>
+              <w:t xml:space="preserve">（同机最近 200 条）；报告多出“历史趋势”节，列最近 10 次与 </w:t>
+            </w:r>
+            <w:r>
+              <w:rPr>
+                <w:rFonts w:ascii="Arial" w:eastAsia="微软雅黑"/>
+                <w:b w:val="false"/>
+                <w:bCs w:val="false"/>
+                <w:sz w:val="20"/>
+                <w:szCs w:val="20"/>
+              </w:rPr>
+              <w:t xml:space="preserve">Δ错误</w:t>
+            </w:r>
+            <w:r>
+              <w:rPr>
+                <w:rFonts w:ascii="Arial" w:eastAsia="微软雅黑"/>
+                <w:b w:val="false"/>
+                <w:bCs w:val="false"/>
+                <w:sz w:val="20"/>
+                <w:szCs w:val="20"/>
+              </w:rPr>
+              <w:t xml:space="preserve">/</w:t>
+            </w:r>
+            <w:r>
+              <w:rPr>
+                <w:rFonts w:ascii="Arial" w:eastAsia="微软雅黑"/>
+                <w:b w:val="false"/>
+                <w:bCs w:val="false"/>
+                <w:sz w:val="20"/>
+                <w:szCs w:val="20"/>
+              </w:rPr>
+              <w:t xml:space="preserve">ΔTTFF</w:t>
+            </w:r>
+            <w:r>
+              <w:rPr>
+                <w:rFonts w:ascii="Arial" w:eastAsia="微软雅黑"/>
+                <w:b w:val="false"/>
+                <w:bCs w:val="false"/>
+                <w:sz w:val="20"/>
+                <w:szCs w:val="20"/>
+              </w:rPr>
+              <w:t xml:space="preserve">；删除 CSV 即清空；Free 不生成</w:t>
+            </w:r>
+          </w:p>
+        </w:tc>
+        <w:tc>
+          <w:tcPr>
+            <w:tcW w:type="dxa" w:w="3120"/>
+            <w:tcBorders>
+              <w:top w:val="single" w:color="999999" w:sz="1"/>
+              <w:left w:val="single" w:color="999999" w:sz="1"/>
+              <w:bottom w:val="single" w:color="999999" w:sz="1"/>
+              <w:right w:val="single" w:color="999999" w:sz="1"/>
+            </w:tcBorders>
+            <w:tcMar>
+              <w:top w:type="dxa" w:w="60"/>
+              <w:left w:type="dxa" w:w="100"/>
+              <w:bottom w:type="dxa" w:w="60"/>
+              <w:right w:type="dxa" w:w="100"/>
+            </w:tcMar>
+          </w:tcPr>
+          <w:p>
+            <w:r>
+              <w:rPr>
+                <w:rFonts w:ascii="Arial" w:eastAsia="微软雅黑"/>
+                <w:b w:val="false"/>
+                <w:bCs w:val="false"/>
+                <w:sz w:val="20"/>
+                <w:szCs w:val="20"/>
+              </w:rPr>
+              <w:t xml:space="preserve">—</w:t>
+            </w:r>
+          </w:p>
+        </w:tc>
+      </w:tr>
+      <w:tr>
+        <w:tc>
+          <w:tcPr>
+            <w:tcW w:type="dxa" w:w="3120"/>
+            <w:tcBorders>
+              <w:top w:val="single" w:color="999999" w:sz="1"/>
+              <w:left w:val="single" w:color="999999" w:sz="1"/>
+              <w:bottom w:val="single" w:color="999999" w:sz="1"/>
+              <w:right w:val="single" w:color="999999" w:sz="1"/>
+            </w:tcBorders>
+            <w:tcMar>
+              <w:top w:type="dxa" w:w="60"/>
+              <w:left w:type="dxa" w:w="100"/>
+              <w:bottom w:type="dxa" w:w="60"/>
+              <w:right w:type="dxa" w:w="100"/>
+            </w:tcMar>
+          </w:tcPr>
+          <w:p>
+            <w:r>
+              <w:rPr>
+                <w:rFonts w:ascii="Arial" w:eastAsia="微软雅黑"/>
+                <w:b w:val="false"/>
+                <w:bCs w:val="false"/>
+                <w:sz w:val="20"/>
+                <w:szCs w:val="20"/>
+              </w:rPr>
+              <w:t xml:space="preserve">料单核验（Pro）</w:t>
+            </w:r>
+          </w:p>
+        </w:tc>
+        <w:tc>
+          <w:tcPr>
+            <w:tcW w:type="dxa" w:w="3120"/>
+            <w:tcBorders>
+              <w:top w:val="single" w:color="999999" w:sz="1"/>
+              <w:left w:val="single" w:color="999999" w:sz="1"/>
+              <w:bottom w:val="single" w:color="999999" w:sz="1"/>
+              <w:right w:val="single" w:color="999999" w:sz="1"/>
+            </w:tcBorders>
+            <w:tcMar>
+              <w:top w:type="dxa" w:w="60"/>
+              <w:left w:type="dxa" w:w="100"/>
+              <w:bottom w:type="dxa" w:w="60"/>
+              <w:right w:type="dxa" w:w="100"/>
+            </w:tcMar>
+          </w:tcPr>
+          <w:p>
+            <w:r>
+              <w:rPr>
+                <w:rFonts w:ascii="Arial" w:eastAsia="微软雅黑"/>
+                <w:b w:val="false"/>
+                <w:bCs w:val="false"/>
+                <w:sz w:val="20"/>
+                <w:szCs w:val="20"/>
+              </w:rPr>
+              <w:t xml:space="preserve">启动参数 </w:t>
+            </w:r>
+            <w:r>
+              <w:rPr>
+                <w:rFonts w:ascii="Arial" w:eastAsia="微软雅黑"/>
+                <w:b w:val="false"/>
+                <w:bCs w:val="false"/>
+                <w:sz w:val="20"/>
+                <w:szCs w:val="20"/>
+              </w:rPr>
+              <w:t xml:space="preserve">bom=check</w:t>
+            </w:r>
+            <w:r>
+              <w:rPr>
+                <w:rFonts w:ascii="Arial" w:eastAsia="微软雅黑"/>
+                <w:b w:val="false"/>
+                <w:bCs w:val="false"/>
+                <w:sz w:val="20"/>
+                <w:szCs w:val="20"/>
+              </w:rPr>
+              <w:t xml:space="preserve"> + </w:t>
+            </w:r>
+            <w:r>
+              <w:rPr>
+                <w:rFonts w:ascii="Arial" w:eastAsia="微软雅黑"/>
+                <w:b w:val="false"/>
+                <w:bCs w:val="false"/>
+                <w:sz w:val="20"/>
+                <w:szCs w:val="20"/>
+              </w:rPr>
+              <w:t xml:space="preserve">fs0:\expected_bom.csv</w:t>
+            </w:r>
+            <w:r>
+              <w:rPr>
+                <w:rFonts w:ascii="Arial" w:eastAsia="微软雅黑"/>
+                <w:b w:val="false"/>
+                <w:bCs w:val="false"/>
+                <w:sz w:val="20"/>
+                <w:szCs w:val="20"/>
+              </w:rPr>
+              <w:t xml:space="preserve">（无引号五列 CSV：slot,capacity_mb,ranks,vendor,part）；逐槽比对容量/rank/厂商/料号，未报字段算 UNKNOWN；报告“料单核验”节 + 串口 </w:t>
+            </w:r>
+            <w:r>
+              <w:rPr>
+                <w:rFonts w:ascii="Arial" w:eastAsia="微软雅黑"/>
+                <w:b w:val="false"/>
+                <w:bCs w:val="false"/>
+                <w:sz w:val="20"/>
+                <w:szCs w:val="20"/>
+              </w:rPr>
+              <w:t xml:space="preserve">bom:</w:t>
+            </w:r>
+            <w:r>
+              <w:rPr>
+                <w:rFonts w:ascii="Arial" w:eastAsia="微软雅黑"/>
+                <w:b w:val="false"/>
+                <w:bCs w:val="false"/>
+                <w:sz w:val="20"/>
+                <w:szCs w:val="20"/>
+              </w:rPr>
+              <w:t xml:space="preserve"> verdict；缺/坏文件只 WARN 省略；Free 忽略</w:t>
+            </w:r>
+          </w:p>
+        </w:tc>
+        <w:tc>
+          <w:tcPr>
+            <w:tcW w:type="dxa" w:w="3120"/>
+            <w:tcBorders>
+              <w:top w:val="single" w:color="999999" w:sz="1"/>
+              <w:left w:val="single" w:color="999999" w:sz="1"/>
+              <w:bottom w:val="single" w:color="999999" w:sz="1"/>
+              <w:right w:val="single" w:color="999999" w:sz="1"/>
+            </w:tcBorders>
+            <w:tcMar>
+              <w:top w:type="dxa" w:w="60"/>
+              <w:left w:type="dxa" w:w="100"/>
+              <w:bottom w:type="dxa" w:w="60"/>
+              <w:right w:type="dxa" w:w="100"/>
+            </w:tcMar>
+          </w:tcPr>
+          <w:p>
+            <w:r>
+              <w:rPr>
+                <w:rFonts w:ascii="Arial" w:eastAsia="微软雅黑"/>
+                <w:b w:val="false"/>
+                <w:bCs w:val="false"/>
+                <w:sz w:val="20"/>
+                <w:szCs w:val="20"/>
+              </w:rPr>
+              <w:t xml:space="preserve">—</w:t>
+            </w:r>
+          </w:p>
+        </w:tc>
+      </w:tr>
+      <w:tr>
+        <w:tc>
+          <w:tcPr>
+            <w:tcW w:type="dxa" w:w="3120"/>
+            <w:tcBorders>
+              <w:top w:val="single" w:color="999999" w:sz="1"/>
+              <w:left w:val="single" w:color="999999" w:sz="1"/>
+              <w:bottom w:val="single" w:color="999999" w:sz="1"/>
+              <w:right w:val="single" w:color="999999" w:sz="1"/>
+            </w:tcBorders>
+            <w:tcMar>
+              <w:top w:type="dxa" w:w="60"/>
+              <w:left w:type="dxa" w:w="100"/>
+              <w:bottom w:type="dxa" w:w="60"/>
+              <w:right w:type="dxa" w:w="100"/>
+            </w:tcMar>
+          </w:tcPr>
+          <w:p>
+            <w:r>
+              <w:rPr>
+                <w:rFonts w:ascii="Arial" w:eastAsia="微软雅黑"/>
+                <w:b w:val="false"/>
+                <w:bCs w:val="false"/>
+                <w:sz w:val="20"/>
+                <w:szCs w:val="20"/>
+              </w:rPr>
               <w:t xml:space="preserve">注入演示（Pro）</w:t>
             </w:r>
           </w:p>
@@ -2436,6 +4295,22 @@
     </w:tbl>
     <w:p/>
     <w:p>
+      <w:r>
+        <w:rPr>
+          <w:rFonts w:ascii="Arial" w:eastAsia="微软雅黑"/>
+          <w:b/>
+          <w:bCs/>
+        </w:rPr>
+        <w:t xml:space="preserve">免费版的设置菜单同样是六项</w:t>
+      </w:r>
+      <w:r>
+        <w:rPr>
+          <w:rFonts w:ascii="Arial" w:eastAsia="微软雅黑"/>
+        </w:rPr>
+        <w:t xml:space="preserve">：后两项「体验功能…」「内存信息…」为 Pro 锁定导流项——灰显 + 锁标，点击弹 Pro 授权提示；「测试配置」底部还多一行「禁用缓存测试模式（Pro）」锁定说明（无控件）。这三处只是升级入口，免费版镜像不含对应实现代码。</w:t>
+      </w:r>
+    </w:p>
+    <w:p>
       <w:pPr>
         <w:pStyle w:val="Heading2"/>
       </w:pPr>
@@ -2543,7 +4418,7 @@
         <w:rPr>
           <w:rFonts w:ascii="Arial" w:eastAsia="微软雅黑"/>
         </w:rPr>
-        <w:t xml:space="preserve"> 连按两下回车：第一下展开"测试"菜单，第二下选中"开始测试"（鼠标点菜单效果相同）。测试即刻开始，默认集已含全部适用 pattern，多核机器自动全核并行。</w:t>
+        <w:t xml:space="preserve"> 两个 SKU 的缺省行为不同：</w:t>
       </w:r>
       <w:r>
         <w:rPr>
@@ -2551,13 +4426,13 @@
           <w:b/>
           <w:bCs/>
         </w:rPr>
-        <w:t xml:space="preserve">第四步，看进度。</w:t>
-      </w:r>
-      <w:r>
-        <w:rPr>
-          <w:rFonts w:ascii="Arial" w:eastAsia="微软雅黑"/>
-        </w:rPr>
-        <w:t xml:space="preserve"> 关注整轮进度条与"已测"统计卡；DIMM 带上光晕流动的位置，就是当前正在压测的内存区域。</w:t>
+        <w:t xml:space="preserve">Free 版</w:t>
+      </w:r>
+      <w:r>
+        <w:rPr>
+          <w:rFonts w:ascii="Arial" w:eastAsia="微软雅黑"/>
+        </w:rPr>
+        <w:t xml:space="preserve">主界面就绪后</w:t>
       </w:r>
       <w:r>
         <w:rPr>
@@ -2565,6 +4440,108 @@
           <w:b/>
           <w:bCs/>
         </w:rPr>
+        <w:t xml:space="preserve">10 秒无操作即自动开始测试</w:t>
+      </w:r>
+      <w:r>
+        <w:rPr>
+          <w:rFonts w:ascii="Arial" w:eastAsia="微软雅黑"/>
+        </w:rPr>
+        <w:t xml:space="preserve">（状态栏逐秒提示"将在 N 秒后自动开始测试（按任意键取消）"；倒计时期间按任意键或移动鼠标即取消，本会话不再自动起测）；</w:t>
+      </w:r>
+      <w:r>
+        <w:rPr>
+          <w:rFonts w:ascii="Arial" w:eastAsia="微软雅黑"/>
+          <w:b/>
+          <w:bCs/>
+        </w:rPr>
+        <w:t xml:space="preserve">Pro 版缺省不自动起测</w:t>
+      </w:r>
+      <w:r>
+        <w:rPr>
+          <w:rFonts w:ascii="Arial" w:eastAsia="微软雅黑"/>
+        </w:rPr>
+        <w:t xml:space="preserve">，主界面停在空闲态等待手动起测，或等待上位机经串口发启动键（</w:t>
+      </w:r>
+      <w:r>
+        <w:rPr>
+          <w:rFonts w:ascii="Arial" w:eastAsia="微软雅黑"/>
+        </w:rPr>
+        <w:t xml:space="preserve">serial.start=1</w:t>
+      </w:r>
+      <w:r>
+        <w:rPr>
+          <w:rFonts w:ascii="Arial" w:eastAsia="微软雅黑"/>
+        </w:rPr>
+        <w:t xml:space="preserve">，缺省键 </w:t>
+      </w:r>
+      <w:r>
+        <w:rPr>
+          <w:rFonts w:ascii="Arial" w:eastAsia="微软雅黑"/>
+        </w:rPr>
+        <w:t xml:space="preserve">A</w:t>
+      </w:r>
+      <w:r>
+        <w:rPr>
+          <w:rFonts w:ascii="Arial" w:eastAsia="微软雅黑"/>
+        </w:rPr>
+        <w:t xml:space="preserve">，串口会先打提示行，详见专业版手册 6.7；要恢复倒计时请在 CFG 写 </w:t>
+      </w:r>
+      <w:r>
+        <w:rPr>
+          <w:rFonts w:ascii="Arial" w:eastAsia="微软雅黑"/>
+        </w:rPr>
+        <w:t xml:space="preserve">auto.start=1</w:t>
+      </w:r>
+      <w:r>
+        <w:rPr>
+          <w:rFonts w:ascii="Arial" w:eastAsia="微软雅黑"/>
+        </w:rPr>
+        <w:t xml:space="preserve"> 或在设置里勾选）。手动起测 = 展开"测试"菜单选"开始测试"（连按两下回车：第一下展开菜单、第二下选中该项；鼠标点菜单效果相同）；倒计时可在"设置 → 测试配置"里关闭或改时长（3–120 秒）。无论哪种起测方式，默认集都已含全部适用 pattern，多核机器自动进入多核并行模式（切分类 pattern 全核并发；轮换类 pattern 缺省只由 1 核跑完整内存，可用 </w:t>
+      </w:r>
+      <w:r>
+        <w:rPr>
+          <w:rFonts w:ascii="Arial" w:eastAsia="微软雅黑"/>
+        </w:rPr>
+        <w:t xml:space="preserve">par.rotate.cores</w:t>
+      </w:r>
+      <w:r>
+        <w:rPr>
+          <w:rFonts w:ascii="Arial" w:eastAsia="微软雅黑"/>
+        </w:rPr>
+        <w:t xml:space="preserve"> 调宽）；此时串口会多一行 </w:t>
+      </w:r>
+      <w:r>
+        <w:rPr>
+          <w:rFonts w:ascii="Arial" w:eastAsia="微软雅黑"/>
+        </w:rPr>
+        <w:t xml:space="preserve">perf:</w:t>
+      </w:r>
+      <w:r>
+        <w:rPr>
+          <w:rFonts w:ascii="Arial" w:eastAsia="微软雅黑"/>
+        </w:rPr>
+        <w:t xml:space="preserve"> 工作量诊断（含义与收口建议见下方"功能一览"的"多核轮换与工作量诊断"行）。</w:t>
+      </w:r>
+      <w:r>
+        <w:rPr>
+          <w:rFonts w:ascii="Arial" w:eastAsia="微软雅黑"/>
+          <w:b/>
+          <w:bCs/>
+        </w:rPr>
+        <w:t xml:space="preserve">第四步，看进度。</w:t>
+      </w:r>
+      <w:r>
+        <w:rPr>
+          <w:rFonts w:ascii="Arial" w:eastAsia="微软雅黑"/>
+        </w:rPr>
+        <w:t xml:space="preserve"> 关注整轮进度条与"已测"统计卡；DIMM 带上光晕流动的位置，就是当前正在压测的内存区域。</w:t>
+      </w:r>
+      <w:r>
+        <w:rPr>
+          <w:rFonts w:ascii="Arial" w:eastAsia="微软雅黑"/>
+          <w:b/>
+          <w:bCs/>
+        </w:rPr>
         <w:t xml:space="preserve">第五步，暂停、停止与退出。</w:t>
       </w:r>
       <w:r>
@@ -2579,13 +4556,25 @@
         <w:rPr>
           <w:rFonts w:ascii="Arial" w:eastAsia="微软雅黑"/>
         </w:rPr>
-        <w:t xml:space="preserve">报告位置：</w:t>
-      </w:r>
-      <w:r>
-        <w:rPr>
-          <w:rFonts w:ascii="Arial" w:eastAsia="微软雅黑"/>
-        </w:rPr>
-        <w:t xml:space="preserve">fs0:\advmemtest_report.html</w:t>
+        <w:t xml:space="preserve">报告位置：固件枚举到的第一个 SFS 卷根（通常是 </w:t>
+      </w:r>
+      <w:r>
+        <w:rPr>
+          <w:rFonts w:ascii="Arial" w:eastAsia="微软雅黑"/>
+        </w:rPr>
+        <w:t xml:space="preserve">fs0:</w:t>
+      </w:r>
+      <w:r>
+        <w:rPr>
+          <w:rFonts w:ascii="Arial" w:eastAsia="微软雅黑"/>
+        </w:rPr>
+        <w:t xml:space="preserve">）下的 </w:t>
+      </w:r>
+      <w:r>
+        <w:rPr>
+          <w:rFonts w:ascii="Arial" w:eastAsia="微软雅黑"/>
+        </w:rPr>
+        <w:t xml:space="preserve">advmemtest_report.html</w:t>
       </w:r>
       <w:r>
         <w:rPr>
@@ -2615,7 +4604,31 @@
         <w:rPr>
           <w:rFonts w:ascii="Arial" w:eastAsia="微软雅黑"/>
         </w:rPr>
-        <w:t xml:space="preserve">），退出 Shell 后用浏览器打开即可。</w:t>
+        <w:t xml:space="preserve"> / </w:t>
+      </w:r>
+      <w:r>
+        <w:rPr>
+          <w:rFonts w:ascii="Arial" w:eastAsia="微软雅黑"/>
+        </w:rPr>
+        <w:t xml:space="preserve">badram_grow.txt</w:t>
+      </w:r>
+      <w:r>
+        <w:rPr>
+          <w:rFonts w:ascii="Arial" w:eastAsia="微软雅黑"/>
+        </w:rPr>
+        <w:t xml:space="preserve">——最后一份是实验性 A/B 对照，勿直接用于内核屏蔽），同目录另有错误明细 </w:t>
+      </w:r>
+      <w:r>
+        <w:rPr>
+          <w:rFonts w:ascii="Arial" w:eastAsia="微软雅黑"/>
+        </w:rPr>
+        <w:t xml:space="preserve">ADVERR.CSV</w:t>
+      </w:r>
+      <w:r>
+        <w:rPr>
+          <w:rFonts w:ascii="Arial" w:eastAsia="微软雅黑"/>
+        </w:rPr>
+        <w:t xml:space="preserve">；退出 Shell 后用浏览器打开报告即可。</w:t>
       </w:r>
     </w:p>
     <w:p>
@@ -2649,7 +4662,7 @@
         <w:rPr>
           <w:rFonts w:ascii="Arial" w:eastAsia="微软雅黑"/>
         </w:rPr>
-        <w:t xml:space="preserve">：X64 UEFI 固件，通过 BIOS 设置或启动菜单进入 UEFI Shell；鼠标与键盘均可操作；界面全简体中文。</w:t>
+        <w:t xml:space="preserve">：X64 UEFI 固件，通过 BIOS 设置或启动菜单进入 UEFI Shell，或从 PXE 网络启动（专业版）；鼠标与键盘均可操作；界面全简体中文。</w:t>
       </w:r>
     </w:p>
     <w:p>
@@ -2666,27 +4679,73 @@
           <w:b/>
           <w:bCs/>
         </w:rPr>
-        <w:t xml:space="preserve">操作说明</w:t>
-      </w:r>
-      <w:r>
-        <w:rPr>
-          <w:rFonts w:ascii="Arial" w:eastAsia="微软雅黑"/>
-        </w:rPr>
-        <w:t xml:space="preserve">：菜单与对话框以键盘 Tab（焦点循环）/ 上下键 / 回车为主，</w:t>
-      </w:r>
-      <w:r>
-        <w:rPr>
-          <w:rFonts w:ascii="Arial" w:eastAsia="微软雅黑"/>
-          <w:b/>
-          <w:bCs/>
-        </w:rPr>
-        <w:t xml:space="preserve">鼠标滚轮同样可用</w:t>
-      </w:r>
-      <w:r>
-        <w:rPr>
-          <w:rFonts w:ascii="Arial" w:eastAsia="微软雅黑"/>
-        </w:rPr>
-        <w:t xml:space="preserve">——指针悬停在滚动容器（对话框清单、帮助正文等）上滚动滚轮即可，容器内的提示条会给出用法（"鼠标滚屏：滚轮滚动，或按住左键拖动"）；侧边滚动条为显示指示件。退出后程序回到固件引导流程，Shell 提示符应正常返回；若个别平台控制台无响应，断电重启即可。</w:t>
+        <w:t xml:space="preserve">PXE 部署（专业版）</w:t>
+      </w:r>
+      <w:r>
+        <w:rPr>
+          <w:rFonts w:ascii="Arial" w:eastAsia="微软雅黑"/>
+        </w:rPr>
+        <w:t xml:space="preserve">：把 Pro efi 改名为 DHCP 指定的启动文件名（通常 </w:t>
+      </w:r>
+      <w:r>
+        <w:rPr>
+          <w:rFonts w:ascii="Arial" w:eastAsia="微软雅黑"/>
+        </w:rPr>
+        <w:t xml:space="preserve">BOOTX64.EFI</w:t>
+      </w:r>
+      <w:r>
+        <w:rPr>
+          <w:rFonts w:ascii="Arial" w:eastAsia="微软雅黑"/>
+        </w:rPr>
+        <w:t xml:space="preserve">），与站点授权 </w:t>
+      </w:r>
+      <w:r>
+        <w:rPr>
+          <w:rFonts w:ascii="Arial" w:eastAsia="微软雅黑"/>
+        </w:rPr>
+        <w:t xml:space="preserve">site.lic</w:t>
+      </w:r>
+      <w:r>
+        <w:rPr>
+          <w:rFonts w:ascii="Arial" w:eastAsia="微软雅黑"/>
+        </w:rPr>
+        <w:t xml:space="preserve">（可选只读配置 </w:t>
+      </w:r>
+      <w:r>
+        <w:rPr>
+          <w:rFonts w:ascii="Arial" w:eastAsia="微软雅黑"/>
+        </w:rPr>
+        <w:t xml:space="preserve">site.cfg</w:t>
+      </w:r>
+      <w:r>
+        <w:rPr>
+          <w:rFonts w:ascii="Arial" w:eastAsia="微软雅黑"/>
+        </w:rPr>
+        <w:t xml:space="preserve">）一起放进 PXE 服务器的 TFTP 根，客户机从网络启动即可；服务器侧不需要授权服务或 TLS，续期只替换 </w:t>
+      </w:r>
+      <w:r>
+        <w:rPr>
+          <w:rFonts w:ascii="Arial" w:eastAsia="微软雅黑"/>
+        </w:rPr>
+        <w:t xml:space="preserve">site.lic</w:t>
+      </w:r>
+      <w:r>
+        <w:rPr>
+          <w:rFonts w:ascii="Arial" w:eastAsia="微软雅黑"/>
+        </w:rPr>
+        <w:t xml:space="preserve">。免费版可被 PXE 启动，但镜像不含网络取件代码。完整步骤见 </w:t>
+      </w:r>
+      <w:r>
+        <w:rPr>
+          <w:rFonts w:ascii="Arial" w:eastAsia="微软雅黑"/>
+        </w:rPr>
+        <w:t xml:space="preserve">docs/advmemtest-pxe-deployment-guide.md</w:t>
+      </w:r>
+      <w:r>
+        <w:rPr>
+          <w:rFonts w:ascii="Arial" w:eastAsia="微软雅黑"/>
+        </w:rPr>
+        <w:t xml:space="preserve">。</w:t>
       </w:r>
     </w:p>
     <w:p>
@@ -2703,49 +4762,27 @@
           <w:b/>
           <w:bCs/>
         </w:rPr>
-        <w:t xml:space="preserve">发布形式</w:t>
-      </w:r>
-      <w:r>
-        <w:rPr>
-          <w:rFonts w:ascii="Arial" w:eastAsia="微软雅黑"/>
-        </w:rPr>
-        <w:t xml:space="preserve">：</w:t>
-      </w:r>
-      <w:r>
-        <w:rPr>
-          <w:rFonts w:ascii="Arial" w:eastAsia="微软雅黑"/>
-        </w:rPr>
-        <w:t xml:space="preserve">AdvMemTestFree.efi</w:t>
-      </w:r>
-      <w:r>
-        <w:rPr>
-          <w:rFonts w:ascii="Arial" w:eastAsia="微软雅黑"/>
-        </w:rPr>
-        <w:t xml:space="preserve"> / </w:t>
-      </w:r>
-      <w:r>
-        <w:rPr>
-          <w:rFonts w:ascii="Arial" w:eastAsia="微软雅黑"/>
-        </w:rPr>
-        <w:t xml:space="preserve">AdvMemTestPro.efi</w:t>
-      </w:r>
-      <w:r>
-        <w:rPr>
-          <w:rFonts w:ascii="Arial" w:eastAsia="微软雅黑"/>
-        </w:rPr>
-        <w:t xml:space="preserve"> 双产物（单文件无外部依赖，版本 0.1.7）。启动画面固定角落与串口输出 </w:t>
-      </w:r>
-      <w:r>
-        <w:rPr>
-          <w:rFonts w:ascii="Arial" w:eastAsia="微软雅黑"/>
-        </w:rPr>
-        <w:t xml:space="preserve">APP_VERSION=v&lt;版本&gt;.&lt;sku&gt;.&lt;构建号&gt;</w:t>
-      </w:r>
-      <w:r>
-        <w:rPr>
-          <w:rFonts w:ascii="Arial" w:eastAsia="微软雅黑"/>
-        </w:rPr>
-        <w:t xml:space="preserve">（如 v0.1.7.free.562），可与构建记录核对。</w:t>
+        <w:t xml:space="preserve">操作说明</w:t>
+      </w:r>
+      <w:r>
+        <w:rPr>
+          <w:rFonts w:ascii="Arial" w:eastAsia="微软雅黑"/>
+        </w:rPr>
+        <w:t xml:space="preserve">：菜单与对话框以键盘 Tab（焦点循环）/ 上下键 / 回车为主，</w:t>
+      </w:r>
+      <w:r>
+        <w:rPr>
+          <w:rFonts w:ascii="Arial" w:eastAsia="微软雅黑"/>
+          <w:b/>
+          <w:bCs/>
+        </w:rPr>
+        <w:t xml:space="preserve">鼠标滚轮同样可用</w:t>
+      </w:r>
+      <w:r>
+        <w:rPr>
+          <w:rFonts w:ascii="Arial" w:eastAsia="微软雅黑"/>
+        </w:rPr>
+        <w:t xml:space="preserve">——指针悬停在滚动容器（对话框清单、帮助正文等）上滚动滚轮即可，容器内的提示条会给出用法（"鼠标滚屏：滚轮滚动，或按住左键拖动"）；侧边滚动条为显示指示件。退出后程序回到固件引导流程，Shell 提示符应正常返回；若个别平台控制台无响应，断电重启即可。</w:t>
       </w:r>
     </w:p>
     <w:p>
@@ -2762,13 +4799,49 @@
           <w:b/>
           <w:bCs/>
         </w:rPr>
-        <w:t xml:space="preserve">技术特性速览</w:t>
-      </w:r>
-      <w:r>
-        <w:rPr>
-          <w:rFonts w:ascii="Arial" w:eastAsia="微软雅黑"/>
-        </w:rPr>
-        <w:t xml:space="preserve">：33 条真实 pattern（Free 用户可见 13 条；2 条引擎自检参考条不对外展示；增补条默认不勾选；SIMD-256 需固件启用 AVX2，多数固件未开时自动锁定、不影响其它条）；四线程模式（MP Services 真实多核调度，顺序轮巡/轮流两模式 Pro 专属，Free 上限 16 / Pro 上限 512）；SMBIOS 动态 DIMM 可视化带（最大 48 槽）；底部平台信息条（CPU · 主板 · 内存总量 + 起测时刻 / 已测时长）；Pro 版 SPD 深度内存信息页（含温度与 ECC 明细）、厂商门控、颗粒级错误定位、带宽曲线、禁用缓存、坏块清单导出；自我重定位；HTML 报告；分辨率自适应（≥1280×800 自动索取）；设置持久化（ADVMTEST.CFG 与软件同级存放）。</w:t>
+        <w:t xml:space="preserve">发布形式</w:t>
+      </w:r>
+      <w:r>
+        <w:rPr>
+          <w:rFonts w:ascii="Arial" w:eastAsia="微软雅黑"/>
+        </w:rPr>
+        <w:t xml:space="preserve">：</w:t>
+      </w:r>
+      <w:r>
+        <w:rPr>
+          <w:rFonts w:ascii="Arial" w:eastAsia="微软雅黑"/>
+        </w:rPr>
+        <w:t xml:space="preserve">AdvMemTestFree.efi</w:t>
+      </w:r>
+      <w:r>
+        <w:rPr>
+          <w:rFonts w:ascii="Arial" w:eastAsia="微软雅黑"/>
+        </w:rPr>
+        <w:t xml:space="preserve"> / </w:t>
+      </w:r>
+      <w:r>
+        <w:rPr>
+          <w:rFonts w:ascii="Arial" w:eastAsia="微软雅黑"/>
+        </w:rPr>
+        <w:t xml:space="preserve">AdvMemTestPro.efi</w:t>
+      </w:r>
+      <w:r>
+        <w:rPr>
+          <w:rFonts w:ascii="Arial" w:eastAsia="微软雅黑"/>
+        </w:rPr>
+        <w:t xml:space="preserve"> 双产物（单文件无外部依赖，版本 0.1.7）。启动画面固定角落与串口输出 </w:t>
+      </w:r>
+      <w:r>
+        <w:rPr>
+          <w:rFonts w:ascii="Arial" w:eastAsia="微软雅黑"/>
+        </w:rPr>
+        <w:t xml:space="preserve">APP_VERSION=v&lt;版本&gt;.&lt;sku&gt;.&lt;构建号&gt;</w:t>
+      </w:r>
+      <w:r>
+        <w:rPr>
+          <w:rFonts w:ascii="Arial" w:eastAsia="微软雅黑"/>
+        </w:rPr>
+        <w:t xml:space="preserve">（如 v0.1.7.free.562），可与构建记录核对。</w:t>
       </w:r>
     </w:p>
     <w:p>
@@ -2785,25 +4858,49 @@
           <w:b/>
           <w:bCs/>
         </w:rPr>
-        <w:t xml:space="preserve">许可证</w:t>
-      </w:r>
-      <w:r>
-        <w:rPr>
-          <w:rFonts w:ascii="Arial" w:eastAsia="微软雅黑"/>
-        </w:rPr>
-        <w:t xml:space="preserve">：免费版个人用户免费使用；专业版商业用途（营利性部署 / 分发 / 预装）需授权——升级途径：请联系作者（详见专业版技术手册 </w:t>
-      </w:r>
-      <w:r>
-        <w:rPr>
-          <w:rFonts w:ascii="Arial" w:eastAsia="微软雅黑"/>
-        </w:rPr>
-        <w:t xml:space="preserve">docs/manual/user-guide-pro.md</w:t>
-      </w:r>
-      <w:r>
-        <w:rPr>
-          <w:rFonts w:ascii="Arial" w:eastAsia="微软雅黑"/>
-        </w:rPr>
-        <w:t xml:space="preserve"> 第七章）。</w:t>
+        <w:t xml:space="preserve">技术特性速览</w:t>
+      </w:r>
+      <w:r>
+        <w:rPr>
+          <w:rFonts w:ascii="Arial" w:eastAsia="微软雅黑"/>
+        </w:rPr>
+        <w:t xml:space="preserve">：36 条真实 pattern（Free 用户可见 14 条；2 条引擎自检参考条不对外展示；增补条与 Id 33–35 默认不勾选；SIMD-256 需固件启用 AVX2，多数固件未开时自动锁定、不影响其它条）；起测缺省：Free 版 10 秒倒计时自动起测（按任意键/移动鼠标取消，可关闭或调时长）；Pro 版缺省不自动起测，支持串口触发起测（</w:t>
+      </w:r>
+      <w:r>
+        <w:rPr>
+          <w:rFonts w:ascii="Arial" w:eastAsia="微软雅黑"/>
+        </w:rPr>
+        <w:t xml:space="preserve">serial.start</w:t>
+      </w:r>
+      <w:r>
+        <w:rPr>
+          <w:rFonts w:ascii="Arial" w:eastAsia="微软雅黑"/>
+        </w:rPr>
+        <w:t xml:space="preserve">）与完成动作（</w:t>
+      </w:r>
+      <w:r>
+        <w:rPr>
+          <w:rFonts w:ascii="Arial" w:eastAsia="微软雅黑"/>
+        </w:rPr>
+        <w:t xml:space="preserve">finish.action</w:t>
+      </w:r>
+      <w:r>
+        <w:rPr>
+          <w:rFonts w:ascii="Arial" w:eastAsia="微软雅黑"/>
+        </w:rPr>
+        <w:t xml:space="preserve">）；四线程模式（MP Services 真实多核调度，顺序轮巡/轮流两模式 Pro 专属，Free 上限 16 / Pro 上限 512）；SMBIOS 动态 DIMM 可视化带（最大 48 槽）；底部平台信息条（CPU · 主板 · 内存总量 + 起测时刻 / 已测时长）；Pro 版 SPD 深度内存信息页（含内存设置、温度与 ECC 明细；IMC 实况时序不可用）、厂商门控、颗粒级错误定位、带宽曲线、禁用缓存、缓存开/关 A/B 对照（CFG-only）、坏块清单导出（含实验性生长档 A/B 对照，不自动择优）；自我重定位；HTML 报告（错误位分布 / 累计覆盖 + </w:t>
+      </w:r>
+      <w:r>
+        <w:rPr>
+          <w:rFonts w:ascii="Arial" w:eastAsia="微软雅黑"/>
+        </w:rPr>
+        <w:t xml:space="preserve">ADVERR.CSV</w:t>
+      </w:r>
+      <w:r>
+        <w:rPr>
+          <w:rFonts w:ascii="Arial" w:eastAsia="微软雅黑"/>
+        </w:rPr>
+        <w:t xml:space="preserve">）；分辨率自适应（≥1280×800 自动索取）；设置持久化（ADVMTEST.CFG 与软件同级存放）。</w:t>
       </w:r>
     </w:p>
     <w:p>
@@ -2820,13 +4917,48 @@
           <w:b/>
           <w:bCs/>
         </w:rPr>
+        <w:t xml:space="preserve">许可证</w:t>
+      </w:r>
+      <w:r>
+        <w:rPr>
+          <w:rFonts w:ascii="Arial" w:eastAsia="微软雅黑"/>
+        </w:rPr>
+        <w:t xml:space="preserve">：免费版个人用户免费使用；专业版商业用途（营利性部署 / 分发 / 预装）需授权——升级途径：请联系作者（详见专业版技术手册 </w:t>
+      </w:r>
+      <w:r>
+        <w:rPr>
+          <w:rFonts w:ascii="Arial" w:eastAsia="微软雅黑"/>
+        </w:rPr>
+        <w:t xml:space="preserve">docs/manual/user-guide-pro.md</w:t>
+      </w:r>
+      <w:r>
+        <w:rPr>
+          <w:rFonts w:ascii="Arial" w:eastAsia="微软雅黑"/>
+        </w:rPr>
+        <w:t xml:space="preserve"> 第七章）。</w:t>
+      </w:r>
+    </w:p>
+    <w:p>
+      <w:pPr>
+        <w:pStyle w:val="ListParagraph"/>
+        <w:numPr>
+          <w:ilvl w:val="0"/>
+          <w:numId w:val="2"/>
+        </w:numPr>
+      </w:pPr>
+      <w:r>
+        <w:rPr>
+          <w:rFonts w:ascii="Arial" w:eastAsia="微软雅黑"/>
+          <w:b/>
+          <w:bCs/>
+        </w:rPr>
         <w:t xml:space="preserve">颗粒定位精度</w:t>
       </w:r>
       <w:r>
         <w:rPr>
           <w:rFonts w:ascii="Arial" w:eastAsia="微软雅黑"/>
         </w:rPr>
-        <w:t xml:space="preserve">：在真实服务器平台上以固件 MRC 的地址交错映射为准（"近似映射 / 平台映射"两级标注见 </w:t>
+        <w:t xml:space="preserve">：在真实服务器平台上以固件内存控制器的地址交错映射为准（"近似映射 / 平台映射"两级标注见 </w:t>
       </w:r>
       <w:r>
         <w:rPr>

</xml_diff>